<commit_message>
docs(bfs): Cập nhập lại nội dung BFS
</commit_message>
<xml_diff>
--- a/handoff/nam/BFS.docx
+++ b/handoff/nam/BFS.docx
@@ -99,15 +99,28 @@
               <w:left w:w="100" w:type="dxa"/>
               <w:right w:w="100" w:type="dxa"/>
             </w:tcMar>
+            <w:tcMar>
+              <w:top w:w="80" w:type="dxa"/>
+              <w:bottom w:w="80" w:type="dxa"/>
+              <w:left w:w="120" w:type="dxa"/>
+              <w:right w:w="120" w:type="dxa"/>
+            </w:tcMar>
+            <w:vAlign w:val="center"/>
           </w:tcPr>
           <w:p>
+            <w:pPr>
+              <w:spacing w:before="60" w:after="60" w:line="276" w:lineRule="auto"/>
+              <w:jc w:val="left"/>
+            </w:pPr>
             <w:r>
               <w:rPr>
                 <w:rFonts w:ascii="Arial" w:hAnsi="Arial"/>
-                <w:color w:val="323232"/>
+                <w:b/>
+                <w:i w:val="0"/>
+                <w:color w:val="333333"/>
                 <w:sz w:val="18"/>
               </w:rPr>
-              <w:t>File mã nguồn: Src/solvers/member3_bfs.py</w:t>
+              <w:t>File mã nguồn: Src/solvers/member3_bfs.py, Src/core/board.py</w:t>
             </w:r>
           </w:p>
         </w:tc>
@@ -1335,574 +1348,267 @@
         <w:keepNext/>
         <w:spacing w:before="280" w:after="80"/>
       </w:pPr>
+      <w:r/>
       <w:r>
         <w:rPr>
           <w:rFonts w:ascii="Arial" w:hAnsi="Arial"/>
           <w:b/>
+          <w:i w:val="0"/>
           <w:color w:val="102C57"/>
           <w:sz w:val="26"/>
         </w:rPr>
-        <w:t>4. Phân tích: Tính 'Ít hành động nhất' và Phân biệt với 'Cost chung'</w:t>
+        <w:t>4. Phân tích: Tính tối ưu số hành động của thuật toán BFS</w:t>
       </w:r>
     </w:p>
     <w:p>
       <w:pPr>
         <w:keepNext/>
-        <w:spacing w:before="200" w:after="60"/>
+        <w:spacing w:before="160" w:after="60"/>
+        <w:ind w:left="0"/>
       </w:pPr>
+      <w:r/>
       <w:r>
         <w:rPr>
           <w:rFonts w:ascii="Arial" w:hAnsi="Arial"/>
           <w:b/>
+          <w:i w:val="0"/>
           <w:color w:val="1E3C72"/>
           <w:sz w:val="23"/>
         </w:rPr>
-        <w:t>4.1. Vì sao BFS luôn tìm ra lời giải ít hành động nhất (kể cả thao tác SPACE)?</w:t>
+        <w:t>4.1. Cơ chế trọng số đơn vị và tính tối ưu số bước đi</w:t>
+      </w:r>
+    </w:p>
+    <w:p>
+      <w:pPr>
+        <w:spacing w:before="0" w:after="60" w:line="276" w:lineRule="auto"/>
+        <w:ind w:left="0"/>
+      </w:pPr>
+      <w:r/>
+      <w:r>
+        <w:rPr>
+          <w:rFonts w:ascii="Arial" w:hAnsi="Arial"/>
+          <w:b w:val="0"/>
+          <w:i w:val="0"/>
+          <w:color w:val="282828"/>
+          <w:sz w:val="20"/>
+        </w:rPr>
+        <w:t>Trong không gian tìm kiếm của BFS, mỗi hành động hợp lệ chuyển dịch khối từ trạng thái hiện tại s sang trạng thái kế tiếp s' đều được gán trọng số chi phí đơn vị đồng nhất:</w:t>
       </w:r>
     </w:p>
     <w:p>
       <w:pPr>
         <w:spacing w:before="40" w:after="60" w:line="276" w:lineRule="auto"/>
+        <w:ind w:left="360"/>
       </w:pPr>
+      <w:r/>
       <w:r>
         <w:rPr>
           <w:rFonts w:ascii="Arial" w:hAnsi="Arial"/>
-          <w:i w:val="0"/>
+          <w:b/>
+          <w:i/>
+          <w:color w:val="102C57"/>
           <w:sz w:val="20"/>
         </w:rPr>
-        <w:t>Trong không gian trạng thái của Bloxorz, tập hợp các hành động hợp lệ bao gồm:</w:t>
+        <w:t>w(s, a, s') = 1,   ∀ a ∈ A(s)</w:t>
       </w:r>
     </w:p>
     <w:p>
       <w:pPr>
-        <w:spacing w:before="40" w:after="60" w:line="276" w:lineRule="auto"/>
+        <w:spacing w:before="0" w:after="60" w:line="276" w:lineRule="auto"/>
+        <w:ind w:left="0"/>
       </w:pPr>
+      <w:r/>
       <w:r>
         <w:rPr>
           <w:rFonts w:ascii="Arial" w:hAnsi="Arial"/>
-          <w:b/>
+          <w:b w:val="0"/>
+          <w:i w:val="0"/>
+          <w:color w:val="282828"/>
           <w:sz w:val="20"/>
         </w:rPr>
-        <w:t xml:space="preserve">Tập hành động: </w:t>
-      </w:r>
-      <w:r>
-        <w:rPr>
-          <w:rFonts w:ascii="Arial" w:hAnsi="Arial"/>
-          <w:i w:val="0"/>
-          <w:sz w:val="20"/>
-        </w:rPr>
-        <w:t>A = {UP, DOWN, LEFT, RIGHT, SPACE}</w:t>
-      </w:r>
-    </w:p>
-    <w:p>
-      <w:pPr>
-        <w:spacing w:before="40" w:after="60" w:line="276" w:lineRule="auto"/>
-      </w:pPr>
-      <w:r>
-        <w:rPr>
-          <w:rFonts w:ascii="Arial" w:hAnsi="Arial"/>
-          <w:i w:val="0"/>
-          <w:sz w:val="20"/>
-        </w:rPr>
-        <w:t>Mỗi thao tác điều khiển đều được tính là đúng 1 hành động (bước chuyển đơn vị w = 1):</w:t>
-      </w:r>
-    </w:p>
-    <w:p>
-      <w:pPr>
-        <w:spacing w:before="20" w:after="40" w:line="276" w:lineRule="auto"/>
-        <w:ind w:left="360"/>
-      </w:pPr>
-      <w:r>
-        <w:rPr>
-          <w:rFonts w:ascii="Arial" w:hAnsi="Arial"/>
-          <w:b/>
-          <w:sz w:val="20"/>
-        </w:rPr>
-        <w:t xml:space="preserve">• </w:t>
-      </w:r>
-      <w:r>
-        <w:rPr>
-          <w:rFonts w:ascii="Arial" w:hAnsi="Arial"/>
-          <w:sz w:val="20"/>
-        </w:rPr>
-        <w:t>Lăn khối nguyên đi 1 nhịp (ngang hoặc dọc) = 1 hành động.</w:t>
-      </w:r>
-    </w:p>
-    <w:p>
-      <w:pPr>
-        <w:spacing w:before="20" w:after="40" w:line="276" w:lineRule="auto"/>
-        <w:ind w:left="360"/>
-      </w:pPr>
-      <w:r>
-        <w:rPr>
-          <w:rFonts w:ascii="Arial" w:hAnsi="Arial"/>
-          <w:b/>
-          <w:sz w:val="20"/>
-        </w:rPr>
-        <w:t xml:space="preserve">• </w:t>
-      </w:r>
-      <w:r>
-        <w:rPr>
-          <w:rFonts w:ascii="Arial" w:hAnsi="Arial"/>
-          <w:sz w:val="20"/>
-        </w:rPr>
-        <w:t>Di chuyển 1 khối đơn 1×1×1 đi 1 ô khi đang phân tách = 1 hành động.</w:t>
-      </w:r>
-    </w:p>
-    <w:p>
-      <w:pPr>
-        <w:spacing w:before="20" w:after="40" w:line="276" w:lineRule="auto"/>
-        <w:ind w:left="360"/>
-      </w:pPr>
-      <w:r>
-        <w:rPr>
-          <w:rFonts w:ascii="Arial" w:hAnsi="Arial"/>
-          <w:b/>
-          <w:sz w:val="20"/>
-        </w:rPr>
-        <w:t xml:space="preserve">• </w:t>
+        <w:t xml:space="preserve">Do mọi cạnh nối trên cây tìm kiếm có chi phí bằng 1, độ sâu d của một nút trên cây phản ánh chính xác số lượng hành động lăn khối thực tế: </w:t>
       </w:r>
       <w:r>
         <w:rPr>
           <w:rFonts w:ascii="Arial" w:hAnsi="Arial"/>
           <w:b/>
+          <w:i w:val="0"/>
+          <w:color w:val="102C57"/>
           <w:sz w:val="20"/>
         </w:rPr>
-        <w:t xml:space="preserve">Đặc biệt: </w:t>
+        <w:t>depth(s) = solution_length = len(moves)</w:t>
       </w:r>
       <w:r>
         <w:rPr>
           <w:rFonts w:ascii="Arial" w:hAnsi="Arial"/>
+          <w:b w:val="0"/>
+          <w:i w:val="0"/>
+          <w:color w:val="282828"/>
           <w:sz w:val="20"/>
         </w:rPr>
-        <w:t>Bấm phím SPACE để hoán đổi quyền điều khiển giữa Khối 0 và Khối 1 (tọa độ hai khối giữ nguyên) = đúng 1 hành động.</w:t>
+        <w:t>. Thuật toán mở rộng không gian trạng thái theo từng tầng độ sâu đồng mức tăng dần d = 0, 1, 2, ...</w:t>
       </w:r>
     </w:p>
     <w:p>
       <w:pPr>
-        <w:spacing w:before="40" w:after="60" w:line="276" w:lineRule="auto"/>
+        <w:spacing w:before="0" w:after="60" w:line="276" w:lineRule="auto"/>
+        <w:ind w:left="0"/>
       </w:pPr>
+      <w:r/>
       <w:r>
         <w:rPr>
           <w:rFonts w:ascii="Arial" w:hAnsi="Arial"/>
+          <w:b w:val="0"/>
           <w:i w:val="0"/>
+          <w:color w:val="282828"/>
           <w:sz w:val="20"/>
         </w:rPr>
-        <w:t>Do mọi cạnh nối giữa nút cha và nút con trên cây tìm kiếm đều có trọng số đơn vị w(s, a, s') = 1, chiều sâu d của nút trên cây tìm kiếm chính xác bằng số lượng hành động đã thực hiện. Theo nguyên lý của BFS, cây tìm kiếm được mở rộng đồng mức từ d = 0, 1, 2, ... Trạng thái đích đầu tiên được phát hiện tại độ sâu d_min chắc chắn là trạng thái có tổng số hành động (moves) ít nhất tuyệt đối.</w:t>
+        <w:t>Nhờ cơ chế kiểm tra đích sớm (Early Goal Test), ngay tại thời điểm một trạng thái con s' vừa được sinh ra thỏa mãn điều kiện đích (board.is_goal(nxt)), thuật toán lập tức dừng và tái hiện lộ trình. Do tất cả các trạng thái ở các tầng độ sâu nhỏ hơn (d &lt; d_min) đều đã được duyệt qua và không có trạng thái nào thỏa điều kiện đích, trạng thái đích được phát hiện đầu tiên chắc chắn có độ sâu nhỏ nhất (d_min). Do đó, BFS đảm bảo tính tối ưu tuyệt đối về số hành động lăn khối.</w:t>
+      </w:r>
+    </w:p>
+    <w:p>
+      <w:pPr>
+        <w:spacing w:before="160" w:after="60" w:line="276" w:lineRule="auto"/>
+        <w:ind w:left="0"/>
+      </w:pPr>
+      <w:r/>
+      <w:r>
+        <w:rPr>
+          <w:rFonts w:ascii="Arial" w:hAnsi="Arial"/>
+          <w:b/>
+          <w:i w:val="0"/>
+          <w:color w:val="1E3C72"/>
+          <w:sz w:val="23"/>
+        </w:rPr>
+        <w:t>4.2. Phân định không gian hành động tìm kiếm và thao tác người chơi</w:t>
+      </w:r>
+    </w:p>
+    <w:p>
+      <w:pPr>
+        <w:spacing w:before="0" w:after="60" w:line="276" w:lineRule="auto"/>
+        <w:ind w:left="0"/>
+      </w:pPr>
+      <w:r/>
+      <w:r>
+        <w:rPr>
+          <w:rFonts w:ascii="Arial" w:hAnsi="Arial"/>
+          <w:b w:val="0"/>
+          <w:i w:val="0"/>
+          <w:color w:val="282828"/>
+          <w:sz w:val="20"/>
+        </w:rPr>
+        <w:t>Hệ thống giải đố phân định rạch ròi giữa các hành động trong không gian tìm kiếm của thuật toán và các thao tác giao diện người dùng:</w:t>
+      </w:r>
+    </w:p>
+    <w:p>
+      <w:pPr>
+        <w:spacing w:before="0" w:after="40" w:line="276" w:lineRule="auto"/>
+        <w:ind w:left="280"/>
+      </w:pPr>
+      <w:r/>
+      <w:r>
+        <w:rPr>
+          <w:rFonts w:ascii="Arial" w:hAnsi="Arial"/>
+          <w:b/>
+          <w:i w:val="0"/>
+          <w:color w:val="102C57"/>
+          <w:sz w:val="20"/>
+        </w:rPr>
+        <w:t xml:space="preserve">• Khi chưa phân tách: </w:t>
+      </w:r>
+      <w:r>
+        <w:rPr>
+          <w:rFonts w:ascii="Arial" w:hAnsi="Arial"/>
+          <w:b w:val="0"/>
+          <w:i w:val="0"/>
+          <w:color w:val="282828"/>
+          <w:sz w:val="20"/>
+        </w:rPr>
+        <w:t>Tập hành động tìm kiếm gồm 4 hướng lăn cơ bản: A_normal = {UP, LEFT, RIGHT, DOWN}.</w:t>
       </w:r>
     </w:p>
     <w:p>
       <w:pPr>
         <w:keepNext/>
-        <w:spacing w:before="200" w:after="60"/>
+        <w:spacing w:before="0" w:after="40"/>
+        <w:ind w:left="280"/>
       </w:pPr>
+      <w:r/>
       <w:r>
         <w:rPr>
           <w:rFonts w:ascii="Arial" w:hAnsi="Arial"/>
           <w:b/>
-          <w:color w:val="1E3C72"/>
-          <w:sz w:val="23"/>
+          <w:i w:val="0"/>
+          <w:color w:val="102C57"/>
+          <w:sz w:val="20"/>
         </w:rPr>
-        <w:t>4.2. Phân biệt giữa 'Tối ưu số hành động (BFS)' và 'Tối ưu theo Cost chung (UCS / A*)'</w:t>
+        <w:t xml:space="preserve">• Khi ở trạng thái phân tách (SPLIT): </w:t>
+      </w:r>
+      <w:r>
+        <w:rPr>
+          <w:rFonts w:ascii="Arial" w:hAnsi="Arial"/>
+          <w:b w:val="0"/>
+          <w:i w:val="0"/>
+          <w:color w:val="282828"/>
+          <w:sz w:val="20"/>
+        </w:rPr>
+        <w:t>Không gian hành động mở rộng lên 8 thao tác: A_split = A_normal ∪ {SUP, SLEFT, SRIGHT, SDOWN}. Trong đó, 4 hành động thường tác động lên khối active_cube đang chọn, và 4 hành động có tiền tố 'S' biểu diễn việc chuyển quyền điều khiển sang khối còn lại và thực hiện lăn ngay lập tức trong cùng một bước tìm kiếm.</w:t>
       </w:r>
     </w:p>
     <w:p>
       <w:pPr>
-        <w:spacing w:before="40" w:after="60" w:line="276" w:lineRule="auto"/>
+        <w:spacing w:before="0" w:after="40" w:line="276" w:lineRule="auto"/>
+        <w:ind w:left="280"/>
       </w:pPr>
+      <w:r/>
       <w:r>
         <w:rPr>
           <w:rFonts w:ascii="Arial" w:hAnsi="Arial"/>
+          <w:b/>
           <w:i w:val="0"/>
+          <w:color w:val="102C57"/>
           <w:sz w:val="20"/>
         </w:rPr>
-        <w:t>Trong bài toán chuẩn, chi phí chung của bài toán (áp dụng cho UCS và A* định nghĩa trong solvers/costs.py) được tính theo mô hình chi phí an toàn địa hình:</w:t>
+        <w:t xml:space="preserve">• Thao tác phím SPACE: </w:t>
+      </w:r>
+      <w:r>
+        <w:rPr>
+          <w:rFonts w:ascii="Arial" w:hAnsi="Arial"/>
+          <w:b w:val="0"/>
+          <w:i w:val="0"/>
+          <w:color w:val="282828"/>
+          <w:sz w:val="20"/>
+        </w:rPr>
+        <w:t>Thao tác này chỉ áp dụng trong chế độ người chơi điều khiển thủ công (Manual Gameplay) để chuyển đổi giữa hai khối. Trong không gian tìm kiếm của thuật toán AI, thao tác SPACE hoàn toàn miễn phí và không sinh ra cạnh tìm kiếm riêng lẻ trên đồ thị, giúp loại trừ triệt để nguy cơ lặp trạng thái vô nghĩa và giảm thiểu hệ số phân nhánh.</w:t>
       </w:r>
     </w:p>
     <w:p>
       <w:pPr>
-        <w:spacing w:before="40" w:after="60" w:line="276" w:lineRule="auto"/>
+        <w:spacing w:before="0" w:after="40" w:line="276" w:lineRule="auto"/>
+        <w:ind w:left="280"/>
       </w:pPr>
+      <w:r/>
       <w:r>
         <w:rPr>
           <w:rFonts w:ascii="Arial" w:hAnsi="Arial"/>
           <w:b/>
+          <w:i w:val="0"/>
+          <w:color w:val="102C57"/>
           <w:sz w:val="20"/>
         </w:rPr>
-        <w:t xml:space="preserve">Hàm chi phí an toàn: </w:t>
+        <w:t xml:space="preserve">• Quy chuẩn đo lường: </w:t>
       </w:r>
       <w:r>
         <w:rPr>
           <w:rFonts w:ascii="Arial" w:hAnsi="Arial"/>
+          <w:b w:val="0"/>
           <w:i w:val="0"/>
+          <w:color w:val="282828"/>
           <w:sz w:val="20"/>
         </w:rPr>
-        <w:t>c(s, a, s') = 1.0 + 0.5 * sum(grid[r][c] == FRAGILE for r, c in cells(s'))</w:t>
+        <w:t>Mỗi phần tử trong danh sách moves của lời giải đều tương ứng với đúng một bước lăn khối cơ học thực sự, bảo đảm độ dài lời giải (solution_length = len(moves)) phản ánh chính xác hiệu quả giải đố cơ học.</w:t>
       </w:r>
     </w:p>
-    <w:p>
-      <w:pPr>
-        <w:spacing w:before="40" w:after="60" w:line="276" w:lineRule="auto"/>
-      </w:pPr>
-      <w:r>
-        <w:rPr>
-          <w:rFonts w:ascii="Arial" w:hAnsi="Arial"/>
-          <w:i w:val="0"/>
-          <w:sz w:val="20"/>
-        </w:rPr>
-        <w:t>Sự khác biệt bản chất giữa hai bài toán tối ưu được phân định rõ ràng như sau:</w:t>
-      </w:r>
-    </w:p>
-    <w:p>
-      <w:pPr>
-        <w:spacing w:before="20" w:after="40" w:line="276" w:lineRule="auto"/>
-        <w:ind w:left="360"/>
-      </w:pPr>
-      <w:r>
-        <w:rPr>
-          <w:rFonts w:ascii="Arial" w:hAnsi="Arial"/>
-          <w:b/>
-          <w:sz w:val="20"/>
-        </w:rPr>
-        <w:t xml:space="preserve">• </w:t>
-      </w:r>
-      <w:r>
-        <w:rPr>
-          <w:rFonts w:ascii="Arial" w:hAnsi="Arial"/>
-          <w:b/>
-          <w:sz w:val="20"/>
-        </w:rPr>
-        <w:t xml:space="preserve">1. Mục tiêu của BFS (Tối ưu số hành động): </w:t>
-      </w:r>
-      <w:r>
-        <w:rPr>
-          <w:rFonts w:ascii="Arial" w:hAnsi="Arial"/>
-          <w:sz w:val="20"/>
-        </w:rPr>
-        <w:t>Coi mọi hành động đều có trọng số bình đẳng (c = 1). BFS không quan tâm đến mức độ rủi ro của địa hình. Nếu có một nhánh đi thẳng đè qua hàng gạch cam (dễ vỡ) tốn ít bước hơn, BFS sẽ ưu tiên chọn nhánh này để đạt số bước nhỏ nhất.</w:t>
-      </w:r>
-    </w:p>
-    <w:p>
-      <w:pPr>
-        <w:spacing w:before="20" w:after="40" w:line="276" w:lineRule="auto"/>
-        <w:ind w:left="360"/>
-      </w:pPr>
-      <w:r>
-        <w:rPr>
-          <w:rFonts w:ascii="Arial" w:hAnsi="Arial"/>
-          <w:b/>
-          <w:sz w:val="20"/>
-        </w:rPr>
-        <w:t xml:space="preserve">• </w:t>
-      </w:r>
-      <w:r>
-        <w:rPr>
-          <w:rFonts w:ascii="Arial" w:hAnsi="Arial"/>
-          <w:b/>
-          <w:sz w:val="20"/>
-        </w:rPr>
-        <w:t xml:space="preserve">2. Mục tiêu của UCS và A* (Tối ưu theo chi phí chung): </w:t>
-      </w:r>
-      <w:r>
-        <w:rPr>
-          <w:rFonts w:ascii="Arial" w:hAnsi="Arial"/>
-          <w:sz w:val="20"/>
-        </w:rPr>
-        <w:t>Tìm đường đi có tổng chi phí tích lũy nhỏ nhất. Do gạch cam bị cộng thêm điểm phạt nguy hiểm (+0.5 mỗi ô), UCS và A* sẵn sàng chủ động chọn đi đường vòng xa hơn (tốn nhiều bước di chuyển hơn) qua các ô sàn vững chắc (tile 1) nhằm triệt tiêu điểm phạt, miễn là tổng chi phí cuối cùng là thấp nhất.</w:t>
-      </w:r>
-    </w:p>
-    <w:p>
-      <w:pPr>
-        <w:spacing w:before="40" w:after="60" w:line="276" w:lineRule="auto"/>
-      </w:pPr>
-      <w:r>
-        <w:rPr>
-          <w:rFonts w:ascii="Arial" w:hAnsi="Arial"/>
-          <w:i/>
-          <w:sz w:val="20"/>
-        </w:rPr>
-        <w:t>Bảng 4.1: Minh chứng thực nghiệm đối sánh BFS vs UCS/A* trên màn Test 2 (Bẫy gạch cam)</w:t>
-      </w:r>
-    </w:p>
-    <w:tbl>
-      <w:tblPr>
-        <w:tblW w:type="auto" w:w="0"/>
-        <w:jc w:val="center"/>
-        <w:tblLook w:firstColumn="1" w:firstRow="1" w:lastColumn="0" w:lastRow="0" w:noHBand="0" w:noVBand="1" w:val="04A0"/>
-      </w:tblPr>
-      <w:tblGrid>
-        <w:gridCol w:w="2340"/>
-        <w:gridCol w:w="2340"/>
-        <w:gridCol w:w="2340"/>
-        <w:gridCol w:w="2340"/>
-      </w:tblGrid>
-      <w:tr>
-        <w:tc>
-          <w:tcPr>
-            <w:tcW w:type="dxa" w:w="2340"/>
-            <w:shd w:fill="1E3C72"/>
-            <w:tcMar>
-              <w:top w:w="80" w:type="dxa"/>
-              <w:bottom w:w="80" w:type="dxa"/>
-              <w:left w:w="100" w:type="dxa"/>
-              <w:right w:w="100" w:type="dxa"/>
-            </w:tcMar>
-          </w:tcPr>
-          <w:p>
-            <w:r>
-              <w:rPr>
-                <w:rFonts w:ascii="Arial" w:hAnsi="Arial"/>
-                <w:b/>
-                <w:color w:val="FFFFFF"/>
-                <w:sz w:val="18"/>
-              </w:rPr>
-              <w:t>Thuật toán</w:t>
-            </w:r>
-          </w:p>
-        </w:tc>
-        <w:tc>
-          <w:tcPr>
-            <w:tcW w:type="dxa" w:w="2340"/>
-            <w:shd w:fill="1E3C72"/>
-            <w:tcMar>
-              <w:top w:w="80" w:type="dxa"/>
-              <w:bottom w:w="80" w:type="dxa"/>
-              <w:left w:w="100" w:type="dxa"/>
-              <w:right w:w="100" w:type="dxa"/>
-            </w:tcMar>
-          </w:tcPr>
-          <w:p>
-            <w:r>
-              <w:rPr>
-                <w:rFonts w:ascii="Arial" w:hAnsi="Arial"/>
-                <w:b/>
-                <w:color w:val="FFFFFF"/>
-                <w:sz w:val="18"/>
-              </w:rPr>
-              <w:t>Chiến lược chọn đường</w:t>
-            </w:r>
-          </w:p>
-        </w:tc>
-        <w:tc>
-          <w:tcPr>
-            <w:tcW w:type="dxa" w:w="2340"/>
-            <w:shd w:fill="1E3C72"/>
-            <w:tcMar>
-              <w:top w:w="80" w:type="dxa"/>
-              <w:bottom w:w="80" w:type="dxa"/>
-              <w:left w:w="100" w:type="dxa"/>
-              <w:right w:w="100" w:type="dxa"/>
-            </w:tcMar>
-          </w:tcPr>
-          <w:p>
-            <w:r>
-              <w:rPr>
-                <w:rFonts w:ascii="Arial" w:hAnsi="Arial"/>
-                <w:b/>
-                <w:color w:val="FFFFFF"/>
-                <w:sz w:val="18"/>
-              </w:rPr>
-              <w:t>Số bước (Moves)</w:t>
-            </w:r>
-          </w:p>
-        </w:tc>
-        <w:tc>
-          <w:tcPr>
-            <w:tcW w:type="dxa" w:w="2340"/>
-            <w:shd w:fill="1E3C72"/>
-            <w:tcMar>
-              <w:top w:w="80" w:type="dxa"/>
-              <w:bottom w:w="80" w:type="dxa"/>
-              <w:left w:w="100" w:type="dxa"/>
-              <w:right w:w="100" w:type="dxa"/>
-            </w:tcMar>
-          </w:tcPr>
-          <w:p>
-            <w:r>
-              <w:rPr>
-                <w:rFonts w:ascii="Arial" w:hAnsi="Arial"/>
-                <w:b/>
-                <w:color w:val="FFFFFF"/>
-                <w:sz w:val="18"/>
-              </w:rPr>
-              <w:t>Tổng chi phí (Total Cost)</w:t>
-            </w:r>
-          </w:p>
-        </w:tc>
-      </w:tr>
-      <w:tr>
-        <w:tc>
-          <w:tcPr>
-            <w:tcW w:type="dxa" w:w="2340"/>
-            <w:shd w:fill="F9FAFB"/>
-            <w:tcMar>
-              <w:top w:w="60" w:type="dxa"/>
-              <w:bottom w:w="60" w:type="dxa"/>
-              <w:left w:w="80" w:type="dxa"/>
-              <w:right w:w="80" w:type="dxa"/>
-            </w:tcMar>
-          </w:tcPr>
-          <w:p>
-            <w:r>
-              <w:rPr>
-                <w:rFonts w:ascii="Arial" w:hAnsi="Arial"/>
-                <w:sz w:val="17"/>
-              </w:rPr>
-              <w:t>BFS (Bùi Phương Nam)</w:t>
-            </w:r>
-          </w:p>
-        </w:tc>
-        <w:tc>
-          <w:tcPr>
-            <w:tcW w:type="dxa" w:w="2340"/>
-            <w:shd w:fill="F9FAFB"/>
-            <w:tcMar>
-              <w:top w:w="60" w:type="dxa"/>
-              <w:bottom w:w="60" w:type="dxa"/>
-              <w:left w:w="80" w:type="dxa"/>
-              <w:right w:w="80" w:type="dxa"/>
-            </w:tcMar>
-          </w:tcPr>
-          <w:p>
-            <w:r>
-              <w:rPr>
-                <w:rFonts w:ascii="Arial" w:hAnsi="Arial"/>
-                <w:sz w:val="17"/>
-              </w:rPr>
-              <w:t>Đi tắt xuyên qua dải gạch cam</w:t>
-            </w:r>
-          </w:p>
-        </w:tc>
-        <w:tc>
-          <w:tcPr>
-            <w:tcW w:type="dxa" w:w="2340"/>
-            <w:shd w:fill="F9FAFB"/>
-            <w:tcMar>
-              <w:top w:w="60" w:type="dxa"/>
-              <w:bottom w:w="60" w:type="dxa"/>
-              <w:left w:w="80" w:type="dxa"/>
-              <w:right w:w="80" w:type="dxa"/>
-            </w:tcMar>
-          </w:tcPr>
-          <w:p>
-            <w:r>
-              <w:rPr>
-                <w:rFonts w:ascii="Arial" w:hAnsi="Arial"/>
-                <w:sz w:val="17"/>
-              </w:rPr>
-              <w:t>6 bước (Ít bước nhất)</w:t>
-            </w:r>
-          </w:p>
-        </w:tc>
-        <w:tc>
-          <w:tcPr>
-            <w:tcW w:type="dxa" w:w="2340"/>
-            <w:shd w:fill="F9FAFB"/>
-            <w:tcMar>
-              <w:top w:w="60" w:type="dxa"/>
-              <w:bottom w:w="60" w:type="dxa"/>
-              <w:left w:w="80" w:type="dxa"/>
-              <w:right w:w="80" w:type="dxa"/>
-            </w:tcMar>
-          </w:tcPr>
-          <w:p>
-            <w:r>
-              <w:rPr>
-                <w:rFonts w:ascii="Arial" w:hAnsi="Arial"/>
-                <w:sz w:val="17"/>
-              </w:rPr>
-              <w:t>7.5 (Bị phạt gạch cam)</w:t>
-            </w:r>
-          </w:p>
-        </w:tc>
-      </w:tr>
-      <w:tr>
-        <w:tc>
-          <w:tcPr>
-            <w:tcW w:type="dxa" w:w="2340"/>
-            <w:shd w:fill="FFFFFF"/>
-            <w:tcMar>
-              <w:top w:w="60" w:type="dxa"/>
-              <w:bottom w:w="60" w:type="dxa"/>
-              <w:left w:w="80" w:type="dxa"/>
-              <w:right w:w="80" w:type="dxa"/>
-            </w:tcMar>
-          </w:tcPr>
-          <w:p>
-            <w:r>
-              <w:rPr>
-                <w:rFonts w:ascii="Arial" w:hAnsi="Arial"/>
-                <w:sz w:val="17"/>
-              </w:rPr>
-              <w:t>UCS / A*</w:t>
-            </w:r>
-          </w:p>
-        </w:tc>
-        <w:tc>
-          <w:tcPr>
-            <w:tcW w:type="dxa" w:w="2340"/>
-            <w:shd w:fill="FFFFFF"/>
-            <w:tcMar>
-              <w:top w:w="60" w:type="dxa"/>
-              <w:bottom w:w="60" w:type="dxa"/>
-              <w:left w:w="80" w:type="dxa"/>
-              <w:right w:w="80" w:type="dxa"/>
-            </w:tcMar>
-          </w:tcPr>
-          <w:p>
-            <w:r>
-              <w:rPr>
-                <w:rFonts w:ascii="Arial" w:hAnsi="Arial"/>
-                <w:sz w:val="17"/>
-              </w:rPr>
-              <w:t>Đi đường vòng qua hành lang an toàn</w:t>
-            </w:r>
-          </w:p>
-        </w:tc>
-        <w:tc>
-          <w:tcPr>
-            <w:tcW w:type="dxa" w:w="2340"/>
-            <w:shd w:fill="FFFFFF"/>
-            <w:tcMar>
-              <w:top w:w="60" w:type="dxa"/>
-              <w:bottom w:w="60" w:type="dxa"/>
-              <w:left w:w="80" w:type="dxa"/>
-              <w:right w:w="80" w:type="dxa"/>
-            </w:tcMar>
-          </w:tcPr>
-          <w:p>
-            <w:r>
-              <w:rPr>
-                <w:rFonts w:ascii="Arial" w:hAnsi="Arial"/>
-                <w:sz w:val="17"/>
-              </w:rPr>
-              <w:t>7 bước (+1 bước vòng)</w:t>
-            </w:r>
-          </w:p>
-        </w:tc>
-        <w:tc>
-          <w:tcPr>
-            <w:tcW w:type="dxa" w:w="2340"/>
-            <w:shd w:fill="FFFFFF"/>
-            <w:tcMar>
-              <w:top w:w="60" w:type="dxa"/>
-              <w:bottom w:w="60" w:type="dxa"/>
-              <w:left w:w="80" w:type="dxa"/>
-              <w:right w:w="80" w:type="dxa"/>
-            </w:tcMar>
-          </w:tcPr>
-          <w:p>
-            <w:r>
-              <w:rPr>
-                <w:rFonts w:ascii="Arial" w:hAnsi="Arial"/>
-                <w:sz w:val="17"/>
-              </w:rPr>
-              <w:t>7.0 (Tối ưu chi phí tuyệt đối)</w:t>
-            </w:r>
-          </w:p>
-        </w:tc>
-      </w:tr>
-    </w:tbl>
     <w:p>
       <w:pPr>
         <w:keepNext/>
@@ -1984,25 +1690,9 @@
       <w:r>
         <w:rPr>
           <w:rFonts w:ascii="Arial" w:hAnsi="Arial"/>
-          <w:b/>
           <w:sz w:val="20"/>
         </w:rPr>
-        <w:t xml:space="preserve">• </w:t>
-      </w:r>
-      <w:r>
-        <w:rPr>
-          <w:rFonts w:ascii="Arial" w:hAnsi="Arial"/>
-          <w:b/>
-          <w:sz w:val="20"/>
-        </w:rPr>
-        <w:t xml:space="preserve">5.3. Trạng thái phân tách và hợp nhất (SPLIT / Rejoin): </w:t>
-      </w:r>
-      <w:r>
-        <w:rPr>
-          <w:rFonts w:ascii="Arial" w:hAnsi="Arial"/>
-          <w:sz w:val="20"/>
-        </w:rPr>
-        <w:t>Khi khối bước lên ô SPLIT_SWITCH, khối tách đôi thành hai khối lập phương 1x1x1 tại hai tọa độ độc lập. Hành động SPACE được sinh ra trong get_successors(state) để hoán đổi khối điều khiển, được tính là đúng 1 bước đi và đẩy vào hàng đợi như một trạng thái kế tiếp bình thường.</w:t>
+        <w:t>• 5.3. Trạng thái phân tách và hợp nhất (SPLIT / Rejoin): Khi khối bước lên ô SPLIT_SWITCH, khối tách đôi thành hai khối lập phương 1×1×1 và dịch chuyển tức thời (teleport) tới 2 tọa độ mục tiêu targets. Tại trạng thái SPLIT, get_successors(state) sinh 8 hành động tìm kiếm (4 hướng thường di chuyển khối active_cube, và 4 hướng có tiền tố 'S' để đổi khối rồi lăn ngay). Thao tác SPACE chơi tay không sinh cạnh tìm kiếm riêng. Khi hai khối đơn di chuyển đến hai ô kề sát nhau, cơ chế tự động sáp nhập (rejoin) sẽ hợp nhất hai khối thành khối nguyên vẹn HORIZONTAL hoặc VERTICAL.</w:t>
       </w:r>
     </w:p>
     <w:p>
@@ -2035,21 +1725,33 @@
         <w:tc>
           <w:tcPr>
             <w:tcW w:type="dxa" w:w="3120"/>
-            <w:shd w:fill="1E3C72"/>
             <w:tcMar>
               <w:top w:w="80" w:type="dxa"/>
               <w:bottom w:w="80" w:type="dxa"/>
               <w:left w:w="100" w:type="dxa"/>
               <w:right w:w="100" w:type="dxa"/>
             </w:tcMar>
+            <w:shd w:fill="1E3C72"/>
+            <w:tcMar>
+              <w:top w:w="80" w:type="dxa"/>
+              <w:bottom w:w="80" w:type="dxa"/>
+              <w:left w:w="120" w:type="dxa"/>
+              <w:right w:w="120" w:type="dxa"/>
+            </w:tcMar>
+            <w:vAlign w:val="center"/>
           </w:tcPr>
           <w:p>
+            <w:pPr>
+              <w:spacing w:before="60" w:after="60" w:line="276" w:lineRule="auto"/>
+              <w:jc w:val="center"/>
+            </w:pPr>
             <w:r>
               <w:rPr>
                 <w:rFonts w:ascii="Arial" w:hAnsi="Arial"/>
                 <w:b/>
+                <w:i w:val="0"/>
                 <w:color w:val="FFFFFF"/>
-                <w:sz w:val="18"/>
+                <w:sz w:val="20"/>
               </w:rPr>
               <w:t>Tiêu chuẩn</w:t>
             </w:r>
@@ -2058,21 +1760,33 @@
         <w:tc>
           <w:tcPr>
             <w:tcW w:type="dxa" w:w="3120"/>
-            <w:shd w:fill="1E3C72"/>
             <w:tcMar>
               <w:top w:w="80" w:type="dxa"/>
               <w:bottom w:w="80" w:type="dxa"/>
               <w:left w:w="100" w:type="dxa"/>
               <w:right w:w="100" w:type="dxa"/>
             </w:tcMar>
+            <w:shd w:fill="1E3C72"/>
+            <w:tcMar>
+              <w:top w:w="80" w:type="dxa"/>
+              <w:bottom w:w="80" w:type="dxa"/>
+              <w:left w:w="120" w:type="dxa"/>
+              <w:right w:w="120" w:type="dxa"/>
+            </w:tcMar>
+            <w:vAlign w:val="center"/>
           </w:tcPr>
           <w:p>
+            <w:pPr>
+              <w:spacing w:before="60" w:after="60" w:line="276" w:lineRule="auto"/>
+              <w:jc w:val="center"/>
+            </w:pPr>
             <w:r>
               <w:rPr>
                 <w:rFonts w:ascii="Arial" w:hAnsi="Arial"/>
                 <w:b/>
+                <w:i w:val="0"/>
                 <w:color w:val="FFFFFF"/>
-                <w:sz w:val="18"/>
+                <w:sz w:val="20"/>
               </w:rPr>
               <w:t>Đánh giá</w:t>
             </w:r>
@@ -2081,21 +1795,39 @@
         <w:tc>
           <w:tcPr>
             <w:tcW w:type="dxa" w:w="3120"/>
-            <w:shd w:fill="1E3C72"/>
             <w:tcMar>
               <w:top w:w="80" w:type="dxa"/>
               <w:bottom w:w="80" w:type="dxa"/>
               <w:left w:w="100" w:type="dxa"/>
               <w:right w:w="100" w:type="dxa"/>
             </w:tcMar>
+            <w:tcMar>
+              <w:top w:w="80" w:type="dxa"/>
+              <w:bottom w:w="80" w:type="dxa"/>
+              <w:left w:w="120" w:type="dxa"/>
+              <w:right w:w="120" w:type="dxa"/>
+            </w:tcMar>
+            <w:vAlign w:val="center"/>
+            <w:shd w:fill="1E3C72"/>
+            <w:tcMar>
+              <w:top w:w="80" w:type="dxa"/>
+              <w:bottom w:w="80" w:type="dxa"/>
+              <w:left w:w="120" w:type="dxa"/>
+              <w:right w:w="120" w:type="dxa"/>
+            </w:tcMar>
           </w:tcPr>
           <w:p>
+            <w:pPr>
+              <w:spacing w:before="60" w:after="60" w:line="276" w:lineRule="auto"/>
+              <w:jc w:val="center"/>
+            </w:pPr>
             <w:r>
               <w:rPr>
                 <w:rFonts w:ascii="Arial" w:hAnsi="Arial"/>
                 <w:b/>
+                <w:i w:val="0"/>
                 <w:color w:val="FFFFFF"/>
-                <w:sz w:val="18"/>
+                <w:sz w:val="20"/>
               </w:rPr>
               <w:t>Giải thích chi tiết trong bài toán Bloxorz</w:t>
             </w:r>
@@ -2106,19 +1838,33 @@
         <w:tc>
           <w:tcPr>
             <w:tcW w:type="dxa" w:w="3120"/>
-            <w:shd w:fill="F9FAFB"/>
             <w:tcMar>
               <w:top w:w="60" w:type="dxa"/>
               <w:bottom w:w="60" w:type="dxa"/>
               <w:left w:w="80" w:type="dxa"/>
               <w:right w:w="80" w:type="dxa"/>
             </w:tcMar>
+            <w:shd w:fill="FFFFFF"/>
+            <w:tcMar>
+              <w:top w:w="80" w:type="dxa"/>
+              <w:bottom w:w="80" w:type="dxa"/>
+              <w:left w:w="120" w:type="dxa"/>
+              <w:right w:w="120" w:type="dxa"/>
+            </w:tcMar>
+            <w:vAlign w:val="center"/>
           </w:tcPr>
           <w:p>
+            <w:pPr>
+              <w:spacing w:before="60" w:after="60" w:line="276" w:lineRule="auto"/>
+              <w:jc w:val="left"/>
+            </w:pPr>
             <w:r>
               <w:rPr>
                 <w:rFonts w:ascii="Arial" w:hAnsi="Arial"/>
-                <w:sz w:val="17"/>
+                <w:b/>
+                <w:i w:val="0"/>
+                <w:color w:val="102C57"/>
+                <w:sz w:val="19"/>
               </w:rPr>
               <w:t>Tính đầy đủ (Completeness)</w:t>
             </w:r>
@@ -2127,19 +1873,33 @@
         <w:tc>
           <w:tcPr>
             <w:tcW w:type="dxa" w:w="3120"/>
-            <w:shd w:fill="F9FAFB"/>
             <w:tcMar>
               <w:top w:w="60" w:type="dxa"/>
               <w:bottom w:w="60" w:type="dxa"/>
               <w:left w:w="80" w:type="dxa"/>
               <w:right w:w="80" w:type="dxa"/>
             </w:tcMar>
+            <w:shd w:fill="FFFFFF"/>
+            <w:tcMar>
+              <w:top w:w="80" w:type="dxa"/>
+              <w:bottom w:w="80" w:type="dxa"/>
+              <w:left w:w="120" w:type="dxa"/>
+              <w:right w:w="120" w:type="dxa"/>
+            </w:tcMar>
+            <w:vAlign w:val="center"/>
           </w:tcPr>
           <w:p>
+            <w:pPr>
+              <w:spacing w:before="60" w:after="60" w:line="276" w:lineRule="auto"/>
+              <w:jc w:val="center"/>
+            </w:pPr>
             <w:r>
               <w:rPr>
                 <w:rFonts w:ascii="Arial" w:hAnsi="Arial"/>
-                <w:sz w:val="17"/>
+                <w:b/>
+                <w:i w:val="0"/>
+                <w:color w:val="008000"/>
+                <w:sz w:val="19"/>
               </w:rPr>
               <w:t>CÓ</w:t>
             </w:r>
@@ -2148,21 +1908,35 @@
         <w:tc>
           <w:tcPr>
             <w:tcW w:type="dxa" w:w="3120"/>
-            <w:shd w:fill="F9FAFB"/>
             <w:tcMar>
               <w:top w:w="60" w:type="dxa"/>
               <w:bottom w:w="60" w:type="dxa"/>
               <w:left w:w="80" w:type="dxa"/>
               <w:right w:w="80" w:type="dxa"/>
             </w:tcMar>
+            <w:shd w:fill="FFFFFF"/>
+            <w:tcMar>
+              <w:top w:w="80" w:type="dxa"/>
+              <w:bottom w:w="80" w:type="dxa"/>
+              <w:left w:w="120" w:type="dxa"/>
+              <w:right w:w="120" w:type="dxa"/>
+            </w:tcMar>
+            <w:vAlign w:val="center"/>
           </w:tcPr>
           <w:p>
+            <w:pPr>
+              <w:spacing w:before="60" w:after="60" w:line="276" w:lineRule="auto"/>
+              <w:jc w:val="left"/>
+            </w:pPr>
             <w:r>
               <w:rPr>
                 <w:rFonts w:ascii="Arial" w:hAnsi="Arial"/>
-                <w:sz w:val="17"/>
+                <w:b w:val="0"/>
+                <w:i w:val="0"/>
+                <w:color w:val="333333"/>
+                <w:sz w:val="19"/>
               </w:rPr>
-              <w:t>Không gian trạng thái Bloxorz là hữu hạn (|S| &lt; ∞) và hệ số phân nhánh b ≤ 5. Bảng băm parent ngăn ngừa triệt để việc lặp chu trình. Do đó, thuật toán chắc chắn luôn tìm ra nghiệm nếu tồn tại, hoặc dừng và kết luận vô nghiệm.</w:t>
+              <w:t>Không gian trạng thái Bloxorz là hữu hạn (|S| &lt; ∞) và hệ số phân nhánh b ≤ 4 khi chưa tách, b ≤ 8 khi ở trạng thái SPLIT. Bảng băm parent ngăn ngừa triệt để việc lặp chu trình. Do đó, thuật toán chắc chắn luôn tìm ra nghiệm nếu tồn tại, hoặc dừng và kết luận vô nghiệm.</w:t>
             </w:r>
           </w:p>
         </w:tc>
@@ -2171,19 +1945,33 @@
         <w:tc>
           <w:tcPr>
             <w:tcW w:type="dxa" w:w="3120"/>
-            <w:shd w:fill="FFFFFF"/>
             <w:tcMar>
               <w:top w:w="60" w:type="dxa"/>
               <w:bottom w:w="60" w:type="dxa"/>
               <w:left w:w="80" w:type="dxa"/>
               <w:right w:w="80" w:type="dxa"/>
             </w:tcMar>
+            <w:shd w:fill="F8FAFC"/>
+            <w:tcMar>
+              <w:top w:w="80" w:type="dxa"/>
+              <w:bottom w:w="80" w:type="dxa"/>
+              <w:left w:w="120" w:type="dxa"/>
+              <w:right w:w="120" w:type="dxa"/>
+            </w:tcMar>
+            <w:vAlign w:val="center"/>
           </w:tcPr>
           <w:p>
+            <w:pPr>
+              <w:spacing w:before="60" w:after="60" w:line="276" w:lineRule="auto"/>
+              <w:jc w:val="left"/>
+            </w:pPr>
             <w:r>
               <w:rPr>
                 <w:rFonts w:ascii="Arial" w:hAnsi="Arial"/>
-                <w:sz w:val="17"/>
+                <w:b/>
+                <w:i w:val="0"/>
+                <w:color w:val="102C57"/>
+                <w:sz w:val="19"/>
               </w:rPr>
               <w:t>Tính tối ưu (Optimality)</w:t>
             </w:r>
@@ -2192,19 +1980,33 @@
         <w:tc>
           <w:tcPr>
             <w:tcW w:type="dxa" w:w="3120"/>
-            <w:shd w:fill="FFFFFF"/>
             <w:tcMar>
               <w:top w:w="60" w:type="dxa"/>
               <w:bottom w:w="60" w:type="dxa"/>
               <w:left w:w="80" w:type="dxa"/>
               <w:right w:w="80" w:type="dxa"/>
             </w:tcMar>
+            <w:shd w:fill="F8FAFC"/>
+            <w:tcMar>
+              <w:top w:w="80" w:type="dxa"/>
+              <w:bottom w:w="80" w:type="dxa"/>
+              <w:left w:w="120" w:type="dxa"/>
+              <w:right w:w="120" w:type="dxa"/>
+            </w:tcMar>
+            <w:vAlign w:val="center"/>
           </w:tcPr>
           <w:p>
+            <w:pPr>
+              <w:spacing w:before="60" w:after="60" w:line="276" w:lineRule="auto"/>
+              <w:jc w:val="center"/>
+            </w:pPr>
             <w:r>
               <w:rPr>
                 <w:rFonts w:ascii="Arial" w:hAnsi="Arial"/>
-                <w:sz w:val="17"/>
+                <w:b/>
+                <w:i w:val="0"/>
+                <w:color w:val="008000"/>
+                <w:sz w:val="19"/>
               </w:rPr>
               <w:t>CÓ</w:t>
             </w:r>
@@ -2213,19 +2015,39 @@
         <w:tc>
           <w:tcPr>
             <w:tcW w:type="dxa" w:w="3120"/>
-            <w:shd w:fill="FFFFFF"/>
             <w:tcMar>
               <w:top w:w="60" w:type="dxa"/>
               <w:bottom w:w="60" w:type="dxa"/>
               <w:left w:w="80" w:type="dxa"/>
               <w:right w:w="80" w:type="dxa"/>
             </w:tcMar>
+            <w:tcMar>
+              <w:top w:w="80" w:type="dxa"/>
+              <w:bottom w:w="80" w:type="dxa"/>
+              <w:left w:w="120" w:type="dxa"/>
+              <w:right w:w="120" w:type="dxa"/>
+            </w:tcMar>
+            <w:vAlign w:val="center"/>
+            <w:shd w:fill="F8FAFC"/>
+            <w:tcMar>
+              <w:top w:w="80" w:type="dxa"/>
+              <w:bottom w:w="80" w:type="dxa"/>
+              <w:left w:w="120" w:type="dxa"/>
+              <w:right w:w="120" w:type="dxa"/>
+            </w:tcMar>
           </w:tcPr>
           <w:p>
+            <w:pPr>
+              <w:spacing w:before="60" w:after="60" w:line="276" w:lineRule="auto"/>
+              <w:jc w:val="left"/>
+            </w:pPr>
             <w:r>
               <w:rPr>
                 <w:rFonts w:ascii="Arial" w:hAnsi="Arial"/>
-                <w:sz w:val="17"/>
+                <w:b w:val="0"/>
+                <w:i w:val="0"/>
+                <w:color w:val="333333"/>
+                <w:sz w:val="19"/>
               </w:rPr>
               <w:t>Vì chi phí mỗi bước đi là đồng nhất (w = 1), nghiệm đầu tiên chạm đích ở tầng sâu d nhỏ nhất chắc chắn là nghiệm có số bước đi (actions) ít nhất tuyệt đối.</w:t>
             </w:r>
@@ -2236,19 +2058,33 @@
         <w:tc>
           <w:tcPr>
             <w:tcW w:type="dxa" w:w="3120"/>
-            <w:shd w:fill="F9FAFB"/>
             <w:tcMar>
               <w:top w:w="60" w:type="dxa"/>
               <w:bottom w:w="60" w:type="dxa"/>
               <w:left w:w="80" w:type="dxa"/>
               <w:right w:w="80" w:type="dxa"/>
             </w:tcMar>
+            <w:shd w:fill="FFFFFF"/>
+            <w:tcMar>
+              <w:top w:w="80" w:type="dxa"/>
+              <w:bottom w:w="80" w:type="dxa"/>
+              <w:left w:w="120" w:type="dxa"/>
+              <w:right w:w="120" w:type="dxa"/>
+            </w:tcMar>
+            <w:vAlign w:val="center"/>
           </w:tcPr>
           <w:p>
+            <w:pPr>
+              <w:spacing w:before="60" w:after="60" w:line="276" w:lineRule="auto"/>
+              <w:jc w:val="left"/>
+            </w:pPr>
             <w:r>
               <w:rPr>
                 <w:rFonts w:ascii="Arial" w:hAnsi="Arial"/>
-                <w:sz w:val="17"/>
+                <w:b/>
+                <w:i w:val="0"/>
+                <w:color w:val="102C57"/>
+                <w:sz w:val="19"/>
               </w:rPr>
               <w:t>Độ phức tạp thời gian</w:t>
             </w:r>
@@ -2257,19 +2093,33 @@
         <w:tc>
           <w:tcPr>
             <w:tcW w:type="dxa" w:w="3120"/>
-            <w:shd w:fill="F9FAFB"/>
             <w:tcMar>
               <w:top w:w="60" w:type="dxa"/>
               <w:bottom w:w="60" w:type="dxa"/>
               <w:left w:w="80" w:type="dxa"/>
               <w:right w:w="80" w:type="dxa"/>
             </w:tcMar>
+            <w:shd w:fill="FFFFFF"/>
+            <w:tcMar>
+              <w:top w:w="80" w:type="dxa"/>
+              <w:bottom w:w="80" w:type="dxa"/>
+              <w:left w:w="120" w:type="dxa"/>
+              <w:right w:w="120" w:type="dxa"/>
+            </w:tcMar>
+            <w:vAlign w:val="center"/>
           </w:tcPr>
           <w:p>
+            <w:pPr>
+              <w:spacing w:before="60" w:after="60" w:line="276" w:lineRule="auto"/>
+              <w:jc w:val="center"/>
+            </w:pPr>
             <w:r>
               <w:rPr>
                 <w:rFonts w:ascii="Arial" w:hAnsi="Arial"/>
-                <w:sz w:val="17"/>
+                <w:b/>
+                <w:i w:val="0"/>
+                <w:color w:val="282828"/>
+                <w:sz w:val="19"/>
               </w:rPr>
               <w:t>O(b^d)</w:t>
             </w:r>
@@ -2278,21 +2128,35 @@
         <w:tc>
           <w:tcPr>
             <w:tcW w:type="dxa" w:w="3120"/>
-            <w:shd w:fill="F9FAFB"/>
             <w:tcMar>
               <w:top w:w="60" w:type="dxa"/>
               <w:bottom w:w="60" w:type="dxa"/>
               <w:left w:w="80" w:type="dxa"/>
               <w:right w:w="80" w:type="dxa"/>
             </w:tcMar>
+            <w:shd w:fill="FFFFFF"/>
+            <w:tcMar>
+              <w:top w:w="80" w:type="dxa"/>
+              <w:bottom w:w="80" w:type="dxa"/>
+              <w:left w:w="120" w:type="dxa"/>
+              <w:right w:w="120" w:type="dxa"/>
+            </w:tcMar>
+            <w:vAlign w:val="center"/>
           </w:tcPr>
           <w:p>
+            <w:pPr>
+              <w:spacing w:before="60" w:after="60" w:line="276" w:lineRule="auto"/>
+              <w:jc w:val="left"/>
+            </w:pPr>
             <w:r>
               <w:rPr>
                 <w:rFonts w:ascii="Arial" w:hAnsi="Arial"/>
-                <w:sz w:val="17"/>
+                <w:b w:val="0"/>
+                <w:i w:val="0"/>
+                <w:color w:val="333333"/>
+                <w:sz w:val="19"/>
               </w:rPr>
-              <w:t>Thuật toán phải duyệt toàn bộ các node đến tầng d, với b là hệ số phân nhánh hữu hiệu (2 ≤ b ≤ 4) và d là độ sâu nghiệm: O(b^d).</w:t>
+              <w:t>Thuật toán phải duyệt toàn bộ các node đến tầng d, với b là hệ số phân nhánh hữu hiệu (2 ≤ b ≤ 4 khi khối nguyên, b ≤ 8 khi ở trạng thái SPLIT) và d là độ sâu nghiệm: O(b^d).</w:t>
             </w:r>
           </w:p>
         </w:tc>
@@ -2301,19 +2165,33 @@
         <w:tc>
           <w:tcPr>
             <w:tcW w:type="dxa" w:w="3120"/>
-            <w:shd w:fill="FFFFFF"/>
             <w:tcMar>
               <w:top w:w="60" w:type="dxa"/>
               <w:bottom w:w="60" w:type="dxa"/>
               <w:left w:w="80" w:type="dxa"/>
               <w:right w:w="80" w:type="dxa"/>
             </w:tcMar>
+            <w:shd w:fill="F8FAFC"/>
+            <w:tcMar>
+              <w:top w:w="80" w:type="dxa"/>
+              <w:bottom w:w="80" w:type="dxa"/>
+              <w:left w:w="120" w:type="dxa"/>
+              <w:right w:w="120" w:type="dxa"/>
+            </w:tcMar>
+            <w:vAlign w:val="center"/>
           </w:tcPr>
           <w:p>
+            <w:pPr>
+              <w:spacing w:before="60" w:after="60" w:line="276" w:lineRule="auto"/>
+              <w:jc w:val="left"/>
+            </w:pPr>
             <w:r>
               <w:rPr>
                 <w:rFonts w:ascii="Arial" w:hAnsi="Arial"/>
-                <w:sz w:val="17"/>
+                <w:b/>
+                <w:i w:val="0"/>
+                <w:color w:val="102C57"/>
+                <w:sz w:val="19"/>
               </w:rPr>
               <w:t>Độ phức tạp không gian</w:t>
             </w:r>
@@ -2322,19 +2200,33 @@
         <w:tc>
           <w:tcPr>
             <w:tcW w:type="dxa" w:w="3120"/>
-            <w:shd w:fill="FFFFFF"/>
             <w:tcMar>
               <w:top w:w="60" w:type="dxa"/>
               <w:bottom w:w="60" w:type="dxa"/>
               <w:left w:w="80" w:type="dxa"/>
               <w:right w:w="80" w:type="dxa"/>
             </w:tcMar>
+            <w:shd w:fill="F8FAFC"/>
+            <w:tcMar>
+              <w:top w:w="80" w:type="dxa"/>
+              <w:bottom w:w="80" w:type="dxa"/>
+              <w:left w:w="120" w:type="dxa"/>
+              <w:right w:w="120" w:type="dxa"/>
+            </w:tcMar>
+            <w:vAlign w:val="center"/>
           </w:tcPr>
           <w:p>
+            <w:pPr>
+              <w:spacing w:before="60" w:after="60" w:line="276" w:lineRule="auto"/>
+              <w:jc w:val="center"/>
+            </w:pPr>
             <w:r>
               <w:rPr>
                 <w:rFonts w:ascii="Arial" w:hAnsi="Arial"/>
-                <w:sz w:val="17"/>
+                <w:b/>
+                <w:i w:val="0"/>
+                <w:color w:val="282828"/>
+                <w:sz w:val="19"/>
               </w:rPr>
               <w:t>O(b^d)</w:t>
             </w:r>
@@ -2343,19 +2235,33 @@
         <w:tc>
           <w:tcPr>
             <w:tcW w:type="dxa" w:w="3120"/>
-            <w:shd w:fill="FFFFFF"/>
             <w:tcMar>
               <w:top w:w="60" w:type="dxa"/>
               <w:bottom w:w="60" w:type="dxa"/>
               <w:left w:w="80" w:type="dxa"/>
               <w:right w:w="80" w:type="dxa"/>
             </w:tcMar>
+            <w:shd w:fill="F8FAFC"/>
+            <w:tcMar>
+              <w:top w:w="80" w:type="dxa"/>
+              <w:bottom w:w="80" w:type="dxa"/>
+              <w:left w:w="120" w:type="dxa"/>
+              <w:right w:w="120" w:type="dxa"/>
+            </w:tcMar>
+            <w:vAlign w:val="center"/>
           </w:tcPr>
           <w:p>
+            <w:pPr>
+              <w:spacing w:before="60" w:after="60" w:line="276" w:lineRule="auto"/>
+              <w:jc w:val="left"/>
+            </w:pPr>
             <w:r>
               <w:rPr>
                 <w:rFonts w:ascii="Arial" w:hAnsi="Arial"/>
-                <w:sz w:val="17"/>
+                <w:b w:val="0"/>
+                <w:i w:val="0"/>
+                <w:color w:val="333333"/>
+                <w:sz w:val="19"/>
               </w:rPr>
               <w:t>Hàng đợi queue và bảng băm parent phải lưu trữ toàn bộ các trạng thái tầng hiện tại và các tầng trước đó trong bộ nhớ RAM, tăng theo hàm mũ O(b^d).</w:t>
             </w:r>
@@ -2365,80 +2271,228 @@
     </w:tbl>
     <w:p>
       <w:pPr>
-        <w:spacing w:before="40" w:after="60" w:line="276" w:lineRule="auto"/>
-      </w:pPr>
-    </w:p>
-    <w:p>
-      <w:pPr>
-        <w:keepNext/>
-        <w:spacing w:before="200" w:after="60"/>
+        <w:spacing w:before="160" w:after="60"/>
+        <w:ind w:left="0"/>
       </w:pPr>
       <w:r>
         <w:rPr>
           <w:rFonts w:ascii="Arial" w:hAnsi="Arial"/>
           <w:b/>
+          <w:i w:val="0"/>
           <w:color w:val="1E3C72"/>
           <w:sz w:val="23"/>
         </w:rPr>
-        <w:t>So sánh với DFS: Sự đánh đổi giữa Bộ nhớ và Thời gian</w:t>
+        <w:t>6.1. Phân tích độ phức tạp không gian và nút thắt bộ nhớ RAM (O(b^d))</w:t>
       </w:r>
     </w:p>
     <w:p>
       <w:pPr>
-        <w:spacing w:before="20" w:after="40" w:line="276" w:lineRule="auto"/>
-        <w:ind w:left="360"/>
+        <w:spacing w:before="0" w:after="60"/>
+        <w:ind w:left="0"/>
+      </w:pPr>
+      <w:r>
+        <w:rPr>
+          <w:rFonts w:ascii="Arial" w:hAnsi="Arial"/>
+          <w:b w:val="0"/>
+          <w:i w:val="0"/>
+          <w:color w:val="282828"/>
+          <w:sz w:val="20"/>
+        </w:rPr>
+        <w:t>Trong mô hình Graph-Search của BFS, bộ nhớ chính là nút thắt cổ chai lớn nhất chứ không phải thời gian tính toán của CPU. Thuật toán đòi hỏi phải lưu trữ đồng thời hai cấu trúc dữ liệu chính trong bộ nhớ RAM:</w:t>
+      </w:r>
+    </w:p>
+    <w:p>
+      <w:pPr>
+        <w:spacing w:before="0" w:after="40"/>
+        <w:ind w:left="280"/>
       </w:pPr>
       <w:r>
         <w:rPr>
           <w:rFonts w:ascii="Arial" w:hAnsi="Arial"/>
           <w:b/>
+          <w:i w:val="0"/>
+          <w:color w:val="102C57"/>
           <w:sz w:val="20"/>
         </w:rPr>
-        <w:t xml:space="preserve">• </w:t>
+        <w:t xml:space="preserve">• Hàng đợi queue (Frontier): </w:t>
       </w:r>
       <w:r>
         <w:rPr>
           <w:rFonts w:ascii="Arial" w:hAnsi="Arial"/>
-          <w:b/>
+          <w:b w:val="0"/>
+          <w:i w:val="0"/>
+          <w:color w:val="282828"/>
           <w:sz w:val="20"/>
         </w:rPr>
-        <w:t xml:space="preserve">1. Tiêu thụ bộ nhớ: </w:t>
-      </w:r>
-      <w:r>
-        <w:rPr>
-          <w:rFonts w:ascii="Arial" w:hAnsi="Arial"/>
-          <w:sz w:val="20"/>
-        </w:rPr>
-        <w:t>Về bộ nhớ: DFS vượt trội hơn BFS nhờ chỉ cần lưu vết một nhánh tìm kiếm hiện tại trên ngăn xếp (độ phức tạp tuyến tính O(b * m) trong Tree-Search hoặc O(|V|) trong Graph-Search), trong khi BFS bắt buộc phải lưu trữ toàn bộ mặt cắt ngang theo hàm mũ O(b^d). Ở các màn chơi có độ sâu lớn (như Level 33 với d = 119), BFS tiêu tốn hơn 15 MB RAM cho 67,354 node trong parent/queue.</w:t>
+        <w:t>Lưu trữ toàn bộ các trạng thái ở tầng độ sâu hiện tại d. Kích thước cực đại của hàng đợi tỉ lệ thuận với số lượng nút ở tầng sâu nhất, đạt xấp xỉ O(b^d) phần tử.</w:t>
       </w:r>
     </w:p>
     <w:p>
       <w:pPr>
-        <w:spacing w:before="20" w:after="40" w:line="276" w:lineRule="auto"/>
-        <w:ind w:left="360"/>
+        <w:spacing w:before="0" w:after="40"/>
+        <w:ind w:left="280"/>
       </w:pPr>
       <w:r>
         <w:rPr>
           <w:rFonts w:ascii="Arial" w:hAnsi="Arial"/>
           <w:b/>
+          <w:i w:val="0"/>
+          <w:color w:val="102C57"/>
           <w:sz w:val="20"/>
         </w:rPr>
-        <w:t xml:space="preserve">• </w:t>
+        <w:t xml:space="preserve">• Bảng băm parent (Explored Set): </w:t>
       </w:r>
       <w:r>
         <w:rPr>
           <w:rFonts w:ascii="Arial" w:hAnsi="Arial"/>
-          <w:b/>
+          <w:b w:val="0"/>
+          <w:i w:val="0"/>
+          <w:color w:val="282828"/>
           <w:sz w:val="20"/>
         </w:rPr>
-        <w:t xml:space="preserve">2. Thời gian chạy thực tế: </w:t>
+        <w:t>Lưu trữ toàn bộ các trạng thái đã từng được sinh ra từ tầng 0 đến tầng d để phục vụ truy vết và chống lặp chu trình. Tổng số node được lưu trữ là 1 + b + b^2 + ... + b^d ≈ O(b^d). Khi độ sâu nghiệm d tăng lên, dung lượng RAM tiêu thụ tăng theo hàm số mũ, khiến BFS có thể chạm ngưỡng giới hạn bộ nhớ trước khi tìm ra đích ở các bản đồ có độ sâu lớn.</w:t>
+      </w:r>
+    </w:p>
+    <w:p>
+      <w:pPr>
+        <w:spacing w:before="160" w:after="60"/>
+        <w:ind w:left="0"/>
+      </w:pPr>
+      <w:r>
+        <w:rPr>
+          <w:rFonts w:ascii="Arial" w:hAnsi="Arial"/>
+          <w:b/>
+          <w:i w:val="0"/>
+          <w:color w:val="1E3C72"/>
+          <w:sz w:val="23"/>
+        </w:rPr>
+        <w:t>6.2. Hệ số phân nhánh thực tế và cơ chế cắt tỉa tự nhiên (Natural Pruning)</w:t>
+      </w:r>
+    </w:p>
+    <w:p>
+      <w:pPr>
+        <w:spacing w:before="0" w:after="60"/>
+        <w:ind w:left="0"/>
+      </w:pPr>
+      <w:r>
+        <w:rPr>
+          <w:rFonts w:ascii="Arial" w:hAnsi="Arial"/>
+          <w:b w:val="0"/>
+          <w:i w:val="0"/>
+          <w:color w:val="282828"/>
+          <w:sz w:val="20"/>
+        </w:rPr>
+        <w:t>Mặc dù hệ số phân nhánh lý thuyết tối đa là b ≤ 4 khi khối nguyên vẹn và b ≤ 8 khi ở trạng thái phân tách (SPLIT), trong thực tế hệ số phân nhánh hiệu dụng (b_eff) nhỏ hơn đáng kể (thường chỉ dao động từ 2 đến 3). Điều này đạt được nhờ 3 cơ chế cắt tỉa tự nhiên của bài toán:</w:t>
+      </w:r>
+    </w:p>
+    <w:p>
+      <w:pPr>
+        <w:spacing w:before="0" w:after="40"/>
+        <w:ind w:left="280"/>
+      </w:pPr>
+      <w:r>
+        <w:rPr>
+          <w:rFonts w:ascii="Arial" w:hAnsi="Arial"/>
+          <w:b/>
+          <w:i w:val="0"/>
+          <w:color w:val="102C57"/>
+          <w:sz w:val="20"/>
+        </w:rPr>
+        <w:t xml:space="preserve">• Ranh giới bàn cờ: </w:t>
       </w:r>
       <w:r>
         <w:rPr>
           <w:rFonts w:ascii="Arial" w:hAnsi="Arial"/>
+          <w:b w:val="0"/>
+          <w:i w:val="0"/>
+          <w:color w:val="282828"/>
           <w:sz w:val="20"/>
         </w:rPr>
-        <w:t>Không thể mặc định BFS luôn chạy nhanh hơn DFS. Trong trường hợp thứ tự nước đi của DFS vô tình dẫn đúng vào nhánh có đích (lucky path), DFS có thể chạm đích cực nhanh mà không phải tốn thời gian quét ngang qua hàng ngàn node như BFS. Ngược lại, nếu DFS rẽ nhầm vào mê cung sâu không có đích, DFS sẽ mất rất nhiều thời gian quay lui và cho ra lời giải rất dài. BFS chấp nhận mở rộng đồng mức trên mọi hướng để bảo đảm tìm ra số bước tối ưu tuyệt đối.</w:t>
+        <w:t>Các bước lăn đưa khối ra ngoài biên hoặc rơi vào ô rỗng (EMPTY) bị hàm board.is_valid() loại bỏ ngay lập tức, không sinh ra nhánh con.</w:t>
+      </w:r>
+    </w:p>
+    <w:p>
+      <w:pPr>
+        <w:spacing w:before="0" w:after="40"/>
+        <w:ind w:left="280"/>
+      </w:pPr>
+      <w:r>
+        <w:rPr>
+          <w:rFonts w:ascii="Arial" w:hAnsi="Arial"/>
+          <w:b/>
+          <w:i w:val="0"/>
+          <w:color w:val="102C57"/>
+          <w:sz w:val="20"/>
+        </w:rPr>
+        <w:t xml:space="preserve">• Ràng buộc ô gạch mỏng (FRAGILE): </w:t>
+      </w:r>
+      <w:r>
+        <w:rPr>
+          <w:rFonts w:ascii="Arial" w:hAnsi="Arial"/>
+          <w:b w:val="0"/>
+          <w:i w:val="0"/>
+          <w:color w:val="282828"/>
+          <w:sz w:val="20"/>
+        </w:rPr>
+        <w:t>Luật cấm khối đứng thẳng trên ô cam giúp tự động hủy bỏ các nhánh trạng thái vi phạm ngay tại thời điểm kiểm tra tính hợp lệ.</w:t>
+      </w:r>
+    </w:p>
+    <w:p>
+      <w:pPr>
+        <w:spacing w:before="0" w:after="40"/>
+        <w:ind w:left="280"/>
+      </w:pPr>
+      <w:r>
+        <w:rPr>
+          <w:rFonts w:ascii="Arial" w:hAnsi="Arial"/>
+          <w:b/>
+          <w:i w:val="0"/>
+          <w:color w:val="102C57"/>
+          <w:sz w:val="20"/>
+        </w:rPr>
+        <w:t xml:space="preserve">• Đánh dấu lúc phát hiện (nxt in parent): </w:t>
+      </w:r>
+      <w:r>
+        <w:rPr>
+          <w:rFonts w:ascii="Arial" w:hAnsi="Arial"/>
+          <w:b w:val="0"/>
+          <w:i w:val="0"/>
+          <w:color w:val="282828"/>
+          <w:sz w:val="20"/>
+        </w:rPr>
+        <w:t>Các đường đi hội tụ về cùng một trạng thái từ các nhánh khác nhau được triệt tiêu ngay lập tức trước khi được nạp vào hàng đợi, giữ cho kích thước tập biên không bị bùng nổ quá nhanh.</w:t>
+      </w:r>
+    </w:p>
+    <w:p>
+      <w:pPr>
+        <w:spacing w:before="160" w:after="60"/>
+        <w:ind w:left="0"/>
+      </w:pPr>
+      <w:r>
+        <w:rPr>
+          <w:rFonts w:ascii="Arial" w:hAnsi="Arial"/>
+          <w:b/>
+          <w:i w:val="0"/>
+          <w:color w:val="1E3C72"/>
+          <w:sz w:val="23"/>
+        </w:rPr>
+        <w:t>6.3. Tính đầy đủ (Completeness) trong không gian trạng thái hữu hạn</w:t>
+      </w:r>
+    </w:p>
+    <w:p>
+      <w:pPr>
+        <w:spacing w:before="0" w:after="60"/>
+        <w:ind w:left="0"/>
+      </w:pPr>
+      <w:r>
+        <w:rPr>
+          <w:rFonts w:ascii="Arial" w:hAnsi="Arial"/>
+          <w:b w:val="0"/>
+          <w:i w:val="0"/>
+          <w:color w:val="282828"/>
+          <w:sz w:val="20"/>
+        </w:rPr>
+        <w:t>Do bàn cờ Bloxorz có kích thước giới hạn R × C, số lượng tư thế khối và các trạng thái chuyển mạch công tắc là hữu hạn, nên tổng không gian trạng thái khả dĩ là hữu hạn (|S| &lt; ∞). Với bảng băm parent đóng vai trò tập đóng ngăn chặn triệt để vòng lặp chu trình, thuật toán chắc chắn sẽ duyệt cạn thành phần liên thông chứa trạng thái xuất phát. Nếu tồn tại lời giải, BFS chắc chắn tìm ra; nếu bản đồ vô nghiệm, hàng đợi sẽ rỗng sau khi duyệt hết các trạng thái liên thông và thuật toán kết luận vô nghiệm một cách xác định.</w:t>
       </w:r>
     </w:p>
     <w:p>
@@ -2453,1722 +2507,7 @@
           <w:color w:val="102C57"/>
           <w:sz w:val="26"/>
         </w:rPr>
-        <w:t>7. Kết quả thực nghiệm tiêu biểu của BFS trên bộ màn chơi</w:t>
-      </w:r>
-    </w:p>
-    <w:p>
-      <w:pPr>
-        <w:spacing w:before="40" w:after="60" w:line="276" w:lineRule="auto"/>
-      </w:pPr>
-      <w:r>
-        <w:rPr>
-          <w:rFonts w:ascii="Arial" w:hAnsi="Arial"/>
-          <w:i w:val="0"/>
-          <w:sz w:val="20"/>
-        </w:rPr>
-        <w:t>Thuật toán BFS đã vượt qua tuyệt đối 100% các bài kiểm thử (43/43 tests PASS). Dưới đây là bảng số liệu đo đạc thực tế từ công cụ đo lường run_with_profiler trên các màn chơi đại diện cho từng mức độ phức tạp:</w:t>
-      </w:r>
-    </w:p>
-    <w:tbl>
-      <w:tblPr>
-        <w:tblW w:type="auto" w:w="0"/>
-        <w:jc w:val="center"/>
-        <w:tblLook w:firstColumn="1" w:firstRow="1" w:lastColumn="0" w:lastRow="0" w:noHBand="0" w:noVBand="1" w:val="04A0"/>
-      </w:tblPr>
-      <w:tblGrid>
-        <w:gridCol w:w="1337"/>
-        <w:gridCol w:w="1337"/>
-        <w:gridCol w:w="1337"/>
-        <w:gridCol w:w="1337"/>
-        <w:gridCol w:w="1337"/>
-        <w:gridCol w:w="1337"/>
-        <w:gridCol w:w="1337"/>
-      </w:tblGrid>
-      <w:tr>
-        <w:tc>
-          <w:tcPr>
-            <w:tcW w:type="dxa" w:w="1337"/>
-            <w:shd w:fill="1E3C72"/>
-            <w:tcMar>
-              <w:top w:w="80" w:type="dxa"/>
-              <w:bottom w:w="80" w:type="dxa"/>
-              <w:left w:w="100" w:type="dxa"/>
-              <w:right w:w="100" w:type="dxa"/>
-            </w:tcMar>
-          </w:tcPr>
-          <w:p>
-            <w:r>
-              <w:rPr>
-                <w:rFonts w:ascii="Arial" w:hAnsi="Arial"/>
-                <w:b/>
-                <w:color w:val="FFFFFF"/>
-                <w:sz w:val="18"/>
-              </w:rPr>
-              <w:t>Màn chơi</w:t>
-            </w:r>
-          </w:p>
-        </w:tc>
-        <w:tc>
-          <w:tcPr>
-            <w:tcW w:type="dxa" w:w="1337"/>
-            <w:shd w:fill="1E3C72"/>
-            <w:tcMar>
-              <w:top w:w="80" w:type="dxa"/>
-              <w:bottom w:w="80" w:type="dxa"/>
-              <w:left w:w="100" w:type="dxa"/>
-              <w:right w:w="100" w:type="dxa"/>
-            </w:tcMar>
-          </w:tcPr>
-          <w:p>
-            <w:r>
-              <w:rPr>
-                <w:rFonts w:ascii="Arial" w:hAnsi="Arial"/>
-                <w:b/>
-                <w:color w:val="FFFFFF"/>
-                <w:sz w:val="18"/>
-              </w:rPr>
-              <w:t>Đặc trưng màn chơi</w:t>
-            </w:r>
-          </w:p>
-        </w:tc>
-        <w:tc>
-          <w:tcPr>
-            <w:tcW w:type="dxa" w:w="1337"/>
-            <w:shd w:fill="1E3C72"/>
-            <w:tcMar>
-              <w:top w:w="80" w:type="dxa"/>
-              <w:bottom w:w="80" w:type="dxa"/>
-              <w:left w:w="100" w:type="dxa"/>
-              <w:right w:w="100" w:type="dxa"/>
-            </w:tcMar>
-          </w:tcPr>
-          <w:p>
-            <w:r>
-              <w:rPr>
-                <w:rFonts w:ascii="Arial" w:hAnsi="Arial"/>
-                <w:b/>
-                <w:color w:val="FFFFFF"/>
-                <w:sz w:val="18"/>
-              </w:rPr>
-              <w:t>Số bước</w:t>
-            </w:r>
-          </w:p>
-        </w:tc>
-        <w:tc>
-          <w:tcPr>
-            <w:tcW w:type="dxa" w:w="1337"/>
-            <w:shd w:fill="1E3C72"/>
-            <w:tcMar>
-              <w:top w:w="80" w:type="dxa"/>
-              <w:bottom w:w="80" w:type="dxa"/>
-              <w:left w:w="100" w:type="dxa"/>
-              <w:right w:w="100" w:type="dxa"/>
-            </w:tcMar>
-          </w:tcPr>
-          <w:p>
-            <w:r>
-              <w:rPr>
-                <w:rFonts w:ascii="Arial" w:hAnsi="Arial"/>
-                <w:b/>
-                <w:color w:val="FFFFFF"/>
-                <w:sz w:val="18"/>
-              </w:rPr>
-              <w:t>Chi phí</w:t>
-            </w:r>
-          </w:p>
-        </w:tc>
-        <w:tc>
-          <w:tcPr>
-            <w:tcW w:type="dxa" w:w="1337"/>
-            <w:shd w:fill="1E3C72"/>
-            <w:tcMar>
-              <w:top w:w="80" w:type="dxa"/>
-              <w:bottom w:w="80" w:type="dxa"/>
-              <w:left w:w="100" w:type="dxa"/>
-              <w:right w:w="100" w:type="dxa"/>
-            </w:tcMar>
-          </w:tcPr>
-          <w:p>
-            <w:r>
-              <w:rPr>
-                <w:rFonts w:ascii="Arial" w:hAnsi="Arial"/>
-                <w:b/>
-                <w:color w:val="FFFFFF"/>
-                <w:sz w:val="18"/>
-              </w:rPr>
-              <w:t>Node duyệt</w:t>
-            </w:r>
-          </w:p>
-        </w:tc>
-        <w:tc>
-          <w:tcPr>
-            <w:tcW w:type="dxa" w:w="1337"/>
-            <w:shd w:fill="1E3C72"/>
-            <w:tcMar>
-              <w:top w:w="80" w:type="dxa"/>
-              <w:bottom w:w="80" w:type="dxa"/>
-              <w:left w:w="100" w:type="dxa"/>
-              <w:right w:w="100" w:type="dxa"/>
-            </w:tcMar>
-          </w:tcPr>
-          <w:p>
-            <w:r>
-              <w:rPr>
-                <w:rFonts w:ascii="Arial" w:hAnsi="Arial"/>
-                <w:b/>
-                <w:color w:val="FFFFFF"/>
-                <w:sz w:val="18"/>
-              </w:rPr>
-              <w:t>Thời gian (ms)</w:t>
-            </w:r>
-          </w:p>
-        </w:tc>
-        <w:tc>
-          <w:tcPr>
-            <w:tcW w:type="dxa" w:w="1337"/>
-            <w:shd w:fill="1E3C72"/>
-            <w:tcMar>
-              <w:top w:w="80" w:type="dxa"/>
-              <w:bottom w:w="80" w:type="dxa"/>
-              <w:left w:w="100" w:type="dxa"/>
-              <w:right w:w="100" w:type="dxa"/>
-            </w:tcMar>
-          </w:tcPr>
-          <w:p>
-            <w:r>
-              <w:rPr>
-                <w:rFonts w:ascii="Arial" w:hAnsi="Arial"/>
-                <w:b/>
-                <w:color w:val="FFFFFF"/>
-                <w:sz w:val="18"/>
-              </w:rPr>
-              <w:t>Bộ nhớ (KB)</w:t>
-            </w:r>
-          </w:p>
-        </w:tc>
-      </w:tr>
-      <w:tr>
-        <w:tc>
-          <w:tcPr>
-            <w:tcW w:type="dxa" w:w="1337"/>
-            <w:shd w:fill="F9FAFB"/>
-            <w:tcMar>
-              <w:top w:w="60" w:type="dxa"/>
-              <w:bottom w:w="60" w:type="dxa"/>
-              <w:left w:w="80" w:type="dxa"/>
-              <w:right w:w="80" w:type="dxa"/>
-            </w:tcMar>
-          </w:tcPr>
-          <w:p>
-            <w:r>
-              <w:rPr>
-                <w:rFonts w:ascii="Arial" w:hAnsi="Arial"/>
-                <w:sz w:val="17"/>
-              </w:rPr>
-              <w:t>Level 1</w:t>
-            </w:r>
-          </w:p>
-        </w:tc>
-        <w:tc>
-          <w:tcPr>
-            <w:tcW w:type="dxa" w:w="1337"/>
-            <w:shd w:fill="F9FAFB"/>
-            <w:tcMar>
-              <w:top w:w="60" w:type="dxa"/>
-              <w:bottom w:w="60" w:type="dxa"/>
-              <w:left w:w="80" w:type="dxa"/>
-              <w:right w:w="80" w:type="dxa"/>
-            </w:tcMar>
-          </w:tcPr>
-          <w:p>
-            <w:r>
-              <w:rPr>
-                <w:rFonts w:ascii="Arial" w:hAnsi="Arial"/>
-                <w:sz w:val="17"/>
-              </w:rPr>
-              <w:t>Màn khởi động (Sàn phẳng)</w:t>
-            </w:r>
-          </w:p>
-        </w:tc>
-        <w:tc>
-          <w:tcPr>
-            <w:tcW w:type="dxa" w:w="1337"/>
-            <w:shd w:fill="F9FAFB"/>
-            <w:tcMar>
-              <w:top w:w="60" w:type="dxa"/>
-              <w:bottom w:w="60" w:type="dxa"/>
-              <w:left w:w="80" w:type="dxa"/>
-              <w:right w:w="80" w:type="dxa"/>
-            </w:tcMar>
-          </w:tcPr>
-          <w:p>
-            <w:r>
-              <w:rPr>
-                <w:rFonts w:ascii="Arial" w:hAnsi="Arial"/>
-                <w:sz w:val="17"/>
-              </w:rPr>
-              <w:t>7</w:t>
-            </w:r>
-          </w:p>
-        </w:tc>
-        <w:tc>
-          <w:tcPr>
-            <w:tcW w:type="dxa" w:w="1337"/>
-            <w:shd w:fill="F9FAFB"/>
-            <w:tcMar>
-              <w:top w:w="60" w:type="dxa"/>
-              <w:bottom w:w="60" w:type="dxa"/>
-              <w:left w:w="80" w:type="dxa"/>
-              <w:right w:w="80" w:type="dxa"/>
-            </w:tcMar>
-          </w:tcPr>
-          <w:p>
-            <w:r>
-              <w:rPr>
-                <w:rFonts w:ascii="Arial" w:hAnsi="Arial"/>
-                <w:sz w:val="17"/>
-              </w:rPr>
-              <w:t>7.0</w:t>
-            </w:r>
-          </w:p>
-        </w:tc>
-        <w:tc>
-          <w:tcPr>
-            <w:tcW w:type="dxa" w:w="1337"/>
-            <w:shd w:fill="F9FAFB"/>
-            <w:tcMar>
-              <w:top w:w="60" w:type="dxa"/>
-              <w:bottom w:w="60" w:type="dxa"/>
-              <w:left w:w="80" w:type="dxa"/>
-              <w:right w:w="80" w:type="dxa"/>
-            </w:tcMar>
-          </w:tcPr>
-          <w:p>
-            <w:r>
-              <w:rPr>
-                <w:rFonts w:ascii="Arial" w:hAnsi="Arial"/>
-                <w:sz w:val="17"/>
-              </w:rPr>
-              <w:t>48</w:t>
-            </w:r>
-          </w:p>
-        </w:tc>
-        <w:tc>
-          <w:tcPr>
-            <w:tcW w:type="dxa" w:w="1337"/>
-            <w:shd w:fill="F9FAFB"/>
-            <w:tcMar>
-              <w:top w:w="60" w:type="dxa"/>
-              <w:bottom w:w="60" w:type="dxa"/>
-              <w:left w:w="80" w:type="dxa"/>
-              <w:right w:w="80" w:type="dxa"/>
-            </w:tcMar>
-          </w:tcPr>
-          <w:p>
-            <w:r>
-              <w:rPr>
-                <w:rFonts w:ascii="Arial" w:hAnsi="Arial"/>
-                <w:sz w:val="17"/>
-              </w:rPr>
-              <w:t>4.37</w:t>
-            </w:r>
-          </w:p>
-        </w:tc>
-        <w:tc>
-          <w:tcPr>
-            <w:tcW w:type="dxa" w:w="1337"/>
-            <w:shd w:fill="F9FAFB"/>
-            <w:tcMar>
-              <w:top w:w="60" w:type="dxa"/>
-              <w:bottom w:w="60" w:type="dxa"/>
-              <w:left w:w="80" w:type="dxa"/>
-              <w:right w:w="80" w:type="dxa"/>
-            </w:tcMar>
-          </w:tcPr>
-          <w:p>
-            <w:r>
-              <w:rPr>
-                <w:rFonts w:ascii="Arial" w:hAnsi="Arial"/>
-                <w:sz w:val="17"/>
-              </w:rPr>
-              <w:t>17.74</w:t>
-            </w:r>
-          </w:p>
-        </w:tc>
-      </w:tr>
-      <w:tr>
-        <w:tc>
-          <w:tcPr>
-            <w:tcW w:type="dxa" w:w="1337"/>
-            <w:shd w:fill="FFFFFF"/>
-            <w:tcMar>
-              <w:top w:w="60" w:type="dxa"/>
-              <w:bottom w:w="60" w:type="dxa"/>
-              <w:left w:w="80" w:type="dxa"/>
-              <w:right w:w="80" w:type="dxa"/>
-            </w:tcMar>
-          </w:tcPr>
-          <w:p>
-            <w:r>
-              <w:rPr>
-                <w:rFonts w:ascii="Arial" w:hAnsi="Arial"/>
-                <w:sz w:val="17"/>
-              </w:rPr>
-              <w:t>Level 2</w:t>
-            </w:r>
-          </w:p>
-        </w:tc>
-        <w:tc>
-          <w:tcPr>
-            <w:tcW w:type="dxa" w:w="1337"/>
-            <w:shd w:fill="FFFFFF"/>
-            <w:tcMar>
-              <w:top w:w="60" w:type="dxa"/>
-              <w:bottom w:w="60" w:type="dxa"/>
-              <w:left w:w="80" w:type="dxa"/>
-              <w:right w:w="80" w:type="dxa"/>
-            </w:tcMar>
-          </w:tcPr>
-          <w:p>
-            <w:r>
-              <w:rPr>
-                <w:rFonts w:ascii="Arial" w:hAnsi="Arial"/>
-                <w:sz w:val="17"/>
-              </w:rPr>
-              <w:t>Bẫy gạch cam nguy hiểm</w:t>
-            </w:r>
-          </w:p>
-        </w:tc>
-        <w:tc>
-          <w:tcPr>
-            <w:tcW w:type="dxa" w:w="1337"/>
-            <w:shd w:fill="FFFFFF"/>
-            <w:tcMar>
-              <w:top w:w="60" w:type="dxa"/>
-              <w:bottom w:w="60" w:type="dxa"/>
-              <w:left w:w="80" w:type="dxa"/>
-              <w:right w:w="80" w:type="dxa"/>
-            </w:tcMar>
-          </w:tcPr>
-          <w:p>
-            <w:r>
-              <w:rPr>
-                <w:rFonts w:ascii="Arial" w:hAnsi="Arial"/>
-                <w:sz w:val="17"/>
-              </w:rPr>
-              <w:t>6</w:t>
-            </w:r>
-          </w:p>
-        </w:tc>
-        <w:tc>
-          <w:tcPr>
-            <w:tcW w:type="dxa" w:w="1337"/>
-            <w:shd w:fill="FFFFFF"/>
-            <w:tcMar>
-              <w:top w:w="60" w:type="dxa"/>
-              <w:bottom w:w="60" w:type="dxa"/>
-              <w:left w:w="80" w:type="dxa"/>
-              <w:right w:w="80" w:type="dxa"/>
-            </w:tcMar>
-          </w:tcPr>
-          <w:p>
-            <w:r>
-              <w:rPr>
-                <w:rFonts w:ascii="Arial" w:hAnsi="Arial"/>
-                <w:sz w:val="17"/>
-              </w:rPr>
-              <w:t>6.0</w:t>
-            </w:r>
-          </w:p>
-        </w:tc>
-        <w:tc>
-          <w:tcPr>
-            <w:tcW w:type="dxa" w:w="1337"/>
-            <w:shd w:fill="FFFFFF"/>
-            <w:tcMar>
-              <w:top w:w="60" w:type="dxa"/>
-              <w:bottom w:w="60" w:type="dxa"/>
-              <w:left w:w="80" w:type="dxa"/>
-              <w:right w:w="80" w:type="dxa"/>
-            </w:tcMar>
-          </w:tcPr>
-          <w:p>
-            <w:r>
-              <w:rPr>
-                <w:rFonts w:ascii="Arial" w:hAnsi="Arial"/>
-                <w:sz w:val="17"/>
-              </w:rPr>
-              <w:t>31</w:t>
-            </w:r>
-          </w:p>
-        </w:tc>
-        <w:tc>
-          <w:tcPr>
-            <w:tcW w:type="dxa" w:w="1337"/>
-            <w:shd w:fill="FFFFFF"/>
-            <w:tcMar>
-              <w:top w:w="60" w:type="dxa"/>
-              <w:bottom w:w="60" w:type="dxa"/>
-              <w:left w:w="80" w:type="dxa"/>
-              <w:right w:w="80" w:type="dxa"/>
-            </w:tcMar>
-          </w:tcPr>
-          <w:p>
-            <w:r>
-              <w:rPr>
-                <w:rFonts w:ascii="Arial" w:hAnsi="Arial"/>
-                <w:sz w:val="17"/>
-              </w:rPr>
-              <w:t>3.33</w:t>
-            </w:r>
-          </w:p>
-        </w:tc>
-        <w:tc>
-          <w:tcPr>
-            <w:tcW w:type="dxa" w:w="1337"/>
-            <w:shd w:fill="FFFFFF"/>
-            <w:tcMar>
-              <w:top w:w="60" w:type="dxa"/>
-              <w:bottom w:w="60" w:type="dxa"/>
-              <w:left w:w="80" w:type="dxa"/>
-              <w:right w:w="80" w:type="dxa"/>
-            </w:tcMar>
-          </w:tcPr>
-          <w:p>
-            <w:r>
-              <w:rPr>
-                <w:rFonts w:ascii="Arial" w:hAnsi="Arial"/>
-                <w:sz w:val="17"/>
-              </w:rPr>
-              <w:t>9.93</w:t>
-            </w:r>
-          </w:p>
-        </w:tc>
-      </w:tr>
-      <w:tr>
-        <w:tc>
-          <w:tcPr>
-            <w:tcW w:type="dxa" w:w="1337"/>
-            <w:shd w:fill="F9FAFB"/>
-            <w:tcMar>
-              <w:top w:w="60" w:type="dxa"/>
-              <w:bottom w:w="60" w:type="dxa"/>
-              <w:left w:w="80" w:type="dxa"/>
-              <w:right w:w="80" w:type="dxa"/>
-            </w:tcMar>
-          </w:tcPr>
-          <w:p>
-            <w:r>
-              <w:rPr>
-                <w:rFonts w:ascii="Arial" w:hAnsi="Arial"/>
-                <w:sz w:val="17"/>
-              </w:rPr>
-              <w:t>Level 3</w:t>
-            </w:r>
-          </w:p>
-        </w:tc>
-        <w:tc>
-          <w:tcPr>
-            <w:tcW w:type="dxa" w:w="1337"/>
-            <w:shd w:fill="F9FAFB"/>
-            <w:tcMar>
-              <w:top w:w="60" w:type="dxa"/>
-              <w:bottom w:w="60" w:type="dxa"/>
-              <w:left w:w="80" w:type="dxa"/>
-              <w:right w:w="80" w:type="dxa"/>
-            </w:tcMar>
-          </w:tcPr>
-          <w:p>
-            <w:r>
-              <w:rPr>
-                <w:rFonts w:ascii="Arial" w:hAnsi="Arial"/>
-                <w:sz w:val="17"/>
-              </w:rPr>
-              <w:t>Công tắc và cầu mở</w:t>
-            </w:r>
-          </w:p>
-        </w:tc>
-        <w:tc>
-          <w:tcPr>
-            <w:tcW w:type="dxa" w:w="1337"/>
-            <w:shd w:fill="F9FAFB"/>
-            <w:tcMar>
-              <w:top w:w="60" w:type="dxa"/>
-              <w:bottom w:w="60" w:type="dxa"/>
-              <w:left w:w="80" w:type="dxa"/>
-              <w:right w:w="80" w:type="dxa"/>
-            </w:tcMar>
-          </w:tcPr>
-          <w:p>
-            <w:r>
-              <w:rPr>
-                <w:rFonts w:ascii="Arial" w:hAnsi="Arial"/>
-                <w:sz w:val="17"/>
-              </w:rPr>
-              <w:t>15</w:t>
-            </w:r>
-          </w:p>
-        </w:tc>
-        <w:tc>
-          <w:tcPr>
-            <w:tcW w:type="dxa" w:w="1337"/>
-            <w:shd w:fill="F9FAFB"/>
-            <w:tcMar>
-              <w:top w:w="60" w:type="dxa"/>
-              <w:bottom w:w="60" w:type="dxa"/>
-              <w:left w:w="80" w:type="dxa"/>
-              <w:right w:w="80" w:type="dxa"/>
-            </w:tcMar>
-          </w:tcPr>
-          <w:p>
-            <w:r>
-              <w:rPr>
-                <w:rFonts w:ascii="Arial" w:hAnsi="Arial"/>
-                <w:sz w:val="17"/>
-              </w:rPr>
-              <w:t>15.0</w:t>
-            </w:r>
-          </w:p>
-        </w:tc>
-        <w:tc>
-          <w:tcPr>
-            <w:tcW w:type="dxa" w:w="1337"/>
-            <w:shd w:fill="F9FAFB"/>
-            <w:tcMar>
-              <w:top w:w="60" w:type="dxa"/>
-              <w:bottom w:w="60" w:type="dxa"/>
-              <w:left w:w="80" w:type="dxa"/>
-              <w:right w:w="80" w:type="dxa"/>
-            </w:tcMar>
-          </w:tcPr>
-          <w:p>
-            <w:r>
-              <w:rPr>
-                <w:rFonts w:ascii="Arial" w:hAnsi="Arial"/>
-                <w:sz w:val="17"/>
-              </w:rPr>
-              <w:t>118</w:t>
-            </w:r>
-          </w:p>
-        </w:tc>
-        <w:tc>
-          <w:tcPr>
-            <w:tcW w:type="dxa" w:w="1337"/>
-            <w:shd w:fill="F9FAFB"/>
-            <w:tcMar>
-              <w:top w:w="60" w:type="dxa"/>
-              <w:bottom w:w="60" w:type="dxa"/>
-              <w:left w:w="80" w:type="dxa"/>
-              <w:right w:w="80" w:type="dxa"/>
-            </w:tcMar>
-          </w:tcPr>
-          <w:p>
-            <w:r>
-              <w:rPr>
-                <w:rFonts w:ascii="Arial" w:hAnsi="Arial"/>
-                <w:sz w:val="17"/>
-              </w:rPr>
-              <w:t>9.33</w:t>
-            </w:r>
-          </w:p>
-        </w:tc>
-        <w:tc>
-          <w:tcPr>
-            <w:tcW w:type="dxa" w:w="1337"/>
-            <w:shd w:fill="F9FAFB"/>
-            <w:tcMar>
-              <w:top w:w="60" w:type="dxa"/>
-              <w:bottom w:w="60" w:type="dxa"/>
-              <w:left w:w="80" w:type="dxa"/>
-              <w:right w:w="80" w:type="dxa"/>
-            </w:tcMar>
-          </w:tcPr>
-          <w:p>
-            <w:r>
-              <w:rPr>
-                <w:rFonts w:ascii="Arial" w:hAnsi="Arial"/>
-                <w:sz w:val="17"/>
-              </w:rPr>
-              <w:t>30.92</w:t>
-            </w:r>
-          </w:p>
-        </w:tc>
-      </w:tr>
-      <w:tr>
-        <w:tc>
-          <w:tcPr>
-            <w:tcW w:type="dxa" w:w="1337"/>
-            <w:shd w:fill="FFFFFF"/>
-            <w:tcMar>
-              <w:top w:w="60" w:type="dxa"/>
-              <w:bottom w:w="60" w:type="dxa"/>
-              <w:left w:w="80" w:type="dxa"/>
-              <w:right w:w="80" w:type="dxa"/>
-            </w:tcMar>
-          </w:tcPr>
-          <w:p>
-            <w:r>
-              <w:rPr>
-                <w:rFonts w:ascii="Arial" w:hAnsi="Arial"/>
-                <w:sz w:val="17"/>
-              </w:rPr>
-              <w:t>Level 4</w:t>
-            </w:r>
-          </w:p>
-        </w:tc>
-        <w:tc>
-          <w:tcPr>
-            <w:tcW w:type="dxa" w:w="1337"/>
-            <w:shd w:fill="FFFFFF"/>
-            <w:tcMar>
-              <w:top w:w="60" w:type="dxa"/>
-              <w:bottom w:w="60" w:type="dxa"/>
-              <w:left w:w="80" w:type="dxa"/>
-              <w:right w:w="80" w:type="dxa"/>
-            </w:tcMar>
-          </w:tcPr>
-          <w:p>
-            <w:r>
-              <w:rPr>
-                <w:rFonts w:ascii="Arial" w:hAnsi="Arial"/>
-                <w:sz w:val="17"/>
-              </w:rPr>
-              <w:t>Khối tách đôi &amp; Cầu</w:t>
-            </w:r>
-          </w:p>
-        </w:tc>
-        <w:tc>
-          <w:tcPr>
-            <w:tcW w:type="dxa" w:w="1337"/>
-            <w:shd w:fill="FFFFFF"/>
-            <w:tcMar>
-              <w:top w:w="60" w:type="dxa"/>
-              <w:bottom w:w="60" w:type="dxa"/>
-              <w:left w:w="80" w:type="dxa"/>
-              <w:right w:w="80" w:type="dxa"/>
-            </w:tcMar>
-          </w:tcPr>
-          <w:p>
-            <w:r>
-              <w:rPr>
-                <w:rFonts w:ascii="Arial" w:hAnsi="Arial"/>
-                <w:sz w:val="17"/>
-              </w:rPr>
-              <w:t>17</w:t>
-            </w:r>
-          </w:p>
-        </w:tc>
-        <w:tc>
-          <w:tcPr>
-            <w:tcW w:type="dxa" w:w="1337"/>
-            <w:shd w:fill="FFFFFF"/>
-            <w:tcMar>
-              <w:top w:w="60" w:type="dxa"/>
-              <w:bottom w:w="60" w:type="dxa"/>
-              <w:left w:w="80" w:type="dxa"/>
-              <w:right w:w="80" w:type="dxa"/>
-            </w:tcMar>
-          </w:tcPr>
-          <w:p>
-            <w:r>
-              <w:rPr>
-                <w:rFonts w:ascii="Arial" w:hAnsi="Arial"/>
-                <w:sz w:val="17"/>
-              </w:rPr>
-              <w:t>17.0</w:t>
-            </w:r>
-          </w:p>
-        </w:tc>
-        <w:tc>
-          <w:tcPr>
-            <w:tcW w:type="dxa" w:w="1337"/>
-            <w:shd w:fill="FFFFFF"/>
-            <w:tcMar>
-              <w:top w:w="60" w:type="dxa"/>
-              <w:bottom w:w="60" w:type="dxa"/>
-              <w:left w:w="80" w:type="dxa"/>
-              <w:right w:w="80" w:type="dxa"/>
-            </w:tcMar>
-          </w:tcPr>
-          <w:p>
-            <w:r>
-              <w:rPr>
-                <w:rFonts w:ascii="Arial" w:hAnsi="Arial"/>
-                <w:sz w:val="17"/>
-              </w:rPr>
-              <w:t>1,662</w:t>
-            </w:r>
-          </w:p>
-        </w:tc>
-        <w:tc>
-          <w:tcPr>
-            <w:tcW w:type="dxa" w:w="1337"/>
-            <w:shd w:fill="FFFFFF"/>
-            <w:tcMar>
-              <w:top w:w="60" w:type="dxa"/>
-              <w:bottom w:w="60" w:type="dxa"/>
-              <w:left w:w="80" w:type="dxa"/>
-              <w:right w:w="80" w:type="dxa"/>
-            </w:tcMar>
-          </w:tcPr>
-          <w:p>
-            <w:r>
-              <w:rPr>
-                <w:rFonts w:ascii="Arial" w:hAnsi="Arial"/>
-                <w:sz w:val="17"/>
-              </w:rPr>
-              <w:t>218.18</w:t>
-            </w:r>
-          </w:p>
-        </w:tc>
-        <w:tc>
-          <w:tcPr>
-            <w:tcW w:type="dxa" w:w="1337"/>
-            <w:shd w:fill="FFFFFF"/>
-            <w:tcMar>
-              <w:top w:w="60" w:type="dxa"/>
-              <w:bottom w:w="60" w:type="dxa"/>
-              <w:left w:w="80" w:type="dxa"/>
-              <w:right w:w="80" w:type="dxa"/>
-            </w:tcMar>
-          </w:tcPr>
-          <w:p>
-            <w:r>
-              <w:rPr>
-                <w:rFonts w:ascii="Arial" w:hAnsi="Arial"/>
-                <w:sz w:val="17"/>
-              </w:rPr>
-              <w:t>432.71</w:t>
-            </w:r>
-          </w:p>
-        </w:tc>
-      </w:tr>
-      <w:tr>
-        <w:tc>
-          <w:tcPr>
-            <w:tcW w:type="dxa" w:w="1337"/>
-            <w:shd w:fill="F9FAFB"/>
-            <w:tcMar>
-              <w:top w:w="60" w:type="dxa"/>
-              <w:bottom w:w="60" w:type="dxa"/>
-              <w:left w:w="80" w:type="dxa"/>
-              <w:right w:w="80" w:type="dxa"/>
-            </w:tcMar>
-          </w:tcPr>
-          <w:p>
-            <w:r>
-              <w:rPr>
-                <w:rFonts w:ascii="Arial" w:hAnsi="Arial"/>
-                <w:sz w:val="17"/>
-              </w:rPr>
-              <w:t>Level 8</w:t>
-            </w:r>
-          </w:p>
-        </w:tc>
-        <w:tc>
-          <w:tcPr>
-            <w:tcW w:type="dxa" w:w="1337"/>
-            <w:shd w:fill="F9FAFB"/>
-            <w:tcMar>
-              <w:top w:w="60" w:type="dxa"/>
-              <w:bottom w:w="60" w:type="dxa"/>
-              <w:left w:w="80" w:type="dxa"/>
-              <w:right w:w="80" w:type="dxa"/>
-            </w:tcMar>
-          </w:tcPr>
-          <w:p>
-            <w:r>
-              <w:rPr>
-                <w:rFonts w:ascii="Arial" w:hAnsi="Arial"/>
-                <w:sz w:val="17"/>
-              </w:rPr>
-              <w:t>Heavy switch đứng thẳng</w:t>
-            </w:r>
-          </w:p>
-        </w:tc>
-        <w:tc>
-          <w:tcPr>
-            <w:tcW w:type="dxa" w:w="1337"/>
-            <w:shd w:fill="F9FAFB"/>
-            <w:tcMar>
-              <w:top w:w="60" w:type="dxa"/>
-              <w:bottom w:w="60" w:type="dxa"/>
-              <w:left w:w="80" w:type="dxa"/>
-              <w:right w:w="80" w:type="dxa"/>
-            </w:tcMar>
-          </w:tcPr>
-          <w:p>
-            <w:r>
-              <w:rPr>
-                <w:rFonts w:ascii="Arial" w:hAnsi="Arial"/>
-                <w:sz w:val="17"/>
-              </w:rPr>
-              <w:t>17</w:t>
-            </w:r>
-          </w:p>
-        </w:tc>
-        <w:tc>
-          <w:tcPr>
-            <w:tcW w:type="dxa" w:w="1337"/>
-            <w:shd w:fill="F9FAFB"/>
-            <w:tcMar>
-              <w:top w:w="60" w:type="dxa"/>
-              <w:bottom w:w="60" w:type="dxa"/>
-              <w:left w:w="80" w:type="dxa"/>
-              <w:right w:w="80" w:type="dxa"/>
-            </w:tcMar>
-          </w:tcPr>
-          <w:p>
-            <w:r>
-              <w:rPr>
-                <w:rFonts w:ascii="Arial" w:hAnsi="Arial"/>
-                <w:sz w:val="17"/>
-              </w:rPr>
-              <w:t>17.0</w:t>
-            </w:r>
-          </w:p>
-        </w:tc>
-        <w:tc>
-          <w:tcPr>
-            <w:tcW w:type="dxa" w:w="1337"/>
-            <w:shd w:fill="F9FAFB"/>
-            <w:tcMar>
-              <w:top w:w="60" w:type="dxa"/>
-              <w:bottom w:w="60" w:type="dxa"/>
-              <w:left w:w="80" w:type="dxa"/>
-              <w:right w:w="80" w:type="dxa"/>
-            </w:tcMar>
-          </w:tcPr>
-          <w:p>
-            <w:r>
-              <w:rPr>
-                <w:rFonts w:ascii="Arial" w:hAnsi="Arial"/>
-                <w:sz w:val="17"/>
-              </w:rPr>
-              <w:t>147</w:t>
-            </w:r>
-          </w:p>
-        </w:tc>
-        <w:tc>
-          <w:tcPr>
-            <w:tcW w:type="dxa" w:w="1337"/>
-            <w:shd w:fill="F9FAFB"/>
-            <w:tcMar>
-              <w:top w:w="60" w:type="dxa"/>
-              <w:bottom w:w="60" w:type="dxa"/>
-              <w:left w:w="80" w:type="dxa"/>
-              <w:right w:w="80" w:type="dxa"/>
-            </w:tcMar>
-          </w:tcPr>
-          <w:p>
-            <w:r>
-              <w:rPr>
-                <w:rFonts w:ascii="Arial" w:hAnsi="Arial"/>
-                <w:sz w:val="17"/>
-              </w:rPr>
-              <w:t>13.53</w:t>
-            </w:r>
-          </w:p>
-        </w:tc>
-        <w:tc>
-          <w:tcPr>
-            <w:tcW w:type="dxa" w:w="1337"/>
-            <w:shd w:fill="F9FAFB"/>
-            <w:tcMar>
-              <w:top w:w="60" w:type="dxa"/>
-              <w:bottom w:w="60" w:type="dxa"/>
-              <w:left w:w="80" w:type="dxa"/>
-              <w:right w:w="80" w:type="dxa"/>
-            </w:tcMar>
-          </w:tcPr>
-          <w:p>
-            <w:r>
-              <w:rPr>
-                <w:rFonts w:ascii="Arial" w:hAnsi="Arial"/>
-                <w:sz w:val="17"/>
-              </w:rPr>
-              <w:t>27.07</w:t>
-            </w:r>
-          </w:p>
-        </w:tc>
-      </w:tr>
-      <w:tr>
-        <w:tc>
-          <w:tcPr>
-            <w:tcW w:type="dxa" w:w="1337"/>
-            <w:shd w:fill="FFFFFF"/>
-            <w:tcMar>
-              <w:top w:w="60" w:type="dxa"/>
-              <w:bottom w:w="60" w:type="dxa"/>
-              <w:left w:w="80" w:type="dxa"/>
-              <w:right w:w="80" w:type="dxa"/>
-            </w:tcMar>
-          </w:tcPr>
-          <w:p>
-            <w:r>
-              <w:rPr>
-                <w:rFonts w:ascii="Arial" w:hAnsi="Arial"/>
-                <w:sz w:val="17"/>
-              </w:rPr>
-              <w:t>Level 12</w:t>
-            </w:r>
-          </w:p>
-        </w:tc>
-        <w:tc>
-          <w:tcPr>
-            <w:tcW w:type="dxa" w:w="1337"/>
-            <w:shd w:fill="FFFFFF"/>
-            <w:tcMar>
-              <w:top w:w="60" w:type="dxa"/>
-              <w:bottom w:w="60" w:type="dxa"/>
-              <w:left w:w="80" w:type="dxa"/>
-              <w:right w:w="80" w:type="dxa"/>
-            </w:tcMar>
-          </w:tcPr>
-          <w:p>
-            <w:r>
-              <w:rPr>
-                <w:rFonts w:ascii="Arial" w:hAnsi="Arial"/>
-                <w:sz w:val="17"/>
-              </w:rPr>
-              <w:t>Hành lang dài kết thúc chuỗi</w:t>
-            </w:r>
-          </w:p>
-        </w:tc>
-        <w:tc>
-          <w:tcPr>
-            <w:tcW w:type="dxa" w:w="1337"/>
-            <w:shd w:fill="FFFFFF"/>
-            <w:tcMar>
-              <w:top w:w="60" w:type="dxa"/>
-              <w:bottom w:w="60" w:type="dxa"/>
-              <w:left w:w="80" w:type="dxa"/>
-              <w:right w:w="80" w:type="dxa"/>
-            </w:tcMar>
-          </w:tcPr>
-          <w:p>
-            <w:r>
-              <w:rPr>
-                <w:rFonts w:ascii="Arial" w:hAnsi="Arial"/>
-                <w:sz w:val="17"/>
-              </w:rPr>
-              <w:t>30</w:t>
-            </w:r>
-          </w:p>
-        </w:tc>
-        <w:tc>
-          <w:tcPr>
-            <w:tcW w:type="dxa" w:w="1337"/>
-            <w:shd w:fill="FFFFFF"/>
-            <w:tcMar>
-              <w:top w:w="60" w:type="dxa"/>
-              <w:bottom w:w="60" w:type="dxa"/>
-              <w:left w:w="80" w:type="dxa"/>
-              <w:right w:w="80" w:type="dxa"/>
-            </w:tcMar>
-          </w:tcPr>
-          <w:p>
-            <w:r>
-              <w:rPr>
-                <w:rFonts w:ascii="Arial" w:hAnsi="Arial"/>
-                <w:sz w:val="17"/>
-              </w:rPr>
-              <w:t>30.0</w:t>
-            </w:r>
-          </w:p>
-        </w:tc>
-        <w:tc>
-          <w:tcPr>
-            <w:tcW w:type="dxa" w:w="1337"/>
-            <w:shd w:fill="FFFFFF"/>
-            <w:tcMar>
-              <w:top w:w="60" w:type="dxa"/>
-              <w:bottom w:w="60" w:type="dxa"/>
-              <w:left w:w="80" w:type="dxa"/>
-              <w:right w:w="80" w:type="dxa"/>
-            </w:tcMar>
-          </w:tcPr>
-          <w:p>
-            <w:r>
-              <w:rPr>
-                <w:rFonts w:ascii="Arial" w:hAnsi="Arial"/>
-                <w:sz w:val="17"/>
-              </w:rPr>
-              <w:t>3,233</w:t>
-            </w:r>
-          </w:p>
-        </w:tc>
-        <w:tc>
-          <w:tcPr>
-            <w:tcW w:type="dxa" w:w="1337"/>
-            <w:shd w:fill="FFFFFF"/>
-            <w:tcMar>
-              <w:top w:w="60" w:type="dxa"/>
-              <w:bottom w:w="60" w:type="dxa"/>
-              <w:left w:w="80" w:type="dxa"/>
-              <w:right w:w="80" w:type="dxa"/>
-            </w:tcMar>
-          </w:tcPr>
-          <w:p>
-            <w:r>
-              <w:rPr>
-                <w:rFonts w:ascii="Arial" w:hAnsi="Arial"/>
-                <w:sz w:val="17"/>
-              </w:rPr>
-              <w:t>337.72</w:t>
-            </w:r>
-          </w:p>
-        </w:tc>
-        <w:tc>
-          <w:tcPr>
-            <w:tcW w:type="dxa" w:w="1337"/>
-            <w:shd w:fill="FFFFFF"/>
-            <w:tcMar>
-              <w:top w:w="60" w:type="dxa"/>
-              <w:bottom w:w="60" w:type="dxa"/>
-              <w:left w:w="80" w:type="dxa"/>
-              <w:right w:w="80" w:type="dxa"/>
-            </w:tcMar>
-          </w:tcPr>
-          <w:p>
-            <w:r>
-              <w:rPr>
-                <w:rFonts w:ascii="Arial" w:hAnsi="Arial"/>
-                <w:sz w:val="17"/>
-              </w:rPr>
-              <w:t>795.59</w:t>
-            </w:r>
-          </w:p>
-        </w:tc>
-      </w:tr>
-      <w:tr>
-        <w:tc>
-          <w:tcPr>
-            <w:tcW w:type="dxa" w:w="1337"/>
-            <w:shd w:fill="F9FAFB"/>
-            <w:tcMar>
-              <w:top w:w="60" w:type="dxa"/>
-              <w:bottom w:w="60" w:type="dxa"/>
-              <w:left w:w="80" w:type="dxa"/>
-              <w:right w:w="80" w:type="dxa"/>
-            </w:tcMar>
-          </w:tcPr>
-          <w:p>
-            <w:r>
-              <w:rPr>
-                <w:rFonts w:ascii="Arial" w:hAnsi="Arial"/>
-                <w:sz w:val="17"/>
-              </w:rPr>
-              <w:t>Level 17</w:t>
-            </w:r>
-          </w:p>
-        </w:tc>
-        <w:tc>
-          <w:tcPr>
-            <w:tcW w:type="dxa" w:w="1337"/>
-            <w:shd w:fill="F9FAFB"/>
-            <w:tcMar>
-              <w:top w:w="60" w:type="dxa"/>
-              <w:bottom w:w="60" w:type="dxa"/>
-              <w:left w:w="80" w:type="dxa"/>
-              <w:right w:w="80" w:type="dxa"/>
-            </w:tcMar>
-          </w:tcPr>
-          <w:p>
-            <w:r>
-              <w:rPr>
-                <w:rFonts w:ascii="Arial" w:hAnsi="Arial"/>
-                <w:sz w:val="17"/>
-              </w:rPr>
-              <w:t>Mê cung phân tách hẹp</w:t>
-            </w:r>
-          </w:p>
-        </w:tc>
-        <w:tc>
-          <w:tcPr>
-            <w:tcW w:type="dxa" w:w="1337"/>
-            <w:shd w:fill="F9FAFB"/>
-            <w:tcMar>
-              <w:top w:w="60" w:type="dxa"/>
-              <w:bottom w:w="60" w:type="dxa"/>
-              <w:left w:w="80" w:type="dxa"/>
-              <w:right w:w="80" w:type="dxa"/>
-            </w:tcMar>
-          </w:tcPr>
-          <w:p>
-            <w:r>
-              <w:rPr>
-                <w:rFonts w:ascii="Arial" w:hAnsi="Arial"/>
-                <w:sz w:val="17"/>
-              </w:rPr>
-              <w:t>24</w:t>
-            </w:r>
-          </w:p>
-        </w:tc>
-        <w:tc>
-          <w:tcPr>
-            <w:tcW w:type="dxa" w:w="1337"/>
-            <w:shd w:fill="F9FAFB"/>
-            <w:tcMar>
-              <w:top w:w="60" w:type="dxa"/>
-              <w:bottom w:w="60" w:type="dxa"/>
-              <w:left w:w="80" w:type="dxa"/>
-              <w:right w:w="80" w:type="dxa"/>
-            </w:tcMar>
-          </w:tcPr>
-          <w:p>
-            <w:r>
-              <w:rPr>
-                <w:rFonts w:ascii="Arial" w:hAnsi="Arial"/>
-                <w:sz w:val="17"/>
-              </w:rPr>
-              <w:t>24.0</w:t>
-            </w:r>
-          </w:p>
-        </w:tc>
-        <w:tc>
-          <w:tcPr>
-            <w:tcW w:type="dxa" w:w="1337"/>
-            <w:shd w:fill="F9FAFB"/>
-            <w:tcMar>
-              <w:top w:w="60" w:type="dxa"/>
-              <w:bottom w:w="60" w:type="dxa"/>
-              <w:left w:w="80" w:type="dxa"/>
-              <w:right w:w="80" w:type="dxa"/>
-            </w:tcMar>
-          </w:tcPr>
-          <w:p>
-            <w:r>
-              <w:rPr>
-                <w:rFonts w:ascii="Arial" w:hAnsi="Arial"/>
-                <w:sz w:val="17"/>
-              </w:rPr>
-              <w:t>2,978</w:t>
-            </w:r>
-          </w:p>
-        </w:tc>
-        <w:tc>
-          <w:tcPr>
-            <w:tcW w:type="dxa" w:w="1337"/>
-            <w:shd w:fill="F9FAFB"/>
-            <w:tcMar>
-              <w:top w:w="60" w:type="dxa"/>
-              <w:bottom w:w="60" w:type="dxa"/>
-              <w:left w:w="80" w:type="dxa"/>
-              <w:right w:w="80" w:type="dxa"/>
-            </w:tcMar>
-          </w:tcPr>
-          <w:p>
-            <w:r>
-              <w:rPr>
-                <w:rFonts w:ascii="Arial" w:hAnsi="Arial"/>
-                <w:sz w:val="17"/>
-              </w:rPr>
-              <w:t>276.78</w:t>
-            </w:r>
-          </w:p>
-        </w:tc>
-        <w:tc>
-          <w:tcPr>
-            <w:tcW w:type="dxa" w:w="1337"/>
-            <w:shd w:fill="F9FAFB"/>
-            <w:tcMar>
-              <w:top w:w="60" w:type="dxa"/>
-              <w:bottom w:w="60" w:type="dxa"/>
-              <w:left w:w="80" w:type="dxa"/>
-              <w:right w:w="80" w:type="dxa"/>
-            </w:tcMar>
-          </w:tcPr>
-          <w:p>
-            <w:r>
-              <w:rPr>
-                <w:rFonts w:ascii="Arial" w:hAnsi="Arial"/>
-                <w:sz w:val="17"/>
-              </w:rPr>
-              <w:t>725.77</w:t>
-            </w:r>
-          </w:p>
-        </w:tc>
-      </w:tr>
-      <w:tr>
-        <w:tc>
-          <w:tcPr>
-            <w:tcW w:type="dxa" w:w="1337"/>
-            <w:shd w:fill="FFFFFF"/>
-            <w:tcMar>
-              <w:top w:w="60" w:type="dxa"/>
-              <w:bottom w:w="60" w:type="dxa"/>
-              <w:left w:w="80" w:type="dxa"/>
-              <w:right w:w="80" w:type="dxa"/>
-            </w:tcMar>
-          </w:tcPr>
-          <w:p>
-            <w:r>
-              <w:rPr>
-                <w:rFonts w:ascii="Arial" w:hAnsi="Arial"/>
-                <w:sz w:val="17"/>
-              </w:rPr>
-              <w:t>Level 21</w:t>
-            </w:r>
-          </w:p>
-        </w:tc>
-        <w:tc>
-          <w:tcPr>
-            <w:tcW w:type="dxa" w:w="1337"/>
-            <w:shd w:fill="FFFFFF"/>
-            <w:tcMar>
-              <w:top w:w="60" w:type="dxa"/>
-              <w:bottom w:w="60" w:type="dxa"/>
-              <w:left w:w="80" w:type="dxa"/>
-              <w:right w:w="80" w:type="dxa"/>
-            </w:tcMar>
-          </w:tcPr>
-          <w:p>
-            <w:r>
-              <w:rPr>
-                <w:rFonts w:ascii="Arial" w:hAnsi="Arial"/>
-                <w:sz w:val="17"/>
-              </w:rPr>
-              <w:t>Vòng lặp kín</w:t>
-            </w:r>
-          </w:p>
-        </w:tc>
-        <w:tc>
-          <w:tcPr>
-            <w:tcW w:type="dxa" w:w="1337"/>
-            <w:shd w:fill="FFFFFF"/>
-            <w:tcMar>
-              <w:top w:w="60" w:type="dxa"/>
-              <w:bottom w:w="60" w:type="dxa"/>
-              <w:left w:w="80" w:type="dxa"/>
-              <w:right w:w="80" w:type="dxa"/>
-            </w:tcMar>
-          </w:tcPr>
-          <w:p>
-            <w:r>
-              <w:rPr>
-                <w:rFonts w:ascii="Arial" w:hAnsi="Arial"/>
-                <w:sz w:val="17"/>
-              </w:rPr>
-              <w:t>14</w:t>
-            </w:r>
-          </w:p>
-        </w:tc>
-        <w:tc>
-          <w:tcPr>
-            <w:tcW w:type="dxa" w:w="1337"/>
-            <w:shd w:fill="FFFFFF"/>
-            <w:tcMar>
-              <w:top w:w="60" w:type="dxa"/>
-              <w:bottom w:w="60" w:type="dxa"/>
-              <w:left w:w="80" w:type="dxa"/>
-              <w:right w:w="80" w:type="dxa"/>
-            </w:tcMar>
-          </w:tcPr>
-          <w:p>
-            <w:r>
-              <w:rPr>
-                <w:rFonts w:ascii="Arial" w:hAnsi="Arial"/>
-                <w:sz w:val="17"/>
-              </w:rPr>
-              <w:t>14.0</w:t>
-            </w:r>
-          </w:p>
-        </w:tc>
-        <w:tc>
-          <w:tcPr>
-            <w:tcW w:type="dxa" w:w="1337"/>
-            <w:shd w:fill="FFFFFF"/>
-            <w:tcMar>
-              <w:top w:w="60" w:type="dxa"/>
-              <w:bottom w:w="60" w:type="dxa"/>
-              <w:left w:w="80" w:type="dxa"/>
-              <w:right w:w="80" w:type="dxa"/>
-            </w:tcMar>
-          </w:tcPr>
-          <w:p>
-            <w:r>
-              <w:rPr>
-                <w:rFonts w:ascii="Arial" w:hAnsi="Arial"/>
-                <w:sz w:val="17"/>
-              </w:rPr>
-              <w:t>65</w:t>
-            </w:r>
-          </w:p>
-        </w:tc>
-        <w:tc>
-          <w:tcPr>
-            <w:tcW w:type="dxa" w:w="1337"/>
-            <w:shd w:fill="FFFFFF"/>
-            <w:tcMar>
-              <w:top w:w="60" w:type="dxa"/>
-              <w:bottom w:w="60" w:type="dxa"/>
-              <w:left w:w="80" w:type="dxa"/>
-              <w:right w:w="80" w:type="dxa"/>
-            </w:tcMar>
-          </w:tcPr>
-          <w:p>
-            <w:r>
-              <w:rPr>
-                <w:rFonts w:ascii="Arial" w:hAnsi="Arial"/>
-                <w:sz w:val="17"/>
-              </w:rPr>
-              <w:t>4.10</w:t>
-            </w:r>
-          </w:p>
-        </w:tc>
-        <w:tc>
-          <w:tcPr>
-            <w:tcW w:type="dxa" w:w="1337"/>
-            <w:shd w:fill="FFFFFF"/>
-            <w:tcMar>
-              <w:top w:w="60" w:type="dxa"/>
-              <w:bottom w:w="60" w:type="dxa"/>
-              <w:left w:w="80" w:type="dxa"/>
-              <w:right w:w="80" w:type="dxa"/>
-            </w:tcMar>
-          </w:tcPr>
-          <w:p>
-            <w:r>
-              <w:rPr>
-                <w:rFonts w:ascii="Arial" w:hAnsi="Arial"/>
-                <w:sz w:val="17"/>
-              </w:rPr>
-              <w:t>14.21</w:t>
-            </w:r>
-          </w:p>
-        </w:tc>
-      </w:tr>
-      <w:tr>
-        <w:tc>
-          <w:tcPr>
-            <w:tcW w:type="dxa" w:w="1337"/>
-            <w:shd w:fill="F9FAFB"/>
-            <w:tcMar>
-              <w:top w:w="60" w:type="dxa"/>
-              <w:bottom w:w="60" w:type="dxa"/>
-              <w:left w:w="80" w:type="dxa"/>
-              <w:right w:w="80" w:type="dxa"/>
-            </w:tcMar>
-          </w:tcPr>
-          <w:p>
-            <w:r>
-              <w:rPr>
-                <w:rFonts w:ascii="Arial" w:hAnsi="Arial"/>
-                <w:sz w:val="17"/>
-              </w:rPr>
-              <w:t>Level 32</w:t>
-            </w:r>
-          </w:p>
-        </w:tc>
-        <w:tc>
-          <w:tcPr>
-            <w:tcW w:type="dxa" w:w="1337"/>
-            <w:shd w:fill="F9FAFB"/>
-            <w:tcMar>
-              <w:top w:w="60" w:type="dxa"/>
-              <w:bottom w:w="60" w:type="dxa"/>
-              <w:left w:w="80" w:type="dxa"/>
-              <w:right w:w="80" w:type="dxa"/>
-            </w:tcMar>
-          </w:tcPr>
-          <w:p>
-            <w:r>
-              <w:rPr>
-                <w:rFonts w:ascii="Arial" w:hAnsi="Arial"/>
-                <w:sz w:val="17"/>
-              </w:rPr>
-              <w:t>Teleport chuỗi qua 64 cột trống</w:t>
-            </w:r>
-          </w:p>
-        </w:tc>
-        <w:tc>
-          <w:tcPr>
-            <w:tcW w:type="dxa" w:w="1337"/>
-            <w:shd w:fill="F9FAFB"/>
-            <w:tcMar>
-              <w:top w:w="60" w:type="dxa"/>
-              <w:bottom w:w="60" w:type="dxa"/>
-              <w:left w:w="80" w:type="dxa"/>
-              <w:right w:w="80" w:type="dxa"/>
-            </w:tcMar>
-          </w:tcPr>
-          <w:p>
-            <w:r>
-              <w:rPr>
-                <w:rFonts w:ascii="Arial" w:hAnsi="Arial"/>
-                <w:sz w:val="17"/>
-              </w:rPr>
-              <w:t>6</w:t>
-            </w:r>
-          </w:p>
-        </w:tc>
-        <w:tc>
-          <w:tcPr>
-            <w:tcW w:type="dxa" w:w="1337"/>
-            <w:shd w:fill="F9FAFB"/>
-            <w:tcMar>
-              <w:top w:w="60" w:type="dxa"/>
-              <w:bottom w:w="60" w:type="dxa"/>
-              <w:left w:w="80" w:type="dxa"/>
-              <w:right w:w="80" w:type="dxa"/>
-            </w:tcMar>
-          </w:tcPr>
-          <w:p>
-            <w:r>
-              <w:rPr>
-                <w:rFonts w:ascii="Arial" w:hAnsi="Arial"/>
-                <w:sz w:val="17"/>
-              </w:rPr>
-              <w:t>6.0</w:t>
-            </w:r>
-          </w:p>
-        </w:tc>
-        <w:tc>
-          <w:tcPr>
-            <w:tcW w:type="dxa" w:w="1337"/>
-            <w:shd w:fill="F9FAFB"/>
-            <w:tcMar>
-              <w:top w:w="60" w:type="dxa"/>
-              <w:bottom w:w="60" w:type="dxa"/>
-              <w:left w:w="80" w:type="dxa"/>
-              <w:right w:w="80" w:type="dxa"/>
-            </w:tcMar>
-          </w:tcPr>
-          <w:p>
-            <w:r>
-              <w:rPr>
-                <w:rFonts w:ascii="Arial" w:hAnsi="Arial"/>
-                <w:sz w:val="17"/>
-              </w:rPr>
-              <w:t>51</w:t>
-            </w:r>
-          </w:p>
-        </w:tc>
-        <w:tc>
-          <w:tcPr>
-            <w:tcW w:type="dxa" w:w="1337"/>
-            <w:shd w:fill="F9FAFB"/>
-            <w:tcMar>
-              <w:top w:w="60" w:type="dxa"/>
-              <w:bottom w:w="60" w:type="dxa"/>
-              <w:left w:w="80" w:type="dxa"/>
-              <w:right w:w="80" w:type="dxa"/>
-            </w:tcMar>
-          </w:tcPr>
-          <w:p>
-            <w:r>
-              <w:rPr>
-                <w:rFonts w:ascii="Arial" w:hAnsi="Arial"/>
-                <w:sz w:val="17"/>
-              </w:rPr>
-              <w:t>3.88</w:t>
-            </w:r>
-          </w:p>
-        </w:tc>
-        <w:tc>
-          <w:tcPr>
-            <w:tcW w:type="dxa" w:w="1337"/>
-            <w:shd w:fill="F9FAFB"/>
-            <w:tcMar>
-              <w:top w:w="60" w:type="dxa"/>
-              <w:bottom w:w="60" w:type="dxa"/>
-              <w:left w:w="80" w:type="dxa"/>
-              <w:right w:w="80" w:type="dxa"/>
-            </w:tcMar>
-          </w:tcPr>
-          <w:p>
-            <w:r>
-              <w:rPr>
-                <w:rFonts w:ascii="Arial" w:hAnsi="Arial"/>
-                <w:sz w:val="17"/>
-              </w:rPr>
-              <w:t>19.07</w:t>
-            </w:r>
-          </w:p>
-        </w:tc>
-      </w:tr>
-      <w:tr>
-        <w:tc>
-          <w:tcPr>
-            <w:tcW w:type="dxa" w:w="1337"/>
-            <w:shd w:fill="FFFFFF"/>
-            <w:tcMar>
-              <w:top w:w="60" w:type="dxa"/>
-              <w:bottom w:w="60" w:type="dxa"/>
-              <w:left w:w="80" w:type="dxa"/>
-              <w:right w:w="80" w:type="dxa"/>
-            </w:tcMar>
-          </w:tcPr>
-          <w:p>
-            <w:r>
-              <w:rPr>
-                <w:rFonts w:ascii="Arial" w:hAnsi="Arial"/>
-                <w:sz w:val="17"/>
-              </w:rPr>
-              <w:t>Level 33</w:t>
-            </w:r>
-          </w:p>
-        </w:tc>
-        <w:tc>
-          <w:tcPr>
-            <w:tcW w:type="dxa" w:w="1337"/>
-            <w:shd w:fill="FFFFFF"/>
-            <w:tcMar>
-              <w:top w:w="60" w:type="dxa"/>
-              <w:bottom w:w="60" w:type="dxa"/>
-              <w:left w:w="80" w:type="dxa"/>
-              <w:right w:w="80" w:type="dxa"/>
-            </w:tcMar>
-          </w:tcPr>
-          <w:p>
-            <w:r>
-              <w:rPr>
-                <w:rFonts w:ascii="Arial" w:hAnsi="Arial"/>
-                <w:sz w:val="17"/>
-              </w:rPr>
-              <w:t>Siêu mê cung 64 cổng phân tách</w:t>
-            </w:r>
-          </w:p>
-        </w:tc>
-        <w:tc>
-          <w:tcPr>
-            <w:tcW w:type="dxa" w:w="1337"/>
-            <w:shd w:fill="FFFFFF"/>
-            <w:tcMar>
-              <w:top w:w="60" w:type="dxa"/>
-              <w:bottom w:w="60" w:type="dxa"/>
-              <w:left w:w="80" w:type="dxa"/>
-              <w:right w:w="80" w:type="dxa"/>
-            </w:tcMar>
-          </w:tcPr>
-          <w:p>
-            <w:r>
-              <w:rPr>
-                <w:rFonts w:ascii="Arial" w:hAnsi="Arial"/>
-                <w:sz w:val="17"/>
-              </w:rPr>
-              <w:t>119</w:t>
-            </w:r>
-          </w:p>
-        </w:tc>
-        <w:tc>
-          <w:tcPr>
-            <w:tcW w:type="dxa" w:w="1337"/>
-            <w:shd w:fill="FFFFFF"/>
-            <w:tcMar>
-              <w:top w:w="60" w:type="dxa"/>
-              <w:bottom w:w="60" w:type="dxa"/>
-              <w:left w:w="80" w:type="dxa"/>
-              <w:right w:w="80" w:type="dxa"/>
-            </w:tcMar>
-          </w:tcPr>
-          <w:p>
-            <w:r>
-              <w:rPr>
-                <w:rFonts w:ascii="Arial" w:hAnsi="Arial"/>
-                <w:sz w:val="17"/>
-              </w:rPr>
-              <w:t>119.0</w:t>
-            </w:r>
-          </w:p>
-        </w:tc>
-        <w:tc>
-          <w:tcPr>
-            <w:tcW w:type="dxa" w:w="1337"/>
-            <w:shd w:fill="FFFFFF"/>
-            <w:tcMar>
-              <w:top w:w="60" w:type="dxa"/>
-              <w:bottom w:w="60" w:type="dxa"/>
-              <w:left w:w="80" w:type="dxa"/>
-              <w:right w:w="80" w:type="dxa"/>
-            </w:tcMar>
-          </w:tcPr>
-          <w:p>
-            <w:r>
-              <w:rPr>
-                <w:rFonts w:ascii="Arial" w:hAnsi="Arial"/>
-                <w:sz w:val="17"/>
-              </w:rPr>
-              <w:t>67,354</w:t>
-            </w:r>
-          </w:p>
-        </w:tc>
-        <w:tc>
-          <w:tcPr>
-            <w:tcW w:type="dxa" w:w="1337"/>
-            <w:shd w:fill="FFFFFF"/>
-            <w:tcMar>
-              <w:top w:w="60" w:type="dxa"/>
-              <w:bottom w:w="60" w:type="dxa"/>
-              <w:left w:w="80" w:type="dxa"/>
-              <w:right w:w="80" w:type="dxa"/>
-            </w:tcMar>
-          </w:tcPr>
-          <w:p>
-            <w:r>
-              <w:rPr>
-                <w:rFonts w:ascii="Arial" w:hAnsi="Arial"/>
-                <w:sz w:val="17"/>
-              </w:rPr>
-              <w:t>7,462.34</w:t>
-            </w:r>
-          </w:p>
-        </w:tc>
-        <w:tc>
-          <w:tcPr>
-            <w:tcW w:type="dxa" w:w="1337"/>
-            <w:shd w:fill="FFFFFF"/>
-            <w:tcMar>
-              <w:top w:w="60" w:type="dxa"/>
-              <w:bottom w:w="60" w:type="dxa"/>
-              <w:left w:w="80" w:type="dxa"/>
-              <w:right w:w="80" w:type="dxa"/>
-            </w:tcMar>
-          </w:tcPr>
-          <w:p>
-            <w:r>
-              <w:rPr>
-                <w:rFonts w:ascii="Arial" w:hAnsi="Arial"/>
-                <w:sz w:val="17"/>
-              </w:rPr>
-              <w:t>15,820.10</w:t>
-            </w:r>
-          </w:p>
-        </w:tc>
-      </w:tr>
-    </w:tbl>
-    <w:p>
-      <w:pPr>
-        <w:spacing w:before="40" w:after="60" w:line="276" w:lineRule="auto"/>
-      </w:pPr>
-    </w:p>
-    <w:p>
-      <w:pPr>
-        <w:spacing w:before="40" w:after="60" w:line="276" w:lineRule="auto"/>
-      </w:pPr>
-      <w:r>
-        <w:rPr>
-          <w:rFonts w:ascii="Arial" w:hAnsi="Arial"/>
-          <w:i w:val="0"/>
-          <w:sz w:val="20"/>
-        </w:rPr>
-        <w:t>Kết luận thực nghiệm: BFS giải quyết cực nhanh các màn chơi có độ sâu ngắn đến trung bình (d ≤ 20 tốn dưới 15 ms). Với các màn có độ sâu nghiệm lớn và số lượng cổng phân tách dày đặc (như Level 33 với d = 119), số node duyệt tăng lên đáng kể (67,354 node), phản ánh đúng hiện tượng bùng nổ tổ hợp của thuật toán tìm kiếm mù (uninformed search), nhưng vẫn đảm bảo tìm ra đường đi ngắn nhất tuyệt đối.</w:t>
-      </w:r>
-    </w:p>
-    <w:p>
-      <w:pPr>
-        <w:keepNext/>
-        <w:spacing w:before="280" w:after="80"/>
-      </w:pPr>
-      <w:r>
-        <w:rPr>
-          <w:rFonts w:ascii="Arial" w:hAnsi="Arial"/>
-          <w:b/>
-          <w:color w:val="102C57"/>
-          <w:sz w:val="26"/>
-        </w:rPr>
-        <w:t>8. Tài liệu tham khảo và Tuyên bố sử dụng AI (AI Disclosure)</w:t>
+        <w:t>7. Tài liệu tham khảo và Tuyên bố sử dụng AI (AI Disclosure)</w:t>
       </w:r>
     </w:p>
     <w:p>
@@ -4183,7 +2522,7 @@
           <w:color w:val="1E3C72"/>
           <w:sz w:val="23"/>
         </w:rPr>
-        <w:t>8.1. Tài liệu tham khảo</w:t>
+        <w:t>7.1. Tài liệu tham khảo</w:t>
       </w:r>
     </w:p>
     <w:p>
@@ -4236,17 +2575,9 @@
       <w:r>
         <w:rPr>
           <w:rFonts w:ascii="Arial" w:hAnsi="Arial"/>
-          <w:b/>
           <w:sz w:val="20"/>
         </w:rPr>
-        <w:t xml:space="preserve">• </w:t>
-      </w:r>
-      <w:r>
-        <w:rPr>
-          <w:rFonts w:ascii="Arial" w:hAnsi="Arial"/>
-          <w:sz w:val="20"/>
-        </w:rPr>
-        <w:t>Mã nguồn và tài liệu kiến trúc Bloxorz: Src/game_logic.py, Src/solvers/base.py, Src/tests/.</w:t>
+        <w:t>• Mã nguồn và tài liệu kiến trúc Bloxorz: Src/core/board.py, Src/solvers/member3_bfs.py, Src/solvers/base.py, Src/tests/.</w:t>
       </w:r>
     </w:p>
     <w:p>
@@ -4261,7 +2592,7 @@
           <w:color w:val="1E3C72"/>
           <w:sz w:val="23"/>
         </w:rPr>
-        <w:t>8.2. Kê khai minh bạch sử dụng công cụ AI (AI Disclosure)</w:t>
+        <w:t>7.2. Kê khai minh bạch sử dụng công cụ AI (AI Disclosure)</w:t>
       </w:r>
     </w:p>
     <w:p>

</xml_diff>

<commit_message>
docs(bfs): Cập nhập và bổ sung nội dung thuật toán BFS
</commit_message>
<xml_diff>
--- a/handoff/nam/BFS.docx
+++ b/handoff/nam/BFS.docx
@@ -4,32 +4,32 @@
   <w:body>
     <w:p>
       <w:pPr>
-        <w:spacing w:before="0" w:after="40"/>
+        <w:spacing w:before="0" w:after="80"/>
+        <w:jc w:val="center"/>
       </w:pPr>
       <w:r>
         <w:rPr>
-          <w:rFonts w:ascii="Arial" w:hAnsi="Arial"/>
+          <w:rFonts w:ascii="Times New Roman" w:hAnsi="Times New Roman"/>
           <w:b/>
-          <w:color w:val="102C57"/>
-          <w:sz w:val="28"/>
+          <w:color w:val="0F172A"/>
+          <w:sz w:val="32"/>
         </w:rPr>
         <w:t>BÁO CÁO GIẢI THUẬT TÌM KIẾM THEO CHIỀU RỘNG (BREADTH-FIRST SEARCH - BFS)</w:t>
       </w:r>
     </w:p>
     <w:p>
       <w:pPr>
-        <w:spacing w:after="160"/>
+        <w:spacing w:before="0" w:after="240"/>
+        <w:jc w:val="center"/>
       </w:pPr>
       <w:r>
         <w:rPr>
-          <w:rFonts w:ascii="Arial" w:hAnsi="Arial"/>
-          <w:b/>
-          <w:color w:val="2980B9"/>
+          <w:rFonts w:ascii="Times New Roman" w:hAnsi="Times New Roman"/>
+          <w:i/>
+          <w:color w:val="475569"/>
           <w:sz w:val="22"/>
         </w:rPr>
-        <w:t>HỌC PHẦN: CƠ SỞ TRÍ TUỆ NHÂN TẠO (CSC14003) — PROJECT 1: BLOXORZ SOLVER</w:t>
-        <w:br/>
-        <w:t>THÀNH VIÊN PHỤ TRÁCH: BÙI PHƯƠNG NAM (MSSV: 24120502)</w:t>
+        <w:t>NGUYÊN LÝ HOẠT ĐỘNG, MÃ GIẢ, MINH HỌA TRACE VÀ PHÂN TÍCH TÍNH TỐI ƯU</w:t>
       </w:r>
     </w:p>
     <w:tbl>
@@ -37,53 +37,50 @@
         <w:tblW w:type="auto" w:w="0"/>
         <w:jc w:val="center"/>
         <w:tblLook w:firstColumn="1" w:firstRow="1" w:lastColumn="0" w:lastRow="0" w:noHBand="0" w:noVBand="1" w:val="04A0"/>
+        <w:tblBorders>
+          <w:top w:val="none"/>
+          <w:bottom w:val="none"/>
+          <w:left w:val="single" w:sz="18" w:space="0" w:color="1D4ED8"/>
+          <w:right w:val="none"/>
+          <w:insideH w:val="none"/>
+          <w:insideV w:val="none"/>
+        </w:tblBorders>
       </w:tblPr>
       <w:tblGrid>
-        <w:gridCol w:w="4680"/>
-        <w:gridCol w:w="4680"/>
+        <w:gridCol w:w="9071"/>
       </w:tblGrid>
       <w:tr>
         <w:tc>
           <w:tcPr>
-            <w:tcW w:type="dxa" w:w="4680"/>
-            <w:shd w:fill="F2F4F7"/>
+            <w:tcW w:type="dxa" w:w="9071"/>
+            <w:shd w:fill="F8FAFC"/>
             <w:tcMar>
               <w:top w:w="60" w:type="dxa"/>
               <w:bottom w:w="60" w:type="dxa"/>
-              <w:left w:w="100" w:type="dxa"/>
-              <w:right w:w="100" w:type="dxa"/>
+              <w:left w:w="180" w:type="dxa"/>
+              <w:right w:w="140" w:type="dxa"/>
             </w:tcMar>
           </w:tcPr>
           <w:p>
+            <w:pPr>
+              <w:spacing w:before="0" w:after="0" w:line="276" w:lineRule="auto"/>
+            </w:pPr>
             <w:r>
               <w:rPr>
-                <w:rFonts w:ascii="Arial" w:hAnsi="Arial"/>
-                <w:color w:val="323232"/>
-                <w:sz w:val="18"/>
+                <w:rFonts w:ascii="Times New Roman" w:hAnsi="Times New Roman"/>
+                <w:b/>
+                <w:color w:val="1E293B"/>
+                <w:sz w:val="21"/>
               </w:rPr>
-              <w:t>Mã Nhiệm Vụ: N01</w:t>
+              <w:t xml:space="preserve">Học phần: </w:t>
             </w:r>
-          </w:p>
-        </w:tc>
-        <w:tc>
-          <w:tcPr>
-            <w:tcW w:type="dxa" w:w="4680"/>
-            <w:shd w:fill="F2F4F7"/>
-            <w:tcMar>
-              <w:top w:w="60" w:type="dxa"/>
-              <w:bottom w:w="60" w:type="dxa"/>
-              <w:left w:w="100" w:type="dxa"/>
-              <w:right w:w="100" w:type="dxa"/>
-            </w:tcMar>
-          </w:tcPr>
-          <w:p>
             <w:r>
               <w:rPr>
-                <w:rFonts w:ascii="Arial" w:hAnsi="Arial"/>
-                <w:color w:val="323232"/>
-                <w:sz w:val="18"/>
+                <w:rFonts w:ascii="Times New Roman" w:hAnsi="Times New Roman"/>
+                <w:color w:val="475569"/>
+                <w:sz w:val="21"/>
               </w:rPr>
-              <w:t>Người thực hiện: Bùi Phương Nam (MSSV: 24120502)</w:t>
+              <w:t>Cơ sở Trí tuệ Nhân tạo (CSC14003) — Project 1: Bloxorz Solver</w:t>
             </w:r>
           </w:p>
         </w:tc>
@@ -91,14 +88,580 @@
       <w:tr>
         <w:tc>
           <w:tcPr>
-            <w:tcW w:type="dxa" w:w="4680"/>
-            <w:shd w:fill="FFFFFF"/>
+            <w:tcW w:type="dxa" w:w="9071"/>
+            <w:shd w:fill="F8FAFC"/>
             <w:tcMar>
               <w:top w:w="60" w:type="dxa"/>
               <w:bottom w:w="60" w:type="dxa"/>
-              <w:left w:w="100" w:type="dxa"/>
-              <w:right w:w="100" w:type="dxa"/>
+              <w:left w:w="180" w:type="dxa"/>
+              <w:right w:w="140" w:type="dxa"/>
             </w:tcMar>
+          </w:tcPr>
+          <w:p>
+            <w:pPr>
+              <w:spacing w:before="0" w:after="0" w:line="276" w:lineRule="auto"/>
+            </w:pPr>
+            <w:r>
+              <w:rPr>
+                <w:rFonts w:ascii="Times New Roman" w:hAnsi="Times New Roman"/>
+                <w:b/>
+                <w:color w:val="1E293B"/>
+                <w:sz w:val="21"/>
+              </w:rPr>
+              <w:t xml:space="preserve">Sinh viên phụ trách: </w:t>
+            </w:r>
+            <w:r>
+              <w:rPr>
+                <w:rFonts w:ascii="Times New Roman" w:hAnsi="Times New Roman"/>
+                <w:color w:val="475569"/>
+                <w:sz w:val="21"/>
+              </w:rPr>
+              <w:t>Bùi Phương Nam (MSSV: 24120502) — Mã nhiệm vụ: N01</w:t>
+            </w:r>
+          </w:p>
+        </w:tc>
+      </w:tr>
+      <w:tr>
+        <w:tc>
+          <w:tcPr>
+            <w:tcW w:type="dxa" w:w="9071"/>
+            <w:shd w:fill="F8FAFC"/>
+            <w:tcMar>
+              <w:top w:w="60" w:type="dxa"/>
+              <w:bottom w:w="60" w:type="dxa"/>
+              <w:left w:w="180" w:type="dxa"/>
+              <w:right w:w="140" w:type="dxa"/>
+            </w:tcMar>
+          </w:tcPr>
+          <w:p>
+            <w:pPr>
+              <w:spacing w:before="0" w:after="0" w:line="276" w:lineRule="auto"/>
+            </w:pPr>
+            <w:r>
+              <w:rPr>
+                <w:rFonts w:ascii="Times New Roman" w:hAnsi="Times New Roman"/>
+                <w:b/>
+                <w:color w:val="1E293B"/>
+                <w:sz w:val="21"/>
+              </w:rPr>
+              <w:t xml:space="preserve">Cài đặt mã nguồn: </w:t>
+            </w:r>
+            <w:r>
+              <w:rPr>
+                <w:rFonts w:ascii="Times New Roman" w:hAnsi="Times New Roman"/>
+                <w:color w:val="475569"/>
+                <w:sz w:val="21"/>
+              </w:rPr>
+              <w:t>Src/solvers/member3_bfs.py</w:t>
+            </w:r>
+          </w:p>
+        </w:tc>
+      </w:tr>
+      <w:tr>
+        <w:tc>
+          <w:tcPr>
+            <w:tcW w:type="dxa" w:w="9071"/>
+            <w:shd w:fill="F8FAFC"/>
+            <w:tcMar>
+              <w:top w:w="60" w:type="dxa"/>
+              <w:bottom w:w="60" w:type="dxa"/>
+              <w:left w:w="180" w:type="dxa"/>
+              <w:right w:w="140" w:type="dxa"/>
+            </w:tcMar>
+          </w:tcPr>
+          <w:p>
+            <w:pPr>
+              <w:spacing w:before="0" w:after="0" w:line="276" w:lineRule="auto"/>
+            </w:pPr>
+            <w:r>
+              <w:rPr>
+                <w:rFonts w:ascii="Times New Roman" w:hAnsi="Times New Roman"/>
+                <w:b/>
+                <w:color w:val="1E293B"/>
+                <w:sz w:val="21"/>
+              </w:rPr>
+              <w:t xml:space="preserve">Tích hợp báo cáo nhóm: </w:t>
+            </w:r>
+            <w:r>
+              <w:rPr>
+                <w:rFonts w:ascii="Times New Roman" w:hAnsi="Times New Roman"/>
+                <w:color w:val="475569"/>
+                <w:sz w:val="21"/>
+              </w:rPr>
+              <w:t>Mục 4.2 Báo cáo tổng thể nhóm (Report.docx)</w:t>
+            </w:r>
+          </w:p>
+        </w:tc>
+      </w:tr>
+      <w:tr>
+        <w:tc>
+          <w:tcPr>
+            <w:tcW w:type="dxa" w:w="9071"/>
+            <w:shd w:fill="F8FAFC"/>
+            <w:tcMar>
+              <w:top w:w="60" w:type="dxa"/>
+              <w:bottom w:w="60" w:type="dxa"/>
+              <w:left w:w="180" w:type="dxa"/>
+              <w:right w:w="140" w:type="dxa"/>
+            </w:tcMar>
+          </w:tcPr>
+          <w:p>
+            <w:pPr>
+              <w:spacing w:before="0" w:after="0" w:line="276" w:lineRule="auto"/>
+            </w:pPr>
+            <w:r>
+              <w:rPr>
+                <w:rFonts w:ascii="Times New Roman" w:hAnsi="Times New Roman"/>
+                <w:b/>
+                <w:color w:val="1E293B"/>
+                <w:sz w:val="21"/>
+              </w:rPr>
+              <w:t xml:space="preserve">Trạng thái nghiệm thu: </w:t>
+            </w:r>
+            <w:r>
+              <w:rPr>
+                <w:rFonts w:ascii="Times New Roman" w:hAnsi="Times New Roman"/>
+                <w:color w:val="475569"/>
+                <w:sz w:val="21"/>
+              </w:rPr>
+              <w:t>Đã kiểm thử pass 100% test case, tích hợp profiler đo đạc thực nghiệm</w:t>
+            </w:r>
+          </w:p>
+        </w:tc>
+      </w:tr>
+    </w:tbl>
+    <w:p>
+      <w:pPr>
+        <w:spacing w:before="0" w:after="160"/>
+      </w:pPr>
+    </w:p>
+    <w:p>
+      <w:pPr>
+        <w:keepNext/>
+        <w:spacing w:before="280" w:after="80"/>
+      </w:pPr>
+      <w:r>
+        <w:rPr>
+          <w:rFonts w:ascii="Times New Roman" w:hAnsi="Times New Roman"/>
+          <w:b/>
+          <w:color w:val="0F172A"/>
+          <w:sz w:val="28"/>
+        </w:rPr>
+        <w:t>1. Nguyên lý và Cơ chế hoạt động của BFS trong Bloxorz</w:t>
+      </w:r>
+    </w:p>
+    <w:p>
+      <w:pPr>
+        <w:spacing w:before="0" w:after="80" w:line="288" w:lineRule="auto"/>
+      </w:pPr>
+      <w:r>
+        <w:rPr>
+          <w:rFonts w:ascii="Times New Roman" w:hAnsi="Times New Roman"/>
+          <w:i w:val="0"/>
+          <w:color w:val="1E293B"/>
+          <w:sz w:val="24"/>
+        </w:rPr>
+        <w:t>Thuật toán Tìm kiếm theo chiều rộng (Breadth-First Search - BFS) được cài đặt nhằm giải quyết bài toán tìm kiếm đường đi ít hành động lăn khối nhất từ vị trí xuất phát đến ô đích trong trò chơi Bloxorz. Trong mã nguồn Src/solvers/member3_bfs.py, thuật toán vận hành theo mô hình Graph-Search dựa trên 4 cơ chế trụ cột:</w:t>
+      </w:r>
+    </w:p>
+    <w:p>
+      <w:pPr>
+        <w:pStyle w:val="ListBullet"/>
+        <w:spacing w:before="0" w:after="60" w:line="288" w:lineRule="auto"/>
+      </w:pPr>
+      <w:r>
+        <w:rPr>
+          <w:rFonts w:ascii="Times New Roman" w:hAnsi="Times New Roman"/>
+          <w:b/>
+          <w:sz w:val="24"/>
+        </w:rPr>
+        <w:t xml:space="preserve">Hàng đợi FIFO (Queue): </w:t>
+      </w:r>
+      <w:r>
+        <w:rPr>
+          <w:rFonts w:ascii="Times New Roman" w:hAnsi="Times New Roman"/>
+          <w:color w:val="1E293B"/>
+          <w:sz w:val="24"/>
+        </w:rPr>
+        <w:t>Quản lý tập biên (frontier) bằng cấu trúc hàng đợi hai đầu hiệu năng cao collections.deque. Thuật toán luôn lấy trạng thái ở đầu hàng đợi (current = queue.popleft()) và đưa các trạng thái con mới sinh ra vào cuối hàng đợi (queue.append(nxt)), bảo đảm không gian trạng thái luôn được duyệt cạn theo từng mức chiều sâu d = 0, 1, 2, …</w:t>
+      </w:r>
+    </w:p>
+    <w:p>
+      <w:pPr>
+        <w:pStyle w:val="ListBullet"/>
+        <w:spacing w:before="0" w:after="60" w:line="288" w:lineRule="auto"/>
+      </w:pPr>
+      <w:r>
+        <w:rPr>
+          <w:rFonts w:ascii="Times New Roman" w:hAnsi="Times New Roman"/>
+          <w:b/>
+          <w:sz w:val="24"/>
+        </w:rPr>
+        <w:t xml:space="preserve">Đánh dấu trạng thái lúc phát hiện (Mark upon Generation): </w:t>
+      </w:r>
+      <w:r>
+        <w:rPr>
+          <w:rFonts w:ascii="Times New Roman" w:hAnsi="Times New Roman"/>
+          <w:color w:val="1E293B"/>
+          <w:sz w:val="24"/>
+        </w:rPr>
+        <w:t>Khác với cách tiếp cận đánh dấu khi lấy ra khỏi hàng đợi (mark upon expansion), thuật toán ghi nhận trạng thái kế tiếp nxt vào bảng băm parent ngay tại thời điểm nó vừa được sinh ra từ trạng thái hiện tại. Kỹ thuật này giúp loại bỏ ngay lập tức các trạng thái trùng lặp phát sinh từ các nhánh khác nhau, ngăn chặn triệt để hiện tượng đưa nhiều lần cùng một trạng thái vào hàng đợi, qua đó tiết kiệm đáng kể dung lượng bộ nhớ RAM.</w:t>
+      </w:r>
+    </w:p>
+    <w:p>
+      <w:pPr>
+        <w:pStyle w:val="ListBullet"/>
+        <w:spacing w:before="0" w:after="60" w:line="288" w:lineRule="auto"/>
+      </w:pPr>
+      <w:r>
+        <w:rPr>
+          <w:rFonts w:ascii="Times New Roman" w:hAnsi="Times New Roman"/>
+          <w:b/>
+          <w:sz w:val="24"/>
+        </w:rPr>
+        <w:t xml:space="preserve">Kiểm tra đích sớm (Early Goal Test): </w:t>
+      </w:r>
+      <w:r>
+        <w:rPr>
+          <w:rFonts w:ascii="Times New Roman" w:hAnsi="Times New Roman"/>
+          <w:color w:val="1E293B"/>
+          <w:sz w:val="24"/>
+        </w:rPr>
+        <w:t>Thuật toán gồm hai tầng kiểm tra đích: kiểm tra ngay start_state khi bắt đầu (nếu xuất phát trùng đích thì trả về kết quả ngay với 0 bước); và kiểm tra điều kiện is_goal ngay khi một trạng thái kế tiếp nxt vừa được sinh ra trong vòng lặp. Do chi phí mỗi bước đi trong BFS là đồng nhất (w = 1), việc kiểm tra đích tại thời điểm sinh node giúp thuật toán dừng ngay mà không cần phải nạp và mở rộng thêm một tầng con cháu kế tiếp vào hàng đợi.</w:t>
+      </w:r>
+    </w:p>
+    <w:p>
+      <w:pPr>
+        <w:pStyle w:val="ListBullet"/>
+        <w:spacing w:before="0" w:after="60" w:line="288" w:lineRule="auto"/>
+      </w:pPr>
+      <w:r>
+        <w:rPr>
+          <w:rFonts w:ascii="Times New Roman" w:hAnsi="Times New Roman"/>
+          <w:b/>
+          <w:sz w:val="24"/>
+        </w:rPr>
+        <w:t xml:space="preserve">Bảng truy vết cha (Parent Map) và Truy vết nghiệm: </w:t>
+      </w:r>
+      <w:r>
+        <w:rPr>
+          <w:rFonts w:ascii="Times New Roman" w:hAnsi="Times New Roman"/>
+          <w:color w:val="1E293B"/>
+          <w:sz w:val="24"/>
+        </w:rPr>
+        <w:t>Từ điển parent: Dict[State, Tuple[State, str]] đảm nhận đồng thời hai nhiệm vụ: vừa là tập đóng (visited set) để chống lặp chu trình, vừa lưu vết con trỏ cha–hành động tương ứng. Khi chạm đích tại trạng thái nxt, thuật toán lần ngược con trỏ từ nxt về trạng thái gốc start_state, tích lũy các hành động vào mảng và thực hiện đảo ngược mảng (moves.reverse()) để xuất ra lộ trình hành động tối ưu.</w:t>
+      </w:r>
+    </w:p>
+    <w:p>
+      <w:pPr>
+        <w:keepNext/>
+        <w:spacing w:before="280" w:after="80"/>
+      </w:pPr>
+      <w:r>
+        <w:rPr>
+          <w:rFonts w:ascii="Times New Roman" w:hAnsi="Times New Roman"/>
+          <w:b/>
+          <w:color w:val="0F172A"/>
+          <w:sz w:val="28"/>
+        </w:rPr>
+        <w:t>2. Mã giả thuật toán BFS (member3_bfs.py)</w:t>
+      </w:r>
+    </w:p>
+    <w:p>
+      <w:pPr>
+        <w:spacing w:before="0" w:after="80" w:line="288" w:lineRule="auto"/>
+      </w:pPr>
+      <w:r>
+        <w:rPr>
+          <w:rFonts w:ascii="Times New Roman" w:hAnsi="Times New Roman"/>
+          <w:i w:val="0"/>
+          <w:color w:val="1E293B"/>
+          <w:sz w:val="24"/>
+        </w:rPr>
+        <w:t>Mã giả thuật toán BFS bám sát mã nguồn cài đặt thực tế:</w:t>
+      </w:r>
+    </w:p>
+    <w:tbl>
+      <w:tblPr>
+        <w:tblW w:type="auto" w:w="0"/>
+        <w:jc w:val="center"/>
+        <w:tblLook w:firstColumn="1" w:firstRow="1" w:lastColumn="0" w:lastRow="0" w:noHBand="0" w:noVBand="1" w:val="04A0"/>
+        <w:tblBorders>
+          <w:top w:val="single" w:sz="6" w:space="0" w:color="CBD5E1"/>
+          <w:bottom w:val="single" w:sz="6" w:space="0" w:color="CBD5E1"/>
+          <w:left w:val="none"/>
+          <w:right w:val="none"/>
+          <w:insideH w:val="single" w:sz="4" w:space="0" w:color="CBD5E1"/>
+          <w:insideV w:val="none"/>
+        </w:tblBorders>
+      </w:tblPr>
+      <w:tblGrid>
+        <w:gridCol w:w="9071"/>
+      </w:tblGrid>
+      <w:tr>
+        <w:tc>
+          <w:tcPr>
+            <w:tcW w:type="dxa" w:w="9071"/>
+            <w:shd w:fill="F1F5F9"/>
+            <w:tcMar>
+              <w:top w:w="100" w:type="dxa"/>
+              <w:bottom w:w="100" w:type="dxa"/>
+              <w:left w:w="150" w:type="dxa"/>
+              <w:right w:w="150" w:type="dxa"/>
+            </w:tcMar>
+          </w:tcPr>
+          <w:p>
+            <w:pPr>
+              <w:spacing w:before="0" w:after="0" w:line="276" w:lineRule="auto"/>
+            </w:pPr>
+            <w:r>
+              <w:rPr>
+                <w:rFonts w:ascii="Consolas" w:hAnsi="Consolas"/>
+                <w:color w:val="0F172A"/>
+                <w:sz w:val="19"/>
+              </w:rPr>
+              <w:t>Algorithm BFS_Bloxorz(board):</w:t>
+              <w:br/>
+              <w:t xml:space="preserve">    start_state ← board.get_initial_state()</w:t>
+              <w:br/>
+              <w:t xml:space="preserve">    if board.is_goal(start_state) then:</w:t>
+              <w:br/>
+              <w:t xml:space="preserve">        return {found: True, moves: [], expanded_nodes: 0, total_cost: 0}</w:t>
+              <w:br/>
+              <w:br/>
+              <w:t xml:space="preserve">    Q ← new FIFOQueue()</w:t>
+              <w:br/>
+              <w:t xml:space="preserve">    ENQUEUE(Q, start_state)</w:t>
+              <w:br/>
+              <w:t xml:space="preserve">    parent ← new Dictionary()  // parent[start_state] ← null</w:t>
+              <w:br/>
+              <w:t xml:space="preserve">    parent[start_state] ← null</w:t>
+              <w:br/>
+              <w:t xml:space="preserve">    expanded_nodes ← 0</w:t>
+              <w:br/>
+              <w:br/>
+              <w:t xml:space="preserve">    while Q is not empty do:</w:t>
+              <w:br/>
+              <w:t xml:space="preserve">        current ← DEQUEUE(Q)</w:t>
+              <w:br/>
+              <w:t xml:space="preserve">        expanded_nodes ← expanded_nodes + 1</w:t>
+              <w:br/>
+              <w:br/>
+              <w:t xml:space="preserve">        for each (action, nxt) in board.get_successors(current) do:</w:t>
+              <w:br/>
+              <w:t xml:space="preserve">            if nxt not in parent then:</w:t>
+              <w:br/>
+              <w:t xml:space="preserve">                parent[nxt] ← (current, action)</w:t>
+              <w:br/>
+              <w:t xml:space="preserve">                if board.is_goal(nxt) then:  // Kiểm tra đích sớm</w:t>
+              <w:br/>
+              <w:t xml:space="preserve">                    return ReconstructPath(parent, nxt, expanded_nodes)</w:t>
+              <w:br/>
+              <w:t xml:space="preserve">                ENQUEUE(Q, nxt)</w:t>
+              <w:br/>
+              <w:br/>
+              <w:t xml:space="preserve">    return {found: False, moves: [], expanded_nodes: expanded_nodes, total_cost: 0}</w:t>
+            </w:r>
+          </w:p>
+        </w:tc>
+      </w:tr>
+    </w:tbl>
+    <w:p>
+      <w:pPr>
+        <w:spacing w:before="0" w:after="80"/>
+      </w:pPr>
+    </w:p>
+    <w:p>
+      <w:pPr>
+        <w:keepNext/>
+        <w:spacing w:before="280" w:after="80"/>
+      </w:pPr>
+      <w:r>
+        <w:rPr>
+          <w:rFonts w:ascii="Times New Roman" w:hAnsi="Times New Roman"/>
+          <w:b/>
+          <w:color w:val="0F172A"/>
+          <w:sz w:val="28"/>
+        </w:rPr>
+        <w:t>3. Ví dụ minh họa quá trình duyệt và truy vết (Trace Walkthrough)</w:t>
+      </w:r>
+    </w:p>
+    <w:p>
+      <w:pPr>
+        <w:spacing w:before="0" w:after="80" w:line="288" w:lineRule="auto"/>
+      </w:pPr>
+      <w:r>
+        <w:rPr>
+          <w:rFonts w:ascii="Times New Roman" w:hAnsi="Times New Roman"/>
+          <w:i w:val="0"/>
+          <w:color w:val="1E293B"/>
+          <w:sz w:val="24"/>
+        </w:rPr>
+        <w:t>Để minh họa trực quan cách thức hoạt động của thuật toán, xét kịch bản bàn cờ nhỏ (Test 5): Khối hộp bắt đầu tại ô (1, 1) ở tư thế đứng S0(1, 1, STANDING), ô đích nằm thẳng hàng tại ô (1, 4), yêu cầu 2 bước lăn sang phải để về đích:</w:t>
+      </w:r>
+    </w:p>
+    <w:tbl>
+      <w:tblPr>
+        <w:tblW w:type="auto" w:w="0"/>
+        <w:jc w:val="center"/>
+        <w:tblLook w:firstColumn="1" w:firstRow="1" w:lastColumn="0" w:lastRow="0" w:noHBand="0" w:noVBand="1" w:val="04A0"/>
+        <w:tblBorders>
+          <w:top w:val="single" w:sz="6" w:space="0" w:color="CBD5E1"/>
+          <w:bottom w:val="single" w:sz="6" w:space="0" w:color="CBD5E1"/>
+          <w:left w:val="none"/>
+          <w:right w:val="none"/>
+          <w:insideH w:val="single" w:sz="4" w:space="0" w:color="E2E8F0"/>
+          <w:insideV w:val="none"/>
+        </w:tblBorders>
+      </w:tblPr>
+      <w:tblGrid>
+        <w:gridCol w:w="1814"/>
+        <w:gridCol w:w="1814"/>
+        <w:gridCol w:w="1814"/>
+        <w:gridCol w:w="1814"/>
+        <w:gridCol w:w="1814"/>
+      </w:tblGrid>
+      <w:tr>
+        <w:tc>
+          <w:tcPr>
+            <w:tcW w:type="dxa" w:w="1152"/>
+            <w:shd w:fill="E2E8F0"/>
+            <w:tcMar>
+              <w:top w:w="100" w:type="dxa"/>
+              <w:bottom w:w="100" w:type="dxa"/>
+              <w:left w:w="120" w:type="dxa"/>
+              <w:right w:w="120" w:type="dxa"/>
+            </w:tcMar>
+            <w:vAlign w:val="center"/>
+          </w:tcPr>
+          <w:p>
+            <w:pPr>
+              <w:spacing w:before="0" w:after="0" w:line="276" w:lineRule="auto"/>
+            </w:pPr>
+            <w:r>
+              <w:rPr>
+                <w:rFonts w:ascii="Times New Roman" w:hAnsi="Times New Roman"/>
+                <w:b/>
+                <w:color w:val="0F172A"/>
+                <w:sz w:val="22"/>
+              </w:rPr>
+              <w:t>Bước</w:t>
+            </w:r>
+          </w:p>
+        </w:tc>
+        <w:tc>
+          <w:tcPr>
+            <w:tcW w:type="dxa" w:w="1728"/>
+            <w:shd w:fill="E2E8F0"/>
+            <w:tcMar>
+              <w:top w:w="100" w:type="dxa"/>
+              <w:bottom w:w="100" w:type="dxa"/>
+              <w:left w:w="120" w:type="dxa"/>
+              <w:right w:w="120" w:type="dxa"/>
+            </w:tcMar>
+            <w:vAlign w:val="center"/>
+          </w:tcPr>
+          <w:p>
+            <w:pPr>
+              <w:spacing w:before="0" w:after="0" w:line="276" w:lineRule="auto"/>
+            </w:pPr>
+            <w:r>
+              <w:rPr>
+                <w:rFonts w:ascii="Times New Roman" w:hAnsi="Times New Roman"/>
+                <w:b/>
+                <w:color w:val="0F172A"/>
+                <w:sz w:val="22"/>
+              </w:rPr>
+              <w:t>Hàng đợi Frontier Q</w:t>
+            </w:r>
+          </w:p>
+        </w:tc>
+        <w:tc>
+          <w:tcPr>
+            <w:tcW w:type="dxa" w:w="2160"/>
+            <w:shd w:fill="E2E8F0"/>
+            <w:tcMar>
+              <w:top w:w="100" w:type="dxa"/>
+              <w:bottom w:w="100" w:type="dxa"/>
+              <w:left w:w="120" w:type="dxa"/>
+              <w:right w:w="120" w:type="dxa"/>
+            </w:tcMar>
+            <w:vAlign w:val="center"/>
+          </w:tcPr>
+          <w:p>
+            <w:pPr>
+              <w:spacing w:before="0" w:after="0" w:line="276" w:lineRule="auto"/>
+            </w:pPr>
+            <w:r>
+              <w:rPr>
+                <w:rFonts w:ascii="Times New Roman" w:hAnsi="Times New Roman"/>
+                <w:b/>
+                <w:color w:val="0F172A"/>
+                <w:sz w:val="22"/>
+              </w:rPr>
+              <w:t>Node mở rộng</w:t>
+            </w:r>
+          </w:p>
+        </w:tc>
+        <w:tc>
+          <w:tcPr>
+            <w:tcW w:type="dxa" w:w="2592"/>
+            <w:shd w:fill="E2E8F0"/>
+            <w:tcMar>
+              <w:top w:w="100" w:type="dxa"/>
+              <w:bottom w:w="100" w:type="dxa"/>
+              <w:left w:w="120" w:type="dxa"/>
+              <w:right w:w="120" w:type="dxa"/>
+            </w:tcMar>
+            <w:vAlign w:val="center"/>
+          </w:tcPr>
+          <w:p>
+            <w:pPr>
+              <w:spacing w:before="0" w:after="0" w:line="276" w:lineRule="auto"/>
+            </w:pPr>
+            <w:r>
+              <w:rPr>
+                <w:rFonts w:ascii="Times New Roman" w:hAnsi="Times New Roman"/>
+                <w:b/>
+                <w:color w:val="0F172A"/>
+                <w:sz w:val="22"/>
+              </w:rPr>
+              <w:t>Các trạng thái con nxt sinh ra</w:t>
+            </w:r>
+          </w:p>
+        </w:tc>
+        <w:tc>
+          <w:tcPr>
+            <w:tcW w:type="dxa" w:w="2160"/>
+            <w:shd w:fill="E2E8F0"/>
+            <w:tcMar>
+              <w:top w:w="100" w:type="dxa"/>
+              <w:bottom w:w="100" w:type="dxa"/>
+              <w:left w:w="120" w:type="dxa"/>
+              <w:right w:w="120" w:type="dxa"/>
+            </w:tcMar>
+            <w:vAlign w:val="center"/>
+          </w:tcPr>
+          <w:p>
+            <w:pPr>
+              <w:spacing w:before="0" w:after="0" w:line="276" w:lineRule="auto"/>
+            </w:pPr>
+            <w:r>
+              <w:rPr>
+                <w:rFonts w:ascii="Times New Roman" w:hAnsi="Times New Roman"/>
+                <w:b/>
+                <w:color w:val="0F172A"/>
+                <w:sz w:val="22"/>
+              </w:rPr>
+              <w:t>Cập nhật parent</w:t>
+            </w:r>
+          </w:p>
+        </w:tc>
+      </w:tr>
+      <w:tr>
+        <w:tc>
+          <w:tcPr>
+            <w:tcW w:type="dxa" w:w="1152"/>
             <w:tcMar>
               <w:top w:w="80" w:type="dxa"/>
               <w:bottom w:w="80" w:type="dxa"/>
@@ -109,602 +672,13 @@
           </w:tcPr>
           <w:p>
             <w:pPr>
-              <w:spacing w:before="60" w:after="60" w:line="276" w:lineRule="auto"/>
-              <w:jc w:val="left"/>
+              <w:spacing w:before="0" w:after="0" w:line="276" w:lineRule="auto"/>
             </w:pPr>
             <w:r>
               <w:rPr>
-                <w:rFonts w:ascii="Arial" w:hAnsi="Arial"/>
-                <w:b/>
-                <w:i w:val="0"/>
-                <w:color w:val="333333"/>
-                <w:sz w:val="18"/>
-              </w:rPr>
-              <w:t>File mã nguồn: Src/solvers/member3_bfs.py, Src/core/board.py</w:t>
-            </w:r>
-          </w:p>
-        </w:tc>
-        <w:tc>
-          <w:tcPr>
-            <w:tcW w:type="dxa" w:w="4680"/>
-            <w:shd w:fill="FFFFFF"/>
-            <w:tcMar>
-              <w:top w:w="60" w:type="dxa"/>
-              <w:bottom w:w="60" w:type="dxa"/>
-              <w:left w:w="100" w:type="dxa"/>
-              <w:right w:w="100" w:type="dxa"/>
-            </w:tcMar>
-          </w:tcPr>
-          <w:p>
-            <w:r>
-              <w:rPr>
-                <w:rFonts w:ascii="Arial" w:hAnsi="Arial"/>
-                <w:color w:val="323232"/>
-                <w:sz w:val="18"/>
-              </w:rPr>
-              <w:t>Nhánh làm việc: work/nam-report</w:t>
-            </w:r>
-          </w:p>
-        </w:tc>
-      </w:tr>
-      <w:tr>
-        <w:tc>
-          <w:tcPr>
-            <w:tcW w:type="dxa" w:w="4680"/>
-            <w:shd w:fill="F2F4F7"/>
-            <w:tcMar>
-              <w:top w:w="60" w:type="dxa"/>
-              <w:bottom w:w="60" w:type="dxa"/>
-              <w:left w:w="100" w:type="dxa"/>
-              <w:right w:w="100" w:type="dxa"/>
-            </w:tcMar>
-          </w:tcPr>
-          <w:p>
-            <w:r>
-              <w:rPr>
-                <w:rFonts w:ascii="Arial" w:hAnsi="Arial"/>
-                <w:color w:val="323232"/>
-                <w:sz w:val="18"/>
-              </w:rPr>
-              <w:t>Người kiểm duyệt: Cả nhóm (Thức, Phúc, Thiện, Quân)</w:t>
-            </w:r>
-          </w:p>
-        </w:tc>
-        <w:tc>
-          <w:tcPr>
-            <w:tcW w:type="dxa" w:w="4680"/>
-            <w:shd w:fill="F2F4F7"/>
-            <w:tcMar>
-              <w:top w:w="60" w:type="dxa"/>
-              <w:bottom w:w="60" w:type="dxa"/>
-              <w:left w:w="100" w:type="dxa"/>
-              <w:right w:w="100" w:type="dxa"/>
-            </w:tcMar>
-          </w:tcPr>
-          <w:p>
-            <w:r>
-              <w:rPr>
-                <w:rFonts w:ascii="Arial" w:hAnsi="Arial"/>
-                <w:color w:val="323232"/>
-                <w:sz w:val="18"/>
-              </w:rPr>
-              <w:t>Thời điểm bàn giao: Tháng 10/2026</w:t>
-            </w:r>
-          </w:p>
-        </w:tc>
-      </w:tr>
-    </w:tbl>
-    <w:p>
-      <w:pPr>
-        <w:spacing w:after="80"/>
-      </w:pPr>
-    </w:p>
-    <w:p>
-      <w:pPr>
-        <w:keepNext/>
-        <w:spacing w:before="280" w:after="80"/>
-      </w:pPr>
-      <w:r>
-        <w:rPr>
-          <w:rFonts w:ascii="Arial" w:hAnsi="Arial"/>
-          <w:b/>
-          <w:color w:val="102C57"/>
-          <w:sz w:val="26"/>
-        </w:rPr>
-        <w:t>1. Nguyên lý và Cơ chế hoạt động của BFS trong Bloxorz</w:t>
-      </w:r>
-    </w:p>
-    <w:p>
-      <w:pPr>
-        <w:spacing w:before="40" w:after="60" w:line="276" w:lineRule="auto"/>
-      </w:pPr>
-      <w:r>
-        <w:rPr>
-          <w:rFonts w:ascii="Arial" w:hAnsi="Arial"/>
-          <w:i w:val="0"/>
-          <w:sz w:val="20"/>
-        </w:rPr>
-        <w:t>Thuật toán Tìm kiếm theo chiều rộng (Breadth-First Search - BFS) được lựa chọn để giải quyết bài toán tìm kiếm đường đi ít hành động nhất từ vị trí xuất phát đến ô đích trong trò chơi Bloxorz. Trong mã nguồn Src/solvers/member3_bfs.py, thuật toán vận hành theo mô hình Graph-Search dựa trên 4 cơ chế trụ cột:</w:t>
-      </w:r>
-    </w:p>
-    <w:p>
-      <w:pPr>
-        <w:spacing w:before="20" w:after="40" w:line="276" w:lineRule="auto"/>
-        <w:ind w:left="360"/>
-      </w:pPr>
-      <w:r>
-        <w:rPr>
-          <w:rFonts w:ascii="Arial" w:hAnsi="Arial"/>
-          <w:b/>
-          <w:sz w:val="20"/>
-        </w:rPr>
-        <w:t xml:space="preserve">• </w:t>
-      </w:r>
-      <w:r>
-        <w:rPr>
-          <w:rFonts w:ascii="Arial" w:hAnsi="Arial"/>
-          <w:b/>
-          <w:sz w:val="20"/>
-        </w:rPr>
-        <w:t xml:space="preserve">Hàng đợi FIFO (Queue): </w:t>
-      </w:r>
-      <w:r>
-        <w:rPr>
-          <w:rFonts w:ascii="Arial" w:hAnsi="Arial"/>
-          <w:sz w:val="20"/>
-        </w:rPr>
-        <w:t>Quản lý tập biên (frontier) bằng cấu trúc hàng đợi hai đầu hiệu năng cao collections.deque. Thuật toán luôn lấy trạng thái ở đầu hàng đợi (current = queue.popleft()) và đưa các trạng thái con mới sinh ra vào cuối hàng đợi (queue.append(nxt)), bảo đảm không gian trạng thái luôn được duyệt cạn theo từng mức chiều sâu d = 0, 1, 2, ...</w:t>
-      </w:r>
-    </w:p>
-    <w:p>
-      <w:pPr>
-        <w:spacing w:before="20" w:after="40" w:line="276" w:lineRule="auto"/>
-        <w:ind w:left="360"/>
-      </w:pPr>
-      <w:r>
-        <w:rPr>
-          <w:rFonts w:ascii="Arial" w:hAnsi="Arial"/>
-          <w:b/>
-          <w:sz w:val="20"/>
-        </w:rPr>
-        <w:t xml:space="preserve">• </w:t>
-      </w:r>
-      <w:r>
-        <w:rPr>
-          <w:rFonts w:ascii="Arial" w:hAnsi="Arial"/>
-          <w:b/>
-          <w:sz w:val="20"/>
-        </w:rPr>
-        <w:t xml:space="preserve">Đánh dấu trạng thái lúc phát hiện (Mark upon Generation): </w:t>
-      </w:r>
-      <w:r>
-        <w:rPr>
-          <w:rFonts w:ascii="Arial" w:hAnsi="Arial"/>
-          <w:sz w:val="20"/>
-        </w:rPr>
-        <w:t>Khác với cách tiếp cận đánh dấu khi lấy ra khỏi hàng đợi (mark upon expansion), thuật toán ghi nhận trạng thái kế tiếp nxt vào bảng băm parent ngay tại thời điểm nó vừa được sinh ra từ trạng thái hiện tại. Kỹ thuật này giúp loại bỏ ngay lập tức các trạng thái trùng lặp phát sinh từ các nhánh khác nhau, ngăn chặn triệt để hiện tượng đưa nhiều lần cùng một trạng thái vào hàng đợi, qua đó tiết kiệm đáng kể dung lượng bộ nhớ RAM.</w:t>
-      </w:r>
-    </w:p>
-    <w:p>
-      <w:pPr>
-        <w:spacing w:before="20" w:after="40" w:line="276" w:lineRule="auto"/>
-        <w:ind w:left="360"/>
-      </w:pPr>
-      <w:r>
-        <w:rPr>
-          <w:rFonts w:ascii="Arial" w:hAnsi="Arial"/>
-          <w:b/>
-          <w:sz w:val="20"/>
-        </w:rPr>
-        <w:t xml:space="preserve">• </w:t>
-      </w:r>
-      <w:r>
-        <w:rPr>
-          <w:rFonts w:ascii="Arial" w:hAnsi="Arial"/>
-          <w:b/>
-          <w:sz w:val="20"/>
-        </w:rPr>
-        <w:t xml:space="preserve">Kiểm tra đích sớm (Early Goal Test): </w:t>
-      </w:r>
-      <w:r>
-        <w:rPr>
-          <w:rFonts w:ascii="Arial" w:hAnsi="Arial"/>
-          <w:sz w:val="20"/>
-        </w:rPr>
-        <w:t>Thuật toán gồm hai tầng kiểm tra đích:</w:t>
-        <w:br/>
-        <w:t>• Xử lý ca biên đặc biệt: Kiểm tra ngay trạng thái ban đầu (start_state). Nếu vị trí bắt đầu trùng ngay đích, thuật toán trả về kết quả ngay lập tức với 0 bước đi và 0 node mở rộng.</w:t>
-        <w:br/>
-        <w:t>• Kiểm tra đích sớm (Early Goal Test): Trong vòng lặp duyệt trạng thái con, kiểm tra điều kiện thắng ngay khi một trạng thái kế tiếp vừa được sinh ra (if board.is_goal(nxt): ...). Do chi phí mỗi bước đi trong BFS là đồng nhất (w = 1), việc kiểm tra đích tại thời điểm sinh node giúp thuật toán dừng ngay mà không cần phải nạp và mở rộng thêm một tầng con cháu kế tiếp vào hàng đợi.</w:t>
-      </w:r>
-    </w:p>
-    <w:p>
-      <w:pPr>
-        <w:spacing w:before="20" w:after="40" w:line="276" w:lineRule="auto"/>
-        <w:ind w:left="360"/>
-      </w:pPr>
-      <w:r>
-        <w:rPr>
-          <w:rFonts w:ascii="Arial" w:hAnsi="Arial"/>
-          <w:b/>
-          <w:sz w:val="20"/>
-        </w:rPr>
-        <w:t xml:space="preserve">• </w:t>
-      </w:r>
-      <w:r>
-        <w:rPr>
-          <w:rFonts w:ascii="Arial" w:hAnsi="Arial"/>
-          <w:b/>
-          <w:sz w:val="20"/>
-        </w:rPr>
-        <w:t xml:space="preserve">Bảng vết cha (Parent Map) và Truy vết nghiệm: </w:t>
-      </w:r>
-      <w:r>
-        <w:rPr>
-          <w:rFonts w:ascii="Arial" w:hAnsi="Arial"/>
-          <w:sz w:val="20"/>
-        </w:rPr>
-        <w:t>Từ điển parent: Dict[State, Tuple[State, str]] đảm nhận đồng thời hai nhiệm vụ: vừa là tập đóng (visited set) để chống lặp chu trình, vừa lưu vết con trỏ cha–hành động tương ứng. Khi chạm đích tại trạng thái nxt, thuật toán lần ngược con trỏ từ nxt về trạng thái gốc start_state, tích lũy các hành động vào mảng và thực hiện đảo ngược mảng (moves.reverse()) để xuất ra lộ trình hành động chính xác.</w:t>
-      </w:r>
-    </w:p>
-    <w:p>
-      <w:pPr>
-        <w:keepNext/>
-        <w:spacing w:before="280" w:after="80"/>
-      </w:pPr>
-      <w:r>
-        <w:rPr>
-          <w:rFonts w:ascii="Arial" w:hAnsi="Arial"/>
-          <w:b/>
-          <w:color w:val="102C57"/>
-          <w:sz w:val="26"/>
-        </w:rPr>
-        <w:t>2. Mã giả thuật toán (Pseudocode)</w:t>
-      </w:r>
-    </w:p>
-    <w:p>
-      <w:pPr>
-        <w:spacing w:before="40" w:after="60" w:line="276" w:lineRule="auto"/>
-      </w:pPr>
-      <w:r>
-        <w:rPr>
-          <w:rFonts w:ascii="Arial" w:hAnsi="Arial"/>
-          <w:i w:val="0"/>
-          <w:sz w:val="20"/>
-        </w:rPr>
-        <w:t>Mã giả thuật toán BFS dưới đây bám sát từng dòng mã nguồn cài đặt trong file member3_bfs.py:</w:t>
-      </w:r>
-    </w:p>
-    <w:tbl>
-      <w:tblPr>
-        <w:tblW w:type="auto" w:w="0"/>
-        <w:jc w:val="center"/>
-        <w:tblLook w:firstColumn="1" w:firstRow="1" w:lastColumn="0" w:lastRow="0" w:noHBand="0" w:noVBand="1" w:val="04A0"/>
-      </w:tblPr>
-      <w:tblGrid>
-        <w:gridCol w:w="9360"/>
-      </w:tblGrid>
-      <w:tr>
-        <w:tc>
-          <w:tcPr>
-            <w:tcW w:type="dxa" w:w="9360"/>
-            <w:shd w:fill="F8F9FA"/>
-            <w:tcMar>
-              <w:top w:w="100" w:type="dxa"/>
-              <w:bottom w:w="100" w:type="dxa"/>
-              <w:left w:w="140" w:type="dxa"/>
-              <w:right w:w="140" w:type="dxa"/>
-            </w:tcMar>
-          </w:tcPr>
-          <w:p>
-            <w:pPr>
-              <w:spacing w:line="252" w:lineRule="auto"/>
-            </w:pPr>
-            <w:r>
-              <w:rPr>
-                <w:rFonts w:ascii="Consolas" w:hAnsi="Consolas"/>
-                <w:color w:val="212529"/>
-                <w:sz w:val="17"/>
-              </w:rPr>
-              <w:t>Algorithm BFS_Bloxorz(board):</w:t>
-              <w:br/>
-              <w:t xml:space="preserve">    Input:  Bàn cờ Bloxorz board với trạng thái xuất phát và ô đích</w:t>
-              <w:br/>
-              <w:t xml:space="preserve">    Output: Cấu trúc kết quả {found, moves, expanded_nodes, total_cost}</w:t>
-              <w:br/>
-              <w:br/>
-              <w:t xml:space="preserve">    start_state ← board.get_initial_state()</w:t>
-              <w:br/>
-              <w:br/>
-              <w:t xml:space="preserve">    // 1. Kiểm tra trường hợp biên (vị trí xuất phát đã là đích)</w:t>
-              <w:br/>
-              <w:t xml:space="preserve">    if board.is_goal(start_state) then:</w:t>
-              <w:br/>
-              <w:t xml:space="preserve">        return {found: True, moves: [], expanded_nodes: 0, total_cost: 0}</w:t>
-              <w:br/>
-              <w:br/>
-              <w:t xml:space="preserve">    // 2. Khởi tạo hàng đợi FIFO và bảng vết cha</w:t>
-              <w:br/>
-              <w:t xml:space="preserve">    Q ← new FIFOQueue()</w:t>
-              <w:br/>
-              <w:t xml:space="preserve">    ENQUEUE(Q, start_state)</w:t>
-              <w:br/>
-              <w:t xml:space="preserve">    parent ← new Dictionary()        // Ánh xạ: state → (prev_state, action)</w:t>
-              <w:br/>
-              <w:t xml:space="preserve">    parent[start_state] ← null</w:t>
-              <w:br/>
-              <w:t xml:space="preserve">    expanded_nodes ← 0</w:t>
-              <w:br/>
-              <w:br/>
-              <w:t xml:space="preserve">    // 3. Vòng lặp duyệt theo tầng</w:t>
-              <w:br/>
-              <w:t xml:space="preserve">    while Q is not empty do:</w:t>
-              <w:br/>
-              <w:t xml:space="preserve">        current_state ← DEQUEUE(Q)</w:t>
-              <w:br/>
-              <w:t xml:space="preserve">        expanded_nodes ← expanded_nodes + 1</w:t>
-              <w:br/>
-              <w:br/>
-              <w:t xml:space="preserve">        for each (action, next_state) in board.get_successors(current_state) do:</w:t>
-              <w:br/>
-              <w:t xml:space="preserve">            // Bỏ qua nếu trạng thái đã từng được phát hiện trước đó</w:t>
-              <w:br/>
-              <w:t xml:space="preserve">            if next_state is in parent then:</w:t>
-              <w:br/>
-              <w:t xml:space="preserve">                continue</w:t>
-              <w:br/>
-              <w:br/>
-              <w:t xml:space="preserve">            // Đánh dấu phát hiện và ghi nhận con trỏ vết cha</w:t>
-              <w:br/>
-              <w:t xml:space="preserve">            parent[next_state] ← (current_state, action)</w:t>
-              <w:br/>
-              <w:br/>
-              <w:t xml:space="preserve">            // Early Goal Test: Kiểm tra đích ngay khi sinh node</w:t>
-              <w:br/>
-              <w:t xml:space="preserve">            if board.is_goal(next_state) then:</w:t>
-              <w:br/>
-              <w:t xml:space="preserve">                moves ← []</w:t>
-              <w:br/>
-              <w:t xml:space="preserve">                curr ← next_state</w:t>
-              <w:br/>
-              <w:t xml:space="preserve">                while parent[curr] ≠ null do:</w:t>
-              <w:br/>
-              <w:t xml:space="preserve">                    (curr, act) ← parent[curr]</w:t>
-              <w:br/>
-              <w:t xml:space="preserve">                    APPEND(moves, act)</w:t>
-              <w:br/>
-              <w:t xml:space="preserve">                REVERSE(moves)</w:t>
-              <w:br/>
-              <w:t xml:space="preserve">                return {</w:t>
-              <w:br/>
-              <w:t xml:space="preserve">                    found: True, </w:t>
-              <w:br/>
-              <w:t xml:space="preserve">                    moves: moves, </w:t>
-              <w:br/>
-              <w:t xml:space="preserve">                    expanded_nodes: expanded_nodes, </w:t>
-              <w:br/>
-              <w:t xml:space="preserve">                    total_cost: LENGTH(moves)</w:t>
-              <w:br/>
-              <w:t xml:space="preserve">                }</w:t>
-              <w:br/>
-              <w:br/>
-              <w:t xml:space="preserve">            // Đưa trạng thái mới phát hiện vào hàng đợi</w:t>
-              <w:br/>
-              <w:t xml:space="preserve">            ENQUEUE(Q, next_state)</w:t>
-              <w:br/>
-              <w:br/>
-              <w:t xml:space="preserve">    // 4. Hàng đợi rỗng mà không tới được đích (Bài toán vô nghiệm)</w:t>
-              <w:br/>
-              <w:t xml:space="preserve">    return {found: False, moves: [], expanded_nodes: expanded_nodes, total_cost: 0}</w:t>
-            </w:r>
-          </w:p>
-        </w:tc>
-      </w:tr>
-    </w:tbl>
-    <w:p>
-      <w:pPr>
-        <w:spacing w:after="40"/>
-      </w:pPr>
-    </w:p>
-    <w:p>
-      <w:pPr>
-        <w:keepNext/>
-        <w:spacing w:before="280" w:after="80"/>
-      </w:pPr>
-      <w:r>
-        <w:rPr>
-          <w:rFonts w:ascii="Arial" w:hAnsi="Arial"/>
-          <w:b/>
-          <w:color w:val="102C57"/>
-          <w:sz w:val="26"/>
-        </w:rPr>
-        <w:t>3. Ví dụ minh họa quá trình duyệt và truy vết (Trace Walkthrough)</w:t>
-      </w:r>
-    </w:p>
-    <w:p>
-      <w:pPr>
-        <w:spacing w:before="40" w:after="60" w:line="276" w:lineRule="auto"/>
-      </w:pPr>
-      <w:r>
-        <w:rPr>
-          <w:rFonts w:ascii="Arial" w:hAnsi="Arial"/>
-          <w:i w:val="0"/>
-          <w:sz w:val="20"/>
-        </w:rPr>
-        <w:t>Để minh họa trực quan cách thức hoạt động của thuật toán, xét kịch bản bàn cờ nhỏ (Test 5): Khối hộp bắt đầu tại ô (1, 1) ở tư thế đứng S0(1, 1, STANDING), ô đích nằm thẳng hàng tại ô (1, 4), yêu cầu 2 bước lăn sang phải để về đích:</w:t>
-      </w:r>
-    </w:p>
-    <w:tbl>
-      <w:tblPr>
-        <w:tblW w:type="auto" w:w="0"/>
-        <w:jc w:val="center"/>
-        <w:tblLook w:firstColumn="1" w:firstRow="1" w:lastColumn="0" w:lastRow="0" w:noHBand="0" w:noVBand="1" w:val="04A0"/>
-      </w:tblPr>
-      <w:tblGrid>
-        <w:gridCol w:w="1560"/>
-        <w:gridCol w:w="1560"/>
-        <w:gridCol w:w="1560"/>
-        <w:gridCol w:w="1560"/>
-        <w:gridCol w:w="1560"/>
-        <w:gridCol w:w="1560"/>
-      </w:tblGrid>
-      <w:tr>
-        <w:tc>
-          <w:tcPr>
-            <w:tcW w:type="dxa" w:w="1560"/>
-            <w:shd w:fill="1E3C72"/>
-            <w:tcMar>
-              <w:top w:w="80" w:type="dxa"/>
-              <w:bottom w:w="80" w:type="dxa"/>
-              <w:left w:w="100" w:type="dxa"/>
-              <w:right w:w="100" w:type="dxa"/>
-            </w:tcMar>
-          </w:tcPr>
-          <w:p>
-            <w:r>
-              <w:rPr>
-                <w:rFonts w:ascii="Arial" w:hAnsi="Arial"/>
-                <w:b/>
-                <w:color w:val="FFFFFF"/>
-                <w:sz w:val="18"/>
-              </w:rPr>
-              <w:t>Bước</w:t>
-            </w:r>
-          </w:p>
-        </w:tc>
-        <w:tc>
-          <w:tcPr>
-            <w:tcW w:type="dxa" w:w="1560"/>
-            <w:shd w:fill="1E3C72"/>
-            <w:tcMar>
-              <w:top w:w="80" w:type="dxa"/>
-              <w:bottom w:w="80" w:type="dxa"/>
-              <w:left w:w="100" w:type="dxa"/>
-              <w:right w:w="100" w:type="dxa"/>
-            </w:tcMar>
-          </w:tcPr>
-          <w:p>
-            <w:r>
-              <w:rPr>
-                <w:rFonts w:ascii="Arial" w:hAnsi="Arial"/>
-                <w:b/>
-                <w:color w:val="FFFFFF"/>
-                <w:sz w:val="18"/>
-              </w:rPr>
-              <w:t>Lấy ra từ Q (current)</w:t>
-            </w:r>
-          </w:p>
-        </w:tc>
-        <w:tc>
-          <w:tcPr>
-            <w:tcW w:type="dxa" w:w="1560"/>
-            <w:shd w:fill="1E3C72"/>
-            <w:tcMar>
-              <w:top w:w="80" w:type="dxa"/>
-              <w:bottom w:w="80" w:type="dxa"/>
-              <w:left w:w="100" w:type="dxa"/>
-              <w:right w:w="100" w:type="dxa"/>
-            </w:tcMar>
-          </w:tcPr>
-          <w:p>
-            <w:r>
-              <w:rPr>
-                <w:rFonts w:ascii="Arial" w:hAnsi="Arial"/>
-                <w:b/>
-                <w:color w:val="FFFFFF"/>
-                <w:sz w:val="18"/>
-              </w:rPr>
-              <w:t>Hành động</w:t>
-            </w:r>
-          </w:p>
-        </w:tc>
-        <w:tc>
-          <w:tcPr>
-            <w:tcW w:type="dxa" w:w="1560"/>
-            <w:shd w:fill="1E3C72"/>
-            <w:tcMar>
-              <w:top w:w="80" w:type="dxa"/>
-              <w:bottom w:w="80" w:type="dxa"/>
-              <w:left w:w="100" w:type="dxa"/>
-              <w:right w:w="100" w:type="dxa"/>
-            </w:tcMar>
-          </w:tcPr>
-          <w:p>
-            <w:r>
-              <w:rPr>
-                <w:rFonts w:ascii="Arial" w:hAnsi="Arial"/>
-                <w:b/>
-                <w:color w:val="FFFFFF"/>
-                <w:sz w:val="18"/>
-              </w:rPr>
-              <w:t>Node con sinh ra (nxt)</w:t>
-            </w:r>
-          </w:p>
-        </w:tc>
-        <w:tc>
-          <w:tcPr>
-            <w:tcW w:type="dxa" w:w="1560"/>
-            <w:shd w:fill="1E3C72"/>
-            <w:tcMar>
-              <w:top w:w="80" w:type="dxa"/>
-              <w:bottom w:w="80" w:type="dxa"/>
-              <w:left w:w="100" w:type="dxa"/>
-              <w:right w:w="100" w:type="dxa"/>
-            </w:tcMar>
-          </w:tcPr>
-          <w:p>
-            <w:r>
-              <w:rPr>
-                <w:rFonts w:ascii="Arial" w:hAnsi="Arial"/>
-                <w:b/>
-                <w:color w:val="FFFFFF"/>
-                <w:sz w:val="18"/>
-              </w:rPr>
-              <w:t>Cập nhật parent</w:t>
-            </w:r>
-          </w:p>
-        </w:tc>
-        <w:tc>
-          <w:tcPr>
-            <w:tcW w:type="dxa" w:w="1560"/>
-            <w:shd w:fill="1E3C72"/>
-            <w:tcMar>
-              <w:top w:w="80" w:type="dxa"/>
-              <w:bottom w:w="80" w:type="dxa"/>
-              <w:left w:w="100" w:type="dxa"/>
-              <w:right w:w="100" w:type="dxa"/>
-            </w:tcMar>
-          </w:tcPr>
-          <w:p>
-            <w:r>
-              <w:rPr>
-                <w:rFonts w:ascii="Arial" w:hAnsi="Arial"/>
-                <w:b/>
-                <w:color w:val="FFFFFF"/>
-                <w:sz w:val="18"/>
-              </w:rPr>
-              <w:t>Trạng thái Q</w:t>
-            </w:r>
-          </w:p>
-        </w:tc>
-      </w:tr>
-      <w:tr>
-        <w:tc>
-          <w:tcPr>
-            <w:tcW w:type="dxa" w:w="1560"/>
-            <w:shd w:fill="F9FAFB"/>
-            <w:tcMar>
-              <w:top w:w="60" w:type="dxa"/>
-              <w:bottom w:w="60" w:type="dxa"/>
-              <w:left w:w="80" w:type="dxa"/>
-              <w:right w:w="80" w:type="dxa"/>
-            </w:tcMar>
-          </w:tcPr>
-          <w:p>
-            <w:r>
-              <w:rPr>
-                <w:rFonts w:ascii="Arial" w:hAnsi="Arial"/>
-                <w:sz w:val="17"/>
+                <w:rFonts w:ascii="Times New Roman" w:hAnsi="Times New Roman"/>
+                <w:color w:val="1E293B"/>
+                <w:sz w:val="21"/>
               </w:rPr>
               <w:t>0</w:t>
             </w:r>
@@ -712,1026 +686,7 @@
         </w:tc>
         <w:tc>
           <w:tcPr>
-            <w:tcW w:type="dxa" w:w="1560"/>
-            <w:shd w:fill="F9FAFB"/>
-            <w:tcMar>
-              <w:top w:w="60" w:type="dxa"/>
-              <w:bottom w:w="60" w:type="dxa"/>
-              <w:left w:w="80" w:type="dxa"/>
-              <w:right w:w="80" w:type="dxa"/>
-            </w:tcMar>
-          </w:tcPr>
-          <w:p>
-            <w:r>
-              <w:rPr>
-                <w:rFonts w:ascii="Arial" w:hAnsi="Arial"/>
-                <w:sz w:val="17"/>
-              </w:rPr>
-              <w:t>Khởi tạo</w:t>
-            </w:r>
-          </w:p>
-        </w:tc>
-        <w:tc>
-          <w:tcPr>
-            <w:tcW w:type="dxa" w:w="1560"/>
-            <w:shd w:fill="F9FAFB"/>
-            <w:tcMar>
-              <w:top w:w="60" w:type="dxa"/>
-              <w:bottom w:w="60" w:type="dxa"/>
-              <w:left w:w="80" w:type="dxa"/>
-              <w:right w:w="80" w:type="dxa"/>
-            </w:tcMar>
-          </w:tcPr>
-          <w:p>
-            <w:r>
-              <w:rPr>
-                <w:rFonts w:ascii="Arial" w:hAnsi="Arial"/>
-                <w:sz w:val="17"/>
-              </w:rPr>
-              <w:t>—</w:t>
-            </w:r>
-          </w:p>
-        </w:tc>
-        <w:tc>
-          <w:tcPr>
-            <w:tcW w:type="dxa" w:w="1560"/>
-            <w:shd w:fill="F9FAFB"/>
-            <w:tcMar>
-              <w:top w:w="60" w:type="dxa"/>
-              <w:bottom w:w="60" w:type="dxa"/>
-              <w:left w:w="80" w:type="dxa"/>
-              <w:right w:w="80" w:type="dxa"/>
-            </w:tcMar>
-          </w:tcPr>
-          <w:p>
-            <w:r>
-              <w:rPr>
-                <w:rFonts w:ascii="Arial" w:hAnsi="Arial"/>
-                <w:sz w:val="17"/>
-              </w:rPr>
-              <w:t>S0: (1, 1, STANDING)</w:t>
-            </w:r>
-          </w:p>
-        </w:tc>
-        <w:tc>
-          <w:tcPr>
-            <w:tcW w:type="dxa" w:w="1560"/>
-            <w:shd w:fill="F9FAFB"/>
-            <w:tcMar>
-              <w:top w:w="60" w:type="dxa"/>
-              <w:bottom w:w="60" w:type="dxa"/>
-              <w:left w:w="80" w:type="dxa"/>
-              <w:right w:w="80" w:type="dxa"/>
-            </w:tcMar>
-          </w:tcPr>
-          <w:p>
-            <w:r>
-              <w:rPr>
-                <w:rFonts w:ascii="Arial" w:hAnsi="Arial"/>
-                <w:sz w:val="17"/>
-              </w:rPr>
-              <w:t>parent[S0] = null</w:t>
-            </w:r>
-          </w:p>
-        </w:tc>
-        <w:tc>
-          <w:tcPr>
-            <w:tcW w:type="dxa" w:w="1560"/>
-            <w:shd w:fill="F9FAFB"/>
-            <w:tcMar>
-              <w:top w:w="60" w:type="dxa"/>
-              <w:bottom w:w="60" w:type="dxa"/>
-              <w:left w:w="80" w:type="dxa"/>
-              <w:right w:w="80" w:type="dxa"/>
-            </w:tcMar>
-          </w:tcPr>
-          <w:p>
-            <w:r>
-              <w:rPr>
-                <w:rFonts w:ascii="Arial" w:hAnsi="Arial"/>
-                <w:sz w:val="17"/>
-              </w:rPr>
-              <w:t>[S0]</w:t>
-            </w:r>
-          </w:p>
-        </w:tc>
-      </w:tr>
-      <w:tr>
-        <w:tc>
-          <w:tcPr>
-            <w:tcW w:type="dxa" w:w="1560"/>
-            <w:shd w:fill="FFFFFF"/>
-            <w:tcMar>
-              <w:top w:w="60" w:type="dxa"/>
-              <w:bottom w:w="60" w:type="dxa"/>
-              <w:left w:w="80" w:type="dxa"/>
-              <w:right w:w="80" w:type="dxa"/>
-            </w:tcMar>
-          </w:tcPr>
-          <w:p>
-            <w:r>
-              <w:rPr>
-                <w:rFonts w:ascii="Arial" w:hAnsi="Arial"/>
-                <w:sz w:val="17"/>
-              </w:rPr>
-              <w:t>1</w:t>
-            </w:r>
-          </w:p>
-        </w:tc>
-        <w:tc>
-          <w:tcPr>
-            <w:tcW w:type="dxa" w:w="1560"/>
-            <w:shd w:fill="FFFFFF"/>
-            <w:tcMar>
-              <w:top w:w="60" w:type="dxa"/>
-              <w:bottom w:w="60" w:type="dxa"/>
-              <w:left w:w="80" w:type="dxa"/>
-              <w:right w:w="80" w:type="dxa"/>
-            </w:tcMar>
-          </w:tcPr>
-          <w:p>
-            <w:r>
-              <w:rPr>
-                <w:rFonts w:ascii="Arial" w:hAnsi="Arial"/>
-                <w:sz w:val="17"/>
-              </w:rPr>
-              <w:t>S0: (1, 1, STANDING)</w:t>
-            </w:r>
-          </w:p>
-        </w:tc>
-        <w:tc>
-          <w:tcPr>
-            <w:tcW w:type="dxa" w:w="1560"/>
-            <w:shd w:fill="FFFFFF"/>
-            <w:tcMar>
-              <w:top w:w="60" w:type="dxa"/>
-              <w:bottom w:w="60" w:type="dxa"/>
-              <w:left w:w="80" w:type="dxa"/>
-              <w:right w:w="80" w:type="dxa"/>
-            </w:tcMar>
-          </w:tcPr>
-          <w:p>
-            <w:r>
-              <w:rPr>
-                <w:rFonts w:ascii="Arial" w:hAnsi="Arial"/>
-                <w:sz w:val="17"/>
-              </w:rPr>
-              <w:t>RIGHT</w:t>
-            </w:r>
-          </w:p>
-        </w:tc>
-        <w:tc>
-          <w:tcPr>
-            <w:tcW w:type="dxa" w:w="1560"/>
-            <w:shd w:fill="FFFFFF"/>
-            <w:tcMar>
-              <w:top w:w="60" w:type="dxa"/>
-              <w:bottom w:w="60" w:type="dxa"/>
-              <w:left w:w="80" w:type="dxa"/>
-              <w:right w:w="80" w:type="dxa"/>
-            </w:tcMar>
-          </w:tcPr>
-          <w:p>
-            <w:r>
-              <w:rPr>
-                <w:rFonts w:ascii="Arial" w:hAnsi="Arial"/>
-                <w:sz w:val="17"/>
-              </w:rPr>
-              <w:t>S1: (1, 2, HORIZ)</w:t>
-            </w:r>
-          </w:p>
-        </w:tc>
-        <w:tc>
-          <w:tcPr>
-            <w:tcW w:type="dxa" w:w="1560"/>
-            <w:shd w:fill="FFFFFF"/>
-            <w:tcMar>
-              <w:top w:w="60" w:type="dxa"/>
-              <w:bottom w:w="60" w:type="dxa"/>
-              <w:left w:w="80" w:type="dxa"/>
-              <w:right w:w="80" w:type="dxa"/>
-            </w:tcMar>
-          </w:tcPr>
-          <w:p>
-            <w:r>
-              <w:rPr>
-                <w:rFonts w:ascii="Arial" w:hAnsi="Arial"/>
-                <w:sz w:val="17"/>
-              </w:rPr>
-              <w:t>parent[S1] = (S0, RIGHT)</w:t>
-            </w:r>
-          </w:p>
-        </w:tc>
-        <w:tc>
-          <w:tcPr>
-            <w:tcW w:type="dxa" w:w="1560"/>
-            <w:shd w:fill="FFFFFF"/>
-            <w:tcMar>
-              <w:top w:w="60" w:type="dxa"/>
-              <w:bottom w:w="60" w:type="dxa"/>
-              <w:left w:w="80" w:type="dxa"/>
-              <w:right w:w="80" w:type="dxa"/>
-            </w:tcMar>
-          </w:tcPr>
-          <w:p>
-            <w:r>
-              <w:rPr>
-                <w:rFonts w:ascii="Arial" w:hAnsi="Arial"/>
-                <w:sz w:val="17"/>
-              </w:rPr>
-              <w:t>[S1]</w:t>
-            </w:r>
-          </w:p>
-        </w:tc>
-      </w:tr>
-      <w:tr>
-        <w:tc>
-          <w:tcPr>
-            <w:tcW w:type="dxa" w:w="1560"/>
-            <w:shd w:fill="F9FAFB"/>
-            <w:tcMar>
-              <w:top w:w="60" w:type="dxa"/>
-              <w:bottom w:w="60" w:type="dxa"/>
-              <w:left w:w="80" w:type="dxa"/>
-              <w:right w:w="80" w:type="dxa"/>
-            </w:tcMar>
-          </w:tcPr>
-          <w:p>
-            <w:r>
-              <w:rPr>
-                <w:rFonts w:ascii="Arial" w:hAnsi="Arial"/>
-                <w:sz w:val="17"/>
-              </w:rPr>
-              <w:t>—</w:t>
-            </w:r>
-          </w:p>
-        </w:tc>
-        <w:tc>
-          <w:tcPr>
-            <w:tcW w:type="dxa" w:w="1560"/>
-            <w:shd w:fill="F9FAFB"/>
-            <w:tcMar>
-              <w:top w:w="60" w:type="dxa"/>
-              <w:bottom w:w="60" w:type="dxa"/>
-              <w:left w:w="80" w:type="dxa"/>
-              <w:right w:w="80" w:type="dxa"/>
-            </w:tcMar>
-          </w:tcPr>
-          <w:p>
-            <w:r>
-              <w:rPr>
-                <w:rFonts w:ascii="Arial" w:hAnsi="Arial"/>
-                <w:sz w:val="17"/>
-              </w:rPr>
-              <w:t>(tiếp bước 1)</w:t>
-            </w:r>
-          </w:p>
-        </w:tc>
-        <w:tc>
-          <w:tcPr>
-            <w:tcW w:type="dxa" w:w="1560"/>
-            <w:shd w:fill="F9FAFB"/>
-            <w:tcMar>
-              <w:top w:w="60" w:type="dxa"/>
-              <w:bottom w:w="60" w:type="dxa"/>
-              <w:left w:w="80" w:type="dxa"/>
-              <w:right w:w="80" w:type="dxa"/>
-            </w:tcMar>
-          </w:tcPr>
-          <w:p>
-            <w:r>
-              <w:rPr>
-                <w:rFonts w:ascii="Arial" w:hAnsi="Arial"/>
-                <w:sz w:val="17"/>
-              </w:rPr>
-              <w:t>DOWN</w:t>
-            </w:r>
-          </w:p>
-        </w:tc>
-        <w:tc>
-          <w:tcPr>
-            <w:tcW w:type="dxa" w:w="1560"/>
-            <w:shd w:fill="F9FAFB"/>
-            <w:tcMar>
-              <w:top w:w="60" w:type="dxa"/>
-              <w:bottom w:w="60" w:type="dxa"/>
-              <w:left w:w="80" w:type="dxa"/>
-              <w:right w:w="80" w:type="dxa"/>
-            </w:tcMar>
-          </w:tcPr>
-          <w:p>
-            <w:r>
-              <w:rPr>
-                <w:rFonts w:ascii="Arial" w:hAnsi="Arial"/>
-                <w:sz w:val="17"/>
-              </w:rPr>
-              <w:t>S_die (rơi vực)</w:t>
-            </w:r>
-          </w:p>
-        </w:tc>
-        <w:tc>
-          <w:tcPr>
-            <w:tcW w:type="dxa" w:w="1560"/>
-            <w:shd w:fill="F9FAFB"/>
-            <w:tcMar>
-              <w:top w:w="60" w:type="dxa"/>
-              <w:bottom w:w="60" w:type="dxa"/>
-              <w:left w:w="80" w:type="dxa"/>
-              <w:right w:w="80" w:type="dxa"/>
-            </w:tcMar>
-          </w:tcPr>
-          <w:p>
-            <w:r>
-              <w:rPr>
-                <w:rFonts w:ascii="Arial" w:hAnsi="Arial"/>
-                <w:sz w:val="17"/>
-              </w:rPr>
-              <w:t>Loại bỏ không hợp lệ</w:t>
-            </w:r>
-          </w:p>
-        </w:tc>
-        <w:tc>
-          <w:tcPr>
-            <w:tcW w:type="dxa" w:w="1560"/>
-            <w:shd w:fill="F9FAFB"/>
-            <w:tcMar>
-              <w:top w:w="60" w:type="dxa"/>
-              <w:bottom w:w="60" w:type="dxa"/>
-              <w:left w:w="80" w:type="dxa"/>
-              <w:right w:w="80" w:type="dxa"/>
-            </w:tcMar>
-          </w:tcPr>
-          <w:p>
-            <w:r>
-              <w:rPr>
-                <w:rFonts w:ascii="Arial" w:hAnsi="Arial"/>
-                <w:sz w:val="17"/>
-              </w:rPr>
-              <w:t>[S1]</w:t>
-            </w:r>
-          </w:p>
-        </w:tc>
-      </w:tr>
-      <w:tr>
-        <w:tc>
-          <w:tcPr>
-            <w:tcW w:type="dxa" w:w="1560"/>
-            <w:shd w:fill="FFFFFF"/>
-            <w:tcMar>
-              <w:top w:w="60" w:type="dxa"/>
-              <w:bottom w:w="60" w:type="dxa"/>
-              <w:left w:w="80" w:type="dxa"/>
-              <w:right w:w="80" w:type="dxa"/>
-            </w:tcMar>
-          </w:tcPr>
-          <w:p>
-            <w:r>
-              <w:rPr>
-                <w:rFonts w:ascii="Arial" w:hAnsi="Arial"/>
-                <w:sz w:val="17"/>
-              </w:rPr>
-              <w:t>2</w:t>
-            </w:r>
-          </w:p>
-        </w:tc>
-        <w:tc>
-          <w:tcPr>
-            <w:tcW w:type="dxa" w:w="1560"/>
-            <w:shd w:fill="FFFFFF"/>
-            <w:tcMar>
-              <w:top w:w="60" w:type="dxa"/>
-              <w:bottom w:w="60" w:type="dxa"/>
-              <w:left w:w="80" w:type="dxa"/>
-              <w:right w:w="80" w:type="dxa"/>
-            </w:tcMar>
-          </w:tcPr>
-          <w:p>
-            <w:r>
-              <w:rPr>
-                <w:rFonts w:ascii="Arial" w:hAnsi="Arial"/>
-                <w:sz w:val="17"/>
-              </w:rPr>
-              <w:t>S1: (1, 2, HORIZ)</w:t>
-            </w:r>
-          </w:p>
-        </w:tc>
-        <w:tc>
-          <w:tcPr>
-            <w:tcW w:type="dxa" w:w="1560"/>
-            <w:shd w:fill="FFFFFF"/>
-            <w:tcMar>
-              <w:top w:w="60" w:type="dxa"/>
-              <w:bottom w:w="60" w:type="dxa"/>
-              <w:left w:w="80" w:type="dxa"/>
-              <w:right w:w="80" w:type="dxa"/>
-            </w:tcMar>
-          </w:tcPr>
-          <w:p>
-            <w:r>
-              <w:rPr>
-                <w:rFonts w:ascii="Arial" w:hAnsi="Arial"/>
-                <w:sz w:val="17"/>
-              </w:rPr>
-              <w:t>RIGHT</w:t>
-            </w:r>
-          </w:p>
-        </w:tc>
-        <w:tc>
-          <w:tcPr>
-            <w:tcW w:type="dxa" w:w="1560"/>
-            <w:shd w:fill="FFFFFF"/>
-            <w:tcMar>
-              <w:top w:w="60" w:type="dxa"/>
-              <w:bottom w:w="60" w:type="dxa"/>
-              <w:left w:w="80" w:type="dxa"/>
-              <w:right w:w="80" w:type="dxa"/>
-            </w:tcMar>
-          </w:tcPr>
-          <w:p>
-            <w:r>
-              <w:rPr>
-                <w:rFonts w:ascii="Arial" w:hAnsi="Arial"/>
-                <w:sz w:val="17"/>
-              </w:rPr>
-              <w:t>S2: (1, 4, STANDING)</w:t>
-            </w:r>
-          </w:p>
-        </w:tc>
-        <w:tc>
-          <w:tcPr>
-            <w:tcW w:type="dxa" w:w="1560"/>
-            <w:shd w:fill="FFFFFF"/>
-            <w:tcMar>
-              <w:top w:w="60" w:type="dxa"/>
-              <w:bottom w:w="60" w:type="dxa"/>
-              <w:left w:w="80" w:type="dxa"/>
-              <w:right w:w="80" w:type="dxa"/>
-            </w:tcMar>
-          </w:tcPr>
-          <w:p>
-            <w:r>
-              <w:rPr>
-                <w:rFonts w:ascii="Arial" w:hAnsi="Arial"/>
-                <w:sz w:val="17"/>
-              </w:rPr>
-              <w:t>parent[S2] = (S1, RIGHT) → ĐÍCH!</w:t>
-            </w:r>
-          </w:p>
-        </w:tc>
-        <w:tc>
-          <w:tcPr>
-            <w:tcW w:type="dxa" w:w="1560"/>
-            <w:shd w:fill="FFFFFF"/>
-            <w:tcMar>
-              <w:top w:w="60" w:type="dxa"/>
-              <w:bottom w:w="60" w:type="dxa"/>
-              <w:left w:w="80" w:type="dxa"/>
-              <w:right w:w="80" w:type="dxa"/>
-            </w:tcMar>
-          </w:tcPr>
-          <w:p>
-            <w:r>
-              <w:rPr>
-                <w:rFonts w:ascii="Arial" w:hAnsi="Arial"/>
-                <w:sz w:val="17"/>
-              </w:rPr>
-              <w:t>DỪNG THUẬT TOÁN</w:t>
-            </w:r>
-          </w:p>
-        </w:tc>
-      </w:tr>
-    </w:tbl>
-    <w:p>
-      <w:pPr>
-        <w:spacing w:before="40" w:after="60" w:line="276" w:lineRule="auto"/>
-      </w:pPr>
-    </w:p>
-    <w:p>
-      <w:pPr>
-        <w:spacing w:before="40" w:after="60" w:line="276" w:lineRule="auto"/>
-      </w:pPr>
-      <w:r>
-        <w:rPr>
-          <w:rFonts w:ascii="Arial" w:hAnsi="Arial"/>
-          <w:b/>
-          <w:sz w:val="20"/>
-        </w:rPr>
-        <w:t xml:space="preserve">Truy vết ngược: </w:t>
-      </w:r>
-      <w:r>
-        <w:rPr>
-          <w:rFonts w:ascii="Arial" w:hAnsi="Arial"/>
-          <w:i w:val="0"/>
-          <w:sz w:val="20"/>
-        </w:rPr>
-        <w:t>Quá trình tái hiện lộ trình nước đi (Path Reconstruction):</w:t>
-      </w:r>
-    </w:p>
-    <w:p>
-      <w:pPr>
-        <w:spacing w:before="20" w:after="40" w:line="276" w:lineRule="auto"/>
-        <w:ind w:left="360"/>
-      </w:pPr>
-      <w:r>
-        <w:rPr>
-          <w:rFonts w:ascii="Arial" w:hAnsi="Arial"/>
-          <w:b/>
-          <w:sz w:val="20"/>
-        </w:rPr>
-        <w:t xml:space="preserve">• </w:t>
-      </w:r>
-      <w:r>
-        <w:rPr>
-          <w:rFonts w:ascii="Arial" w:hAnsi="Arial"/>
-          <w:b/>
-          <w:sz w:val="20"/>
-        </w:rPr>
-        <w:t xml:space="preserve">1. </w:t>
-      </w:r>
-      <w:r>
-        <w:rPr>
-          <w:rFonts w:ascii="Arial" w:hAnsi="Arial"/>
-          <w:sz w:val="20"/>
-        </w:rPr>
-        <w:t>Bắt đầu từ trạng thái đích S2: tra cứu parent[S2] nhận được (S1, 'RIGHT') → moves = ['RIGHT'].</w:t>
-      </w:r>
-    </w:p>
-    <w:p>
-      <w:pPr>
-        <w:spacing w:before="20" w:after="40" w:line="276" w:lineRule="auto"/>
-        <w:ind w:left="360"/>
-      </w:pPr>
-      <w:r>
-        <w:rPr>
-          <w:rFonts w:ascii="Arial" w:hAnsi="Arial"/>
-          <w:b/>
-          <w:sz w:val="20"/>
-        </w:rPr>
-        <w:t xml:space="preserve">• </w:t>
-      </w:r>
-      <w:r>
-        <w:rPr>
-          <w:rFonts w:ascii="Arial" w:hAnsi="Arial"/>
-          <w:b/>
-          <w:sz w:val="20"/>
-        </w:rPr>
-        <w:t xml:space="preserve">2. </w:t>
-      </w:r>
-      <w:r>
-        <w:rPr>
-          <w:rFonts w:ascii="Arial" w:hAnsi="Arial"/>
-          <w:sz w:val="20"/>
-        </w:rPr>
-        <w:t>Chuyển sang nút cha S1: tra cứu parent[S1] nhận được (S0, 'RIGHT') → moves = ['RIGHT', 'RIGHT'].</w:t>
-      </w:r>
-    </w:p>
-    <w:p>
-      <w:pPr>
-        <w:spacing w:before="20" w:after="40" w:line="276" w:lineRule="auto"/>
-        <w:ind w:left="360"/>
-      </w:pPr>
-      <w:r>
-        <w:rPr>
-          <w:rFonts w:ascii="Arial" w:hAnsi="Arial"/>
-          <w:b/>
-          <w:sz w:val="20"/>
-        </w:rPr>
-        <w:t xml:space="preserve">• </w:t>
-      </w:r>
-      <w:r>
-        <w:rPr>
-          <w:rFonts w:ascii="Arial" w:hAnsi="Arial"/>
-          <w:b/>
-          <w:sz w:val="20"/>
-        </w:rPr>
-        <w:t xml:space="preserve">3. </w:t>
-      </w:r>
-      <w:r>
-        <w:rPr>
-          <w:rFonts w:ascii="Arial" w:hAnsi="Arial"/>
-          <w:sz w:val="20"/>
-        </w:rPr>
-        <w:t>Chuyển sang nút gốc S0: parent[S0] là null → dừng vòng lặp.</w:t>
-      </w:r>
-    </w:p>
-    <w:p>
-      <w:pPr>
-        <w:spacing w:before="20" w:after="40" w:line="276" w:lineRule="auto"/>
-        <w:ind w:left="360"/>
-      </w:pPr>
-      <w:r>
-        <w:rPr>
-          <w:rFonts w:ascii="Arial" w:hAnsi="Arial"/>
-          <w:b/>
-          <w:sz w:val="20"/>
-        </w:rPr>
-        <w:t xml:space="preserve">• </w:t>
-      </w:r>
-      <w:r>
-        <w:rPr>
-          <w:rFonts w:ascii="Arial" w:hAnsi="Arial"/>
-          <w:b/>
-          <w:sz w:val="20"/>
-        </w:rPr>
-        <w:t xml:space="preserve">4. </w:t>
-      </w:r>
-      <w:r>
-        <w:rPr>
-          <w:rFonts w:ascii="Arial" w:hAnsi="Arial"/>
-          <w:sz w:val="20"/>
-        </w:rPr>
-        <w:t>Đảo ngược mảng moves: Thu được chuỗi hành động tối ưu hoàn chỉnh ['RIGHT', 'RIGHT'] với độ dài 2 bước.</w:t>
-      </w:r>
-    </w:p>
-    <w:p>
-      <w:pPr>
-        <w:keepNext/>
-        <w:spacing w:before="280" w:after="80"/>
-      </w:pPr>
-      <w:r/>
-      <w:r>
-        <w:rPr>
-          <w:rFonts w:ascii="Arial" w:hAnsi="Arial"/>
-          <w:b/>
-          <w:i w:val="0"/>
-          <w:color w:val="102C57"/>
-          <w:sz w:val="26"/>
-        </w:rPr>
-        <w:t>4. Phân tích: Tính tối ưu số hành động của thuật toán BFS</w:t>
-      </w:r>
-    </w:p>
-    <w:p>
-      <w:pPr>
-        <w:keepNext/>
-        <w:spacing w:before="160" w:after="60"/>
-        <w:ind w:left="0"/>
-      </w:pPr>
-      <w:r/>
-      <w:r>
-        <w:rPr>
-          <w:rFonts w:ascii="Arial" w:hAnsi="Arial"/>
-          <w:b/>
-          <w:i w:val="0"/>
-          <w:color w:val="1E3C72"/>
-          <w:sz w:val="23"/>
-        </w:rPr>
-        <w:t>4.1. Cơ chế trọng số đơn vị và tính tối ưu số bước đi</w:t>
-      </w:r>
-    </w:p>
-    <w:p>
-      <w:pPr>
-        <w:spacing w:before="0" w:after="60" w:line="276" w:lineRule="auto"/>
-        <w:ind w:left="0"/>
-      </w:pPr>
-      <w:r/>
-      <w:r>
-        <w:rPr>
-          <w:rFonts w:ascii="Arial" w:hAnsi="Arial"/>
-          <w:b w:val="0"/>
-          <w:i w:val="0"/>
-          <w:color w:val="282828"/>
-          <w:sz w:val="20"/>
-        </w:rPr>
-        <w:t>Trong không gian tìm kiếm của BFS, mỗi hành động hợp lệ chuyển dịch khối từ trạng thái hiện tại s sang trạng thái kế tiếp s' đều được gán trọng số chi phí đơn vị đồng nhất:</w:t>
-      </w:r>
-    </w:p>
-    <w:p>
-      <w:pPr>
-        <w:spacing w:before="40" w:after="60" w:line="276" w:lineRule="auto"/>
-        <w:ind w:left="360"/>
-      </w:pPr>
-      <w:r/>
-      <w:r>
-        <w:rPr>
-          <w:rFonts w:ascii="Arial" w:hAnsi="Arial"/>
-          <w:b/>
-          <w:i/>
-          <w:color w:val="102C57"/>
-          <w:sz w:val="20"/>
-        </w:rPr>
-        <w:t>w(s, a, s') = 1,   ∀ a ∈ A(s)</w:t>
-      </w:r>
-    </w:p>
-    <w:p>
-      <w:pPr>
-        <w:spacing w:before="0" w:after="60" w:line="276" w:lineRule="auto"/>
-        <w:ind w:left="0"/>
-      </w:pPr>
-      <w:r/>
-      <w:r>
-        <w:rPr>
-          <w:rFonts w:ascii="Arial" w:hAnsi="Arial"/>
-          <w:b w:val="0"/>
-          <w:i w:val="0"/>
-          <w:color w:val="282828"/>
-          <w:sz w:val="20"/>
-        </w:rPr>
-        <w:t xml:space="preserve">Do mọi cạnh nối trên cây tìm kiếm có chi phí bằng 1, độ sâu d của một nút trên cây phản ánh chính xác số lượng hành động lăn khối thực tế: </w:t>
-      </w:r>
-      <w:r>
-        <w:rPr>
-          <w:rFonts w:ascii="Arial" w:hAnsi="Arial"/>
-          <w:b/>
-          <w:i w:val="0"/>
-          <w:color w:val="102C57"/>
-          <w:sz w:val="20"/>
-        </w:rPr>
-        <w:t>depth(s) = solution_length = len(moves)</w:t>
-      </w:r>
-      <w:r>
-        <w:rPr>
-          <w:rFonts w:ascii="Arial" w:hAnsi="Arial"/>
-          <w:b w:val="0"/>
-          <w:i w:val="0"/>
-          <w:color w:val="282828"/>
-          <w:sz w:val="20"/>
-        </w:rPr>
-        <w:t>. Thuật toán mở rộng không gian trạng thái theo từng tầng độ sâu đồng mức tăng dần d = 0, 1, 2, ...</w:t>
-      </w:r>
-    </w:p>
-    <w:p>
-      <w:pPr>
-        <w:spacing w:before="0" w:after="60" w:line="276" w:lineRule="auto"/>
-        <w:ind w:left="0"/>
-      </w:pPr>
-      <w:r/>
-      <w:r>
-        <w:rPr>
-          <w:rFonts w:ascii="Arial" w:hAnsi="Arial"/>
-          <w:b w:val="0"/>
-          <w:i w:val="0"/>
-          <w:color w:val="282828"/>
-          <w:sz w:val="20"/>
-        </w:rPr>
-        <w:t>Nhờ cơ chế kiểm tra đích sớm (Early Goal Test), ngay tại thời điểm một trạng thái con s' vừa được sinh ra thỏa mãn điều kiện đích (board.is_goal(nxt)), thuật toán lập tức dừng và tái hiện lộ trình. Do tất cả các trạng thái ở các tầng độ sâu nhỏ hơn (d &lt; d_min) đều đã được duyệt qua và không có trạng thái nào thỏa điều kiện đích, trạng thái đích được phát hiện đầu tiên chắc chắn có độ sâu nhỏ nhất (d_min). Do đó, BFS đảm bảo tính tối ưu tuyệt đối về số hành động lăn khối.</w:t>
-      </w:r>
-    </w:p>
-    <w:p>
-      <w:pPr>
-        <w:spacing w:before="160" w:after="60" w:line="276" w:lineRule="auto"/>
-        <w:ind w:left="0"/>
-      </w:pPr>
-      <w:r/>
-      <w:r>
-        <w:rPr>
-          <w:rFonts w:ascii="Arial" w:hAnsi="Arial"/>
-          <w:b/>
-          <w:i w:val="0"/>
-          <w:color w:val="1E3C72"/>
-          <w:sz w:val="23"/>
-        </w:rPr>
-        <w:t>4.2. Phân định không gian hành động tìm kiếm và thao tác người chơi</w:t>
-      </w:r>
-    </w:p>
-    <w:p>
-      <w:pPr>
-        <w:spacing w:before="0" w:after="60" w:line="276" w:lineRule="auto"/>
-        <w:ind w:left="0"/>
-      </w:pPr>
-      <w:r/>
-      <w:r>
-        <w:rPr>
-          <w:rFonts w:ascii="Arial" w:hAnsi="Arial"/>
-          <w:b w:val="0"/>
-          <w:i w:val="0"/>
-          <w:color w:val="282828"/>
-          <w:sz w:val="20"/>
-        </w:rPr>
-        <w:t>Hệ thống giải đố phân định rạch ròi giữa các hành động trong không gian tìm kiếm của thuật toán và các thao tác giao diện người dùng:</w:t>
-      </w:r>
-    </w:p>
-    <w:p>
-      <w:pPr>
-        <w:spacing w:before="0" w:after="40" w:line="276" w:lineRule="auto"/>
-        <w:ind w:left="280"/>
-      </w:pPr>
-      <w:r/>
-      <w:r>
-        <w:rPr>
-          <w:rFonts w:ascii="Arial" w:hAnsi="Arial"/>
-          <w:b/>
-          <w:i w:val="0"/>
-          <w:color w:val="102C57"/>
-          <w:sz w:val="20"/>
-        </w:rPr>
-        <w:t xml:space="preserve">• Khi chưa phân tách: </w:t>
-      </w:r>
-      <w:r>
-        <w:rPr>
-          <w:rFonts w:ascii="Arial" w:hAnsi="Arial"/>
-          <w:b w:val="0"/>
-          <w:i w:val="0"/>
-          <w:color w:val="282828"/>
-          <w:sz w:val="20"/>
-        </w:rPr>
-        <w:t>Tập hành động tìm kiếm gồm 4 hướng lăn cơ bản: A_normal = {UP, LEFT, RIGHT, DOWN}.</w:t>
-      </w:r>
-    </w:p>
-    <w:p>
-      <w:pPr>
-        <w:keepNext/>
-        <w:spacing w:before="0" w:after="40"/>
-        <w:ind w:left="280"/>
-      </w:pPr>
-      <w:r/>
-      <w:r>
-        <w:rPr>
-          <w:rFonts w:ascii="Arial" w:hAnsi="Arial"/>
-          <w:b/>
-          <w:i w:val="0"/>
-          <w:color w:val="102C57"/>
-          <w:sz w:val="20"/>
-        </w:rPr>
-        <w:t xml:space="preserve">• Khi ở trạng thái phân tách (SPLIT): </w:t>
-      </w:r>
-      <w:r>
-        <w:rPr>
-          <w:rFonts w:ascii="Arial" w:hAnsi="Arial"/>
-          <w:b w:val="0"/>
-          <w:i w:val="0"/>
-          <w:color w:val="282828"/>
-          <w:sz w:val="20"/>
-        </w:rPr>
-        <w:t>Không gian hành động mở rộng lên 8 thao tác: A_split = A_normal ∪ {SUP, SLEFT, SRIGHT, SDOWN}. Trong đó, 4 hành động thường tác động lên khối active_cube đang chọn, và 4 hành động có tiền tố 'S' biểu diễn việc chuyển quyền điều khiển sang khối còn lại và thực hiện lăn ngay lập tức trong cùng một bước tìm kiếm.</w:t>
-      </w:r>
-    </w:p>
-    <w:p>
-      <w:pPr>
-        <w:spacing w:before="0" w:after="40" w:line="276" w:lineRule="auto"/>
-        <w:ind w:left="280"/>
-      </w:pPr>
-      <w:r/>
-      <w:r>
-        <w:rPr>
-          <w:rFonts w:ascii="Arial" w:hAnsi="Arial"/>
-          <w:b/>
-          <w:i w:val="0"/>
-          <w:color w:val="102C57"/>
-          <w:sz w:val="20"/>
-        </w:rPr>
-        <w:t xml:space="preserve">• Thao tác phím SPACE: </w:t>
-      </w:r>
-      <w:r>
-        <w:rPr>
-          <w:rFonts w:ascii="Arial" w:hAnsi="Arial"/>
-          <w:b w:val="0"/>
-          <w:i w:val="0"/>
-          <w:color w:val="282828"/>
-          <w:sz w:val="20"/>
-        </w:rPr>
-        <w:t>Thao tác này chỉ áp dụng trong chế độ người chơi điều khiển thủ công (Manual Gameplay) để chuyển đổi giữa hai khối. Trong không gian tìm kiếm của thuật toán AI, thao tác SPACE hoàn toàn miễn phí và không sinh ra cạnh tìm kiếm riêng lẻ trên đồ thị, giúp loại trừ triệt để nguy cơ lặp trạng thái vô nghĩa và giảm thiểu hệ số phân nhánh.</w:t>
-      </w:r>
-    </w:p>
-    <w:p>
-      <w:pPr>
-        <w:spacing w:before="0" w:after="40" w:line="276" w:lineRule="auto"/>
-        <w:ind w:left="280"/>
-      </w:pPr>
-      <w:r/>
-      <w:r>
-        <w:rPr>
-          <w:rFonts w:ascii="Arial" w:hAnsi="Arial"/>
-          <w:b/>
-          <w:i w:val="0"/>
-          <w:color w:val="102C57"/>
-          <w:sz w:val="20"/>
-        </w:rPr>
-        <w:t xml:space="preserve">• Quy chuẩn đo lường: </w:t>
-      </w:r>
-      <w:r>
-        <w:rPr>
-          <w:rFonts w:ascii="Arial" w:hAnsi="Arial"/>
-          <w:b w:val="0"/>
-          <w:i w:val="0"/>
-          <w:color w:val="282828"/>
-          <w:sz w:val="20"/>
-        </w:rPr>
-        <w:t>Mỗi phần tử trong danh sách moves của lời giải đều tương ứng với đúng một bước lăn khối cơ học thực sự, bảo đảm độ dài lời giải (solution_length = len(moves)) phản ánh chính xác hiệu quả giải đố cơ học.</w:t>
-      </w:r>
-    </w:p>
-    <w:p>
-      <w:pPr>
-        <w:keepNext/>
-        <w:spacing w:before="280" w:after="80"/>
-      </w:pPr>
-      <w:r>
-        <w:rPr>
-          <w:rFonts w:ascii="Arial" w:hAnsi="Arial"/>
-          <w:b/>
-          <w:color w:val="102C57"/>
-          <w:sz w:val="26"/>
-        </w:rPr>
-        <w:t>5. Các trường hợp đặc biệt và Xử lý biên (Edge Cases)</w:t>
-      </w:r>
-    </w:p>
-    <w:p>
-      <w:pPr>
-        <w:spacing w:before="20" w:after="40" w:line="276" w:lineRule="auto"/>
-        <w:ind w:left="360"/>
-      </w:pPr>
-      <w:r>
-        <w:rPr>
-          <w:rFonts w:ascii="Arial" w:hAnsi="Arial"/>
-          <w:b/>
-          <w:sz w:val="20"/>
-        </w:rPr>
-        <w:t xml:space="preserve">• </w:t>
-      </w:r>
-      <w:r>
-        <w:rPr>
-          <w:rFonts w:ascii="Arial" w:hAnsi="Arial"/>
-          <w:b/>
-          <w:sz w:val="20"/>
-        </w:rPr>
-        <w:t xml:space="preserve">5.1. Vị trí xuất phát đã là đích (Start == Goal): </w:t>
-      </w:r>
-      <w:r>
-        <w:rPr>
-          <w:rFonts w:ascii="Arial" w:hAnsi="Arial"/>
-          <w:sz w:val="20"/>
-        </w:rPr>
-        <w:t>Nếu start_state thỏa mãn is_goal ngay từ đầu, hàm lập tức trả về {found: True, moves: [], expanded_nodes: 0, total_cost: 0}. Không đưa node vào vòng lặp duyệt, đảm bảo khớp chuẩn kiểm thử của đồ án.</w:t>
-      </w:r>
-    </w:p>
-    <w:p>
-      <w:pPr>
-        <w:spacing w:before="20" w:after="40" w:line="276" w:lineRule="auto"/>
-        <w:ind w:left="360"/>
-      </w:pPr>
-      <w:r>
-        <w:rPr>
-          <w:rFonts w:ascii="Arial" w:hAnsi="Arial"/>
-          <w:b/>
-          <w:sz w:val="20"/>
-        </w:rPr>
-        <w:t xml:space="preserve">• </w:t>
-      </w:r>
-      <w:r>
-        <w:rPr>
-          <w:rFonts w:ascii="Arial" w:hAnsi="Arial"/>
-          <w:b/>
-          <w:sz w:val="20"/>
-        </w:rPr>
-        <w:t xml:space="preserve">5.2. Màn chơi vô nghiệm (Unsolvable Board): </w:t>
-      </w:r>
-      <w:r>
-        <w:rPr>
-          <w:rFonts w:ascii="Arial" w:hAnsi="Arial"/>
-          <w:sz w:val="20"/>
-        </w:rPr>
-        <w:t>Khi toàn bộ không gian trạng thái liên thông đã được khám phá hết mà hàng đợi Q trở nên rỗng (while Q is not empty kết thúc), thuật toán trả về kết quả {found: False, moves: [], expanded_nodes: expanded_nodes, total_cost: 0}.</w:t>
-      </w:r>
-    </w:p>
-    <w:p>
-      <w:pPr>
-        <w:spacing w:before="20" w:after="40" w:line="276" w:lineRule="auto"/>
-        <w:ind w:left="360"/>
-      </w:pPr>
-      <w:r>
-        <w:rPr>
-          <w:rFonts w:ascii="Arial" w:hAnsi="Arial"/>
-          <w:sz w:val="20"/>
-        </w:rPr>
-        <w:t>• 5.3. Trạng thái phân tách và hợp nhất (SPLIT / Rejoin): Khi khối bước lên ô SPLIT_SWITCH, khối tách đôi thành hai khối lập phương 1×1×1 và dịch chuyển tức thời (teleport) tới 2 tọa độ mục tiêu targets. Tại trạng thái SPLIT, get_successors(state) sinh 8 hành động tìm kiếm (4 hướng thường di chuyển khối active_cube, và 4 hướng có tiền tố 'S' để đổi khối rồi lăn ngay). Thao tác SPACE chơi tay không sinh cạnh tìm kiếm riêng. Khi hai khối đơn di chuyển đến hai ô kề sát nhau, cơ chế tự động sáp nhập (rejoin) sẽ hợp nhất hai khối thành khối nguyên vẹn HORIZONTAL hoặc VERTICAL.</w:t>
-      </w:r>
-    </w:p>
-    <w:p>
-      <w:pPr>
-        <w:keepNext/>
-        <w:spacing w:before="280" w:after="80"/>
-      </w:pPr>
-      <w:r>
-        <w:rPr>
-          <w:rFonts w:ascii="Arial" w:hAnsi="Arial"/>
-          <w:b/>
-          <w:color w:val="102C57"/>
-          <w:sz w:val="26"/>
-        </w:rPr>
-        <w:t>6. Đánh giá tính chất lý thuyết của thuật toán</w:t>
-      </w:r>
-    </w:p>
-    <w:tbl>
-      <w:tblPr>
-        <w:tblW w:type="auto" w:w="0"/>
-        <w:jc w:val="center"/>
-        <w:tblLook w:firstColumn="1" w:firstRow="1" w:lastColumn="0" w:lastRow="0" w:noHBand="0" w:noVBand="1" w:val="04A0"/>
-      </w:tblPr>
-      <w:tblGrid>
-        <w:gridCol w:w="3120"/>
-        <w:gridCol w:w="3120"/>
-        <w:gridCol w:w="3120"/>
-      </w:tblGrid>
-      <w:tr>
-        <w:tc>
-          <w:tcPr>
-            <w:tcW w:type="dxa" w:w="3120"/>
-            <w:tcMar>
-              <w:top w:w="80" w:type="dxa"/>
-              <w:bottom w:w="80" w:type="dxa"/>
-              <w:left w:w="100" w:type="dxa"/>
-              <w:right w:w="100" w:type="dxa"/>
-            </w:tcMar>
-            <w:shd w:fill="1E3C72"/>
+            <w:tcW w:type="dxa" w:w="1728"/>
             <w:tcMar>
               <w:top w:w="80" w:type="dxa"/>
               <w:bottom w:w="80" w:type="dxa"/>
@@ -1742,31 +697,21 @@
           </w:tcPr>
           <w:p>
             <w:pPr>
-              <w:spacing w:before="60" w:after="60" w:line="276" w:lineRule="auto"/>
-              <w:jc w:val="center"/>
+              <w:spacing w:before="0" w:after="0" w:line="276" w:lineRule="auto"/>
             </w:pPr>
             <w:r>
               <w:rPr>
-                <w:rFonts w:ascii="Arial" w:hAnsi="Arial"/>
-                <w:b/>
-                <w:i w:val="0"/>
-                <w:color w:val="FFFFFF"/>
-                <w:sz w:val="20"/>
+                <w:rFonts w:ascii="Times New Roman" w:hAnsi="Times New Roman"/>
+                <w:color w:val="1E293B"/>
+                <w:sz w:val="21"/>
               </w:rPr>
-              <w:t>Tiêu chuẩn</w:t>
+              <w:t>[S0]</w:t>
             </w:r>
           </w:p>
         </w:tc>
         <w:tc>
           <w:tcPr>
-            <w:tcW w:type="dxa" w:w="3120"/>
-            <w:tcMar>
-              <w:top w:w="80" w:type="dxa"/>
-              <w:bottom w:w="80" w:type="dxa"/>
-              <w:left w:w="100" w:type="dxa"/>
-              <w:right w:w="100" w:type="dxa"/>
-            </w:tcMar>
-            <w:shd w:fill="1E3C72"/>
+            <w:tcW w:type="dxa" w:w="2160"/>
             <w:tcMar>
               <w:top w:w="80" w:type="dxa"/>
               <w:bottom w:w="80" w:type="dxa"/>
@@ -1777,74 +722,21 @@
           </w:tcPr>
           <w:p>
             <w:pPr>
-              <w:spacing w:before="60" w:after="60" w:line="276" w:lineRule="auto"/>
-              <w:jc w:val="center"/>
+              <w:spacing w:before="0" w:after="0" w:line="276" w:lineRule="auto"/>
             </w:pPr>
             <w:r>
               <w:rPr>
-                <w:rFonts w:ascii="Arial" w:hAnsi="Arial"/>
-                <w:b/>
-                <w:i w:val="0"/>
-                <w:color w:val="FFFFFF"/>
-                <w:sz w:val="20"/>
+                <w:rFonts w:ascii="Times New Roman" w:hAnsi="Times New Roman"/>
+                <w:color w:val="1E293B"/>
+                <w:sz w:val="21"/>
               </w:rPr>
-              <w:t>Đánh giá</w:t>
+              <w:t>—</w:t>
             </w:r>
           </w:p>
         </w:tc>
         <w:tc>
           <w:tcPr>
-            <w:tcW w:type="dxa" w:w="3120"/>
-            <w:tcMar>
-              <w:top w:w="80" w:type="dxa"/>
-              <w:bottom w:w="80" w:type="dxa"/>
-              <w:left w:w="100" w:type="dxa"/>
-              <w:right w:w="100" w:type="dxa"/>
-            </w:tcMar>
-            <w:tcMar>
-              <w:top w:w="80" w:type="dxa"/>
-              <w:bottom w:w="80" w:type="dxa"/>
-              <w:left w:w="120" w:type="dxa"/>
-              <w:right w:w="120" w:type="dxa"/>
-            </w:tcMar>
-            <w:vAlign w:val="center"/>
-            <w:shd w:fill="1E3C72"/>
-            <w:tcMar>
-              <w:top w:w="80" w:type="dxa"/>
-              <w:bottom w:w="80" w:type="dxa"/>
-              <w:left w:w="120" w:type="dxa"/>
-              <w:right w:w="120" w:type="dxa"/>
-            </w:tcMar>
-          </w:tcPr>
-          <w:p>
-            <w:pPr>
-              <w:spacing w:before="60" w:after="60" w:line="276" w:lineRule="auto"/>
-              <w:jc w:val="center"/>
-            </w:pPr>
-            <w:r>
-              <w:rPr>
-                <w:rFonts w:ascii="Arial" w:hAnsi="Arial"/>
-                <w:b/>
-                <w:i w:val="0"/>
-                <w:color w:val="FFFFFF"/>
-                <w:sz w:val="20"/>
-              </w:rPr>
-              <w:t>Giải thích chi tiết trong bài toán Bloxorz</w:t>
-            </w:r>
-          </w:p>
-        </w:tc>
-      </w:tr>
-      <w:tr>
-        <w:tc>
-          <w:tcPr>
-            <w:tcW w:type="dxa" w:w="3120"/>
-            <w:tcMar>
-              <w:top w:w="60" w:type="dxa"/>
-              <w:bottom w:w="60" w:type="dxa"/>
-              <w:left w:w="80" w:type="dxa"/>
-              <w:right w:w="80" w:type="dxa"/>
-            </w:tcMar>
-            <w:shd w:fill="FFFFFF"/>
+            <w:tcW w:type="dxa" w:w="2592"/>
             <w:tcMar>
               <w:top w:w="80" w:type="dxa"/>
               <w:bottom w:w="80" w:type="dxa"/>
@@ -1855,31 +747,21 @@
           </w:tcPr>
           <w:p>
             <w:pPr>
-              <w:spacing w:before="60" w:after="60" w:line="276" w:lineRule="auto"/>
-              <w:jc w:val="left"/>
+              <w:spacing w:before="0" w:after="0" w:line="276" w:lineRule="auto"/>
             </w:pPr>
             <w:r>
               <w:rPr>
-                <w:rFonts w:ascii="Arial" w:hAnsi="Arial"/>
-                <w:b/>
-                <w:i w:val="0"/>
-                <w:color w:val="102C57"/>
-                <w:sz w:val="19"/>
+                <w:rFonts w:ascii="Times New Roman" w:hAnsi="Times New Roman"/>
+                <w:color w:val="1E293B"/>
+                <w:sz w:val="21"/>
               </w:rPr>
-              <w:t>Tính đầy đủ (Completeness)</w:t>
+              <w:t>—</w:t>
             </w:r>
           </w:p>
         </w:tc>
         <w:tc>
           <w:tcPr>
-            <w:tcW w:type="dxa" w:w="3120"/>
-            <w:tcMar>
-              <w:top w:w="60" w:type="dxa"/>
-              <w:bottom w:w="60" w:type="dxa"/>
-              <w:left w:w="80" w:type="dxa"/>
-              <w:right w:w="80" w:type="dxa"/>
-            </w:tcMar>
-            <w:shd w:fill="FFFFFF"/>
+            <w:tcW w:type="dxa" w:w="2160"/>
             <w:tcMar>
               <w:top w:w="80" w:type="dxa"/>
               <w:bottom w:w="80" w:type="dxa"/>
@@ -1890,53 +772,15 @@
           </w:tcPr>
           <w:p>
             <w:pPr>
-              <w:spacing w:before="60" w:after="60" w:line="276" w:lineRule="auto"/>
-              <w:jc w:val="center"/>
+              <w:spacing w:before="0" w:after="0" w:line="276" w:lineRule="auto"/>
             </w:pPr>
             <w:r>
               <w:rPr>
-                <w:rFonts w:ascii="Arial" w:hAnsi="Arial"/>
-                <w:b/>
-                <w:i w:val="0"/>
-                <w:color w:val="008000"/>
-                <w:sz w:val="19"/>
+                <w:rFonts w:ascii="Times New Roman" w:hAnsi="Times New Roman"/>
+                <w:color w:val="1E293B"/>
+                <w:sz w:val="21"/>
               </w:rPr>
-              <w:t>CÓ</w:t>
-            </w:r>
-          </w:p>
-        </w:tc>
-        <w:tc>
-          <w:tcPr>
-            <w:tcW w:type="dxa" w:w="3120"/>
-            <w:tcMar>
-              <w:top w:w="60" w:type="dxa"/>
-              <w:bottom w:w="60" w:type="dxa"/>
-              <w:left w:w="80" w:type="dxa"/>
-              <w:right w:w="80" w:type="dxa"/>
-            </w:tcMar>
-            <w:shd w:fill="FFFFFF"/>
-            <w:tcMar>
-              <w:top w:w="80" w:type="dxa"/>
-              <w:bottom w:w="80" w:type="dxa"/>
-              <w:left w:w="120" w:type="dxa"/>
-              <w:right w:w="120" w:type="dxa"/>
-            </w:tcMar>
-            <w:vAlign w:val="center"/>
-          </w:tcPr>
-          <w:p>
-            <w:pPr>
-              <w:spacing w:before="60" w:after="60" w:line="276" w:lineRule="auto"/>
-              <w:jc w:val="left"/>
-            </w:pPr>
-            <w:r>
-              <w:rPr>
-                <w:rFonts w:ascii="Arial" w:hAnsi="Arial"/>
-                <w:b w:val="0"/>
-                <w:i w:val="0"/>
-                <w:color w:val="333333"/>
-                <w:sz w:val="19"/>
-              </w:rPr>
-              <w:t>Không gian trạng thái Bloxorz là hữu hạn (|S| &lt; ∞) và hệ số phân nhánh b ≤ 4 khi chưa tách, b ≤ 8 khi ở trạng thái SPLIT. Bảng băm parent ngăn ngừa triệt để việc lặp chu trình. Do đó, thuật toán chắc chắn luôn tìm ra nghiệm nếu tồn tại, hoặc dừng và kết luận vô nghiệm.</w:t>
+              <w:t>parent[S0] = None</w:t>
             </w:r>
           </w:p>
         </w:tc>
@@ -1944,13 +788,7 @@
       <w:tr>
         <w:tc>
           <w:tcPr>
-            <w:tcW w:type="dxa" w:w="3120"/>
-            <w:tcMar>
-              <w:top w:w="60" w:type="dxa"/>
-              <w:bottom w:w="60" w:type="dxa"/>
-              <w:left w:w="80" w:type="dxa"/>
-              <w:right w:w="80" w:type="dxa"/>
-            </w:tcMar>
+            <w:tcW w:type="dxa" w:w="1152"/>
             <w:shd w:fill="F8FAFC"/>
             <w:tcMar>
               <w:top w:w="80" w:type="dxa"/>
@@ -1962,30 +800,21 @@
           </w:tcPr>
           <w:p>
             <w:pPr>
-              <w:spacing w:before="60" w:after="60" w:line="276" w:lineRule="auto"/>
-              <w:jc w:val="left"/>
+              <w:spacing w:before="0" w:after="0" w:line="276" w:lineRule="auto"/>
             </w:pPr>
             <w:r>
               <w:rPr>
-                <w:rFonts w:ascii="Arial" w:hAnsi="Arial"/>
-                <w:b/>
-                <w:i w:val="0"/>
-                <w:color w:val="102C57"/>
-                <w:sz w:val="19"/>
+                <w:rFonts w:ascii="Times New Roman" w:hAnsi="Times New Roman"/>
+                <w:color w:val="1E293B"/>
+                <w:sz w:val="21"/>
               </w:rPr>
-              <w:t>Tính tối ưu (Optimality)</w:t>
+              <w:t>1</w:t>
             </w:r>
           </w:p>
         </w:tc>
         <w:tc>
           <w:tcPr>
-            <w:tcW w:type="dxa" w:w="3120"/>
-            <w:tcMar>
-              <w:top w:w="60" w:type="dxa"/>
-              <w:bottom w:w="60" w:type="dxa"/>
-              <w:left w:w="80" w:type="dxa"/>
-              <w:right w:w="80" w:type="dxa"/>
-            </w:tcMar>
+            <w:tcW w:type="dxa" w:w="1728"/>
             <w:shd w:fill="F8FAFC"/>
             <w:tcMar>
               <w:top w:w="80" w:type="dxa"/>
@@ -1997,180 +826,21 @@
           </w:tcPr>
           <w:p>
             <w:pPr>
-              <w:spacing w:before="60" w:after="60" w:line="276" w:lineRule="auto"/>
-              <w:jc w:val="center"/>
+              <w:spacing w:before="0" w:after="0" w:line="276" w:lineRule="auto"/>
             </w:pPr>
             <w:r>
               <w:rPr>
-                <w:rFonts w:ascii="Arial" w:hAnsi="Arial"/>
-                <w:b/>
-                <w:i w:val="0"/>
-                <w:color w:val="008000"/>
-                <w:sz w:val="19"/>
+                <w:rFonts w:ascii="Times New Roman" w:hAnsi="Times New Roman"/>
+                <w:color w:val="1E293B"/>
+                <w:sz w:val="21"/>
               </w:rPr>
-              <w:t>CÓ</w:t>
+              <w:t>[]</w:t>
             </w:r>
           </w:p>
         </w:tc>
         <w:tc>
           <w:tcPr>
-            <w:tcW w:type="dxa" w:w="3120"/>
-            <w:tcMar>
-              <w:top w:w="60" w:type="dxa"/>
-              <w:bottom w:w="60" w:type="dxa"/>
-              <w:left w:w="80" w:type="dxa"/>
-              <w:right w:w="80" w:type="dxa"/>
-            </w:tcMar>
-            <w:tcMar>
-              <w:top w:w="80" w:type="dxa"/>
-              <w:bottom w:w="80" w:type="dxa"/>
-              <w:left w:w="120" w:type="dxa"/>
-              <w:right w:w="120" w:type="dxa"/>
-            </w:tcMar>
-            <w:vAlign w:val="center"/>
-            <w:shd w:fill="F8FAFC"/>
-            <w:tcMar>
-              <w:top w:w="80" w:type="dxa"/>
-              <w:bottom w:w="80" w:type="dxa"/>
-              <w:left w:w="120" w:type="dxa"/>
-              <w:right w:w="120" w:type="dxa"/>
-            </w:tcMar>
-          </w:tcPr>
-          <w:p>
-            <w:pPr>
-              <w:spacing w:before="60" w:after="60" w:line="276" w:lineRule="auto"/>
-              <w:jc w:val="left"/>
-            </w:pPr>
-            <w:r>
-              <w:rPr>
-                <w:rFonts w:ascii="Arial" w:hAnsi="Arial"/>
-                <w:b w:val="0"/>
-                <w:i w:val="0"/>
-                <w:color w:val="333333"/>
-                <w:sz w:val="19"/>
-              </w:rPr>
-              <w:t>Vì chi phí mỗi bước đi là đồng nhất (w = 1), nghiệm đầu tiên chạm đích ở tầng sâu d nhỏ nhất chắc chắn là nghiệm có số bước đi (actions) ít nhất tuyệt đối.</w:t>
-            </w:r>
-          </w:p>
-        </w:tc>
-      </w:tr>
-      <w:tr>
-        <w:tc>
-          <w:tcPr>
-            <w:tcW w:type="dxa" w:w="3120"/>
-            <w:tcMar>
-              <w:top w:w="60" w:type="dxa"/>
-              <w:bottom w:w="60" w:type="dxa"/>
-              <w:left w:w="80" w:type="dxa"/>
-              <w:right w:w="80" w:type="dxa"/>
-            </w:tcMar>
-            <w:shd w:fill="FFFFFF"/>
-            <w:tcMar>
-              <w:top w:w="80" w:type="dxa"/>
-              <w:bottom w:w="80" w:type="dxa"/>
-              <w:left w:w="120" w:type="dxa"/>
-              <w:right w:w="120" w:type="dxa"/>
-            </w:tcMar>
-            <w:vAlign w:val="center"/>
-          </w:tcPr>
-          <w:p>
-            <w:pPr>
-              <w:spacing w:before="60" w:after="60" w:line="276" w:lineRule="auto"/>
-              <w:jc w:val="left"/>
-            </w:pPr>
-            <w:r>
-              <w:rPr>
-                <w:rFonts w:ascii="Arial" w:hAnsi="Arial"/>
-                <w:b/>
-                <w:i w:val="0"/>
-                <w:color w:val="102C57"/>
-                <w:sz w:val="19"/>
-              </w:rPr>
-              <w:t>Độ phức tạp thời gian</w:t>
-            </w:r>
-          </w:p>
-        </w:tc>
-        <w:tc>
-          <w:tcPr>
-            <w:tcW w:type="dxa" w:w="3120"/>
-            <w:tcMar>
-              <w:top w:w="60" w:type="dxa"/>
-              <w:bottom w:w="60" w:type="dxa"/>
-              <w:left w:w="80" w:type="dxa"/>
-              <w:right w:w="80" w:type="dxa"/>
-            </w:tcMar>
-            <w:shd w:fill="FFFFFF"/>
-            <w:tcMar>
-              <w:top w:w="80" w:type="dxa"/>
-              <w:bottom w:w="80" w:type="dxa"/>
-              <w:left w:w="120" w:type="dxa"/>
-              <w:right w:w="120" w:type="dxa"/>
-            </w:tcMar>
-            <w:vAlign w:val="center"/>
-          </w:tcPr>
-          <w:p>
-            <w:pPr>
-              <w:spacing w:before="60" w:after="60" w:line="276" w:lineRule="auto"/>
-              <w:jc w:val="center"/>
-            </w:pPr>
-            <w:r>
-              <w:rPr>
-                <w:rFonts w:ascii="Arial" w:hAnsi="Arial"/>
-                <w:b/>
-                <w:i w:val="0"/>
-                <w:color w:val="282828"/>
-                <w:sz w:val="19"/>
-              </w:rPr>
-              <w:t>O(b^d)</w:t>
-            </w:r>
-          </w:p>
-        </w:tc>
-        <w:tc>
-          <w:tcPr>
-            <w:tcW w:type="dxa" w:w="3120"/>
-            <w:tcMar>
-              <w:top w:w="60" w:type="dxa"/>
-              <w:bottom w:w="60" w:type="dxa"/>
-              <w:left w:w="80" w:type="dxa"/>
-              <w:right w:w="80" w:type="dxa"/>
-            </w:tcMar>
-            <w:shd w:fill="FFFFFF"/>
-            <w:tcMar>
-              <w:top w:w="80" w:type="dxa"/>
-              <w:bottom w:w="80" w:type="dxa"/>
-              <w:left w:w="120" w:type="dxa"/>
-              <w:right w:w="120" w:type="dxa"/>
-            </w:tcMar>
-            <w:vAlign w:val="center"/>
-          </w:tcPr>
-          <w:p>
-            <w:pPr>
-              <w:spacing w:before="60" w:after="60" w:line="276" w:lineRule="auto"/>
-              <w:jc w:val="left"/>
-            </w:pPr>
-            <w:r>
-              <w:rPr>
-                <w:rFonts w:ascii="Arial" w:hAnsi="Arial"/>
-                <w:b w:val="0"/>
-                <w:i w:val="0"/>
-                <w:color w:val="333333"/>
-                <w:sz w:val="19"/>
-              </w:rPr>
-              <w:t>Thuật toán phải duyệt toàn bộ các node đến tầng d, với b là hệ số phân nhánh hữu hiệu (2 ≤ b ≤ 4 khi khối nguyên, b ≤ 8 khi ở trạng thái SPLIT) và d là độ sâu nghiệm: O(b^d).</w:t>
-            </w:r>
-          </w:p>
-        </w:tc>
-      </w:tr>
-      <w:tr>
-        <w:tc>
-          <w:tcPr>
-            <w:tcW w:type="dxa" w:w="3120"/>
-            <w:tcMar>
-              <w:top w:w="60" w:type="dxa"/>
-              <w:bottom w:w="60" w:type="dxa"/>
-              <w:left w:w="80" w:type="dxa"/>
-              <w:right w:w="80" w:type="dxa"/>
-            </w:tcMar>
+            <w:tcW w:type="dxa" w:w="2160"/>
             <w:shd w:fill="F8FAFC"/>
             <w:tcMar>
               <w:top w:w="80" w:type="dxa"/>
@@ -2182,30 +852,21 @@
           </w:tcPr>
           <w:p>
             <w:pPr>
-              <w:spacing w:before="60" w:after="60" w:line="276" w:lineRule="auto"/>
-              <w:jc w:val="left"/>
+              <w:spacing w:before="0" w:after="0" w:line="276" w:lineRule="auto"/>
             </w:pPr>
             <w:r>
               <w:rPr>
-                <w:rFonts w:ascii="Arial" w:hAnsi="Arial"/>
-                <w:b/>
-                <w:i w:val="0"/>
-                <w:color w:val="102C57"/>
-                <w:sz w:val="19"/>
+                <w:rFonts w:ascii="Times New Roman" w:hAnsi="Times New Roman"/>
+                <w:color w:val="1E293B"/>
+                <w:sz w:val="21"/>
               </w:rPr>
-              <w:t>Độ phức tạp không gian</w:t>
+              <w:t>S0(1, 1, STANDING)</w:t>
             </w:r>
           </w:p>
         </w:tc>
         <w:tc>
           <w:tcPr>
-            <w:tcW w:type="dxa" w:w="3120"/>
-            <w:tcMar>
-              <w:top w:w="60" w:type="dxa"/>
-              <w:bottom w:w="60" w:type="dxa"/>
-              <w:left w:w="80" w:type="dxa"/>
-              <w:right w:w="80" w:type="dxa"/>
-            </w:tcMar>
+            <w:tcW w:type="dxa" w:w="2592"/>
             <w:shd w:fill="F8FAFC"/>
             <w:tcMar>
               <w:top w:w="80" w:type="dxa"/>
@@ -2217,30 +878,25 @@
           </w:tcPr>
           <w:p>
             <w:pPr>
-              <w:spacing w:before="60" w:after="60" w:line="276" w:lineRule="auto"/>
-              <w:jc w:val="center"/>
+              <w:spacing w:before="0" w:after="0" w:line="276" w:lineRule="auto"/>
             </w:pPr>
             <w:r>
               <w:rPr>
-                <w:rFonts w:ascii="Arial" w:hAnsi="Arial"/>
-                <w:b/>
-                <w:i w:val="0"/>
-                <w:color w:val="282828"/>
-                <w:sz w:val="19"/>
+                <w:rFonts w:ascii="Times New Roman" w:hAnsi="Times New Roman"/>
+                <w:color w:val="1E293B"/>
+                <w:sz w:val="21"/>
               </w:rPr>
-              <w:t>O(b^d)</w:t>
+              <w:t>• RIGHT -&gt; S1(1, 2, HORIZ) [Hợp lệ]</w:t>
+              <w:br/>
+              <w:t>• DOWN -&gt; S_d [Hợp lệ]</w:t>
+              <w:br/>
+              <w:t>• UP, LEFT -&gt; Rơi ra ngoài bàn cờ</w:t>
             </w:r>
           </w:p>
         </w:tc>
         <w:tc>
           <w:tcPr>
-            <w:tcW w:type="dxa" w:w="3120"/>
-            <w:tcMar>
-              <w:top w:w="60" w:type="dxa"/>
-              <w:bottom w:w="60" w:type="dxa"/>
-              <w:left w:w="80" w:type="dxa"/>
-              <w:right w:w="80" w:type="dxa"/>
-            </w:tcMar>
+            <w:tcW w:type="dxa" w:w="2160"/>
             <w:shd w:fill="F8FAFC"/>
             <w:tcMar>
               <w:top w:w="80" w:type="dxa"/>
@@ -2252,18 +908,150 @@
           </w:tcPr>
           <w:p>
             <w:pPr>
-              <w:spacing w:before="60" w:after="60" w:line="276" w:lineRule="auto"/>
-              <w:jc w:val="left"/>
+              <w:spacing w:before="0" w:after="0" w:line="276" w:lineRule="auto"/>
             </w:pPr>
             <w:r>
               <w:rPr>
-                <w:rFonts w:ascii="Arial" w:hAnsi="Arial"/>
-                <w:b w:val="0"/>
-                <w:i w:val="0"/>
-                <w:color w:val="333333"/>
-                <w:sz w:val="19"/>
+                <w:rFonts w:ascii="Times New Roman" w:hAnsi="Times New Roman"/>
+                <w:color w:val="1E293B"/>
+                <w:sz w:val="21"/>
               </w:rPr>
-              <w:t>Hàng đợi queue và bảng băm parent phải lưu trữ toàn bộ các trạng thái tầng hiện tại và các tầng trước đó trong bộ nhớ RAM, tăng theo hàm mũ O(b^d).</w:t>
+              <w:t>parent[S1] = (S0, 'RIGHT')</w:t>
+              <w:br/>
+              <w:t>parent[S_d] = (S0, 'DOWN')</w:t>
+              <w:br/>
+              <w:t>Q = [S1, S_d]</w:t>
+            </w:r>
+          </w:p>
+        </w:tc>
+      </w:tr>
+      <w:tr>
+        <w:tc>
+          <w:tcPr>
+            <w:tcW w:type="dxa" w:w="1152"/>
+            <w:tcMar>
+              <w:top w:w="80" w:type="dxa"/>
+              <w:bottom w:w="80" w:type="dxa"/>
+              <w:left w:w="120" w:type="dxa"/>
+              <w:right w:w="120" w:type="dxa"/>
+            </w:tcMar>
+            <w:vAlign w:val="center"/>
+          </w:tcPr>
+          <w:p>
+            <w:pPr>
+              <w:spacing w:before="0" w:after="0" w:line="276" w:lineRule="auto"/>
+            </w:pPr>
+            <w:r>
+              <w:rPr>
+                <w:rFonts w:ascii="Times New Roman" w:hAnsi="Times New Roman"/>
+                <w:color w:val="1E293B"/>
+                <w:sz w:val="21"/>
+              </w:rPr>
+              <w:t>2</w:t>
+            </w:r>
+          </w:p>
+        </w:tc>
+        <w:tc>
+          <w:tcPr>
+            <w:tcW w:type="dxa" w:w="1728"/>
+            <w:tcMar>
+              <w:top w:w="80" w:type="dxa"/>
+              <w:bottom w:w="80" w:type="dxa"/>
+              <w:left w:w="120" w:type="dxa"/>
+              <w:right w:w="120" w:type="dxa"/>
+            </w:tcMar>
+            <w:vAlign w:val="center"/>
+          </w:tcPr>
+          <w:p>
+            <w:pPr>
+              <w:spacing w:before="0" w:after="0" w:line="276" w:lineRule="auto"/>
+            </w:pPr>
+            <w:r>
+              <w:rPr>
+                <w:rFonts w:ascii="Times New Roman" w:hAnsi="Times New Roman"/>
+                <w:color w:val="1E293B"/>
+                <w:sz w:val="21"/>
+              </w:rPr>
+              <w:t>[S_d]</w:t>
+            </w:r>
+          </w:p>
+        </w:tc>
+        <w:tc>
+          <w:tcPr>
+            <w:tcW w:type="dxa" w:w="2160"/>
+            <w:tcMar>
+              <w:top w:w="80" w:type="dxa"/>
+              <w:bottom w:w="80" w:type="dxa"/>
+              <w:left w:w="120" w:type="dxa"/>
+              <w:right w:w="120" w:type="dxa"/>
+            </w:tcMar>
+            <w:vAlign w:val="center"/>
+          </w:tcPr>
+          <w:p>
+            <w:pPr>
+              <w:spacing w:before="0" w:after="0" w:line="276" w:lineRule="auto"/>
+            </w:pPr>
+            <w:r>
+              <w:rPr>
+                <w:rFonts w:ascii="Times New Roman" w:hAnsi="Times New Roman"/>
+                <w:color w:val="1E293B"/>
+                <w:sz w:val="21"/>
+              </w:rPr>
+              <w:t>S1(1, 2, HORIZ)</w:t>
+            </w:r>
+          </w:p>
+        </w:tc>
+        <w:tc>
+          <w:tcPr>
+            <w:tcW w:type="dxa" w:w="2592"/>
+            <w:tcMar>
+              <w:top w:w="80" w:type="dxa"/>
+              <w:bottom w:w="80" w:type="dxa"/>
+              <w:left w:w="120" w:type="dxa"/>
+              <w:right w:w="120" w:type="dxa"/>
+            </w:tcMar>
+            <w:vAlign w:val="center"/>
+          </w:tcPr>
+          <w:p>
+            <w:pPr>
+              <w:spacing w:before="0" w:after="0" w:line="276" w:lineRule="auto"/>
+            </w:pPr>
+            <w:r>
+              <w:rPr>
+                <w:rFonts w:ascii="Times New Roman" w:hAnsi="Times New Roman"/>
+                <w:color w:val="1E293B"/>
+                <w:sz w:val="21"/>
+              </w:rPr>
+              <w:t>• RIGHT -&gt; S2(1, 4, STANDING)</w:t>
+              <w:br/>
+              <w:t>=&gt; board.is_goal(S2) == True! Kích hoạt Early Goal Test!</w:t>
+            </w:r>
+          </w:p>
+        </w:tc>
+        <w:tc>
+          <w:tcPr>
+            <w:tcW w:type="dxa" w:w="2160"/>
+            <w:tcMar>
+              <w:top w:w="80" w:type="dxa"/>
+              <w:bottom w:w="80" w:type="dxa"/>
+              <w:left w:w="120" w:type="dxa"/>
+              <w:right w:w="120" w:type="dxa"/>
+            </w:tcMar>
+            <w:vAlign w:val="center"/>
+          </w:tcPr>
+          <w:p>
+            <w:pPr>
+              <w:spacing w:before="0" w:after="0" w:line="276" w:lineRule="auto"/>
+            </w:pPr>
+            <w:r>
+              <w:rPr>
+                <w:rFonts w:ascii="Times New Roman" w:hAnsi="Times New Roman"/>
+                <w:color w:val="1E293B"/>
+                <w:sz w:val="21"/>
+              </w:rPr>
+              <w:t>parent[S2] = (S1, 'RIGHT')</w:t>
+              <w:br/>
+              <w:t>Thuật toán DỪNG NGAY</w:t>
             </w:r>
           </w:p>
         </w:tc>
@@ -2271,226 +1059,427 @@
     </w:tbl>
     <w:p>
       <w:pPr>
-        <w:spacing w:before="160" w:after="60"/>
-        <w:ind w:left="0"/>
+        <w:spacing w:before="0" w:after="120"/>
+      </w:pPr>
+    </w:p>
+    <w:p>
+      <w:pPr>
+        <w:spacing w:before="0" w:after="80" w:line="288" w:lineRule="auto"/>
       </w:pPr>
       <w:r>
         <w:rPr>
-          <w:rFonts w:ascii="Arial" w:hAnsi="Arial"/>
-          <w:b/>
+          <w:rFonts w:ascii="Times New Roman" w:hAnsi="Times New Roman"/>
           <w:i w:val="0"/>
-          <w:color w:val="1E3C72"/>
-          <w:sz w:val="23"/>
+          <w:color w:val="1E293B"/>
+          <w:sz w:val="24"/>
         </w:rPr>
-        <w:t>6.1. Phân tích độ phức tạp không gian và nút thắt bộ nhớ RAM (O(b^d))</w:t>
+        <w:t>Truy vết ngược: Quá trình tái hiện lộ trình nước đi (Path Reconstruction):</w:t>
       </w:r>
     </w:p>
     <w:p>
       <w:pPr>
-        <w:spacing w:before="0" w:after="60"/>
-        <w:ind w:left="0"/>
+        <w:pStyle w:val="ListBullet"/>
+        <w:spacing w:before="0" w:after="60" w:line="288" w:lineRule="auto"/>
       </w:pPr>
       <w:r>
         <w:rPr>
-          <w:rFonts w:ascii="Arial" w:hAnsi="Arial"/>
-          <w:b w:val="0"/>
-          <w:i w:val="0"/>
-          <w:color w:val="282828"/>
-          <w:sz w:val="20"/>
+          <w:rFonts w:ascii="Times New Roman" w:hAnsi="Times New Roman"/>
+          <w:b/>
+          <w:sz w:val="24"/>
         </w:rPr>
-        <w:t>Trong mô hình Graph-Search của BFS, bộ nhớ chính là nút thắt cổ chai lớn nhất chứ không phải thời gian tính toán của CPU. Thuật toán đòi hỏi phải lưu trữ đồng thời hai cấu trúc dữ liệu chính trong bộ nhớ RAM:</w:t>
+        <w:t xml:space="preserve">1. Bắt đầu từ trạng thái đích S2: </w:t>
+      </w:r>
+      <w:r>
+        <w:rPr>
+          <w:rFonts w:ascii="Times New Roman" w:hAnsi="Times New Roman"/>
+          <w:color w:val="1E293B"/>
+          <w:sz w:val="24"/>
+        </w:rPr>
+        <w:t>Tra cứu parent[S2] nhận được (S1, 'RIGHT') -&gt; moves = ['RIGHT'].</w:t>
       </w:r>
     </w:p>
     <w:p>
       <w:pPr>
-        <w:spacing w:before="0" w:after="40"/>
-        <w:ind w:left="280"/>
+        <w:pStyle w:val="ListBullet"/>
+        <w:spacing w:before="0" w:after="60" w:line="288" w:lineRule="auto"/>
       </w:pPr>
       <w:r>
         <w:rPr>
-          <w:rFonts w:ascii="Arial" w:hAnsi="Arial"/>
+          <w:rFonts w:ascii="Times New Roman" w:hAnsi="Times New Roman"/>
           <w:b/>
-          <w:i w:val="0"/>
-          <w:color w:val="102C57"/>
-          <w:sz w:val="20"/>
+          <w:sz w:val="24"/>
         </w:rPr>
-        <w:t xml:space="preserve">• Hàng đợi queue (Frontier): </w:t>
+        <w:t xml:space="preserve">2. Chuyển sang nút cha S1: </w:t>
       </w:r>
       <w:r>
         <w:rPr>
-          <w:rFonts w:ascii="Arial" w:hAnsi="Arial"/>
-          <w:b w:val="0"/>
-          <w:i w:val="0"/>
-          <w:color w:val="282828"/>
-          <w:sz w:val="20"/>
+          <w:rFonts w:ascii="Times New Roman" w:hAnsi="Times New Roman"/>
+          <w:color w:val="1E293B"/>
+          <w:sz w:val="24"/>
         </w:rPr>
-        <w:t>Lưu trữ toàn bộ các trạng thái ở tầng độ sâu hiện tại d. Kích thước cực đại của hàng đợi tỉ lệ thuận với số lượng nút ở tầng sâu nhất, đạt xấp xỉ O(b^d) phần tử.</w:t>
+        <w:t>Tra cứu parent[S1] nhận được (S0, 'RIGHT') -&gt; moves = ['RIGHT', 'RIGHT'].</w:t>
       </w:r>
     </w:p>
     <w:p>
       <w:pPr>
-        <w:spacing w:before="0" w:after="40"/>
-        <w:ind w:left="280"/>
+        <w:pStyle w:val="ListBullet"/>
+        <w:spacing w:before="0" w:after="60" w:line="288" w:lineRule="auto"/>
       </w:pPr>
       <w:r>
         <w:rPr>
-          <w:rFonts w:ascii="Arial" w:hAnsi="Arial"/>
+          <w:rFonts w:ascii="Times New Roman" w:hAnsi="Times New Roman"/>
           <w:b/>
-          <w:i w:val="0"/>
-          <w:color w:val="102C57"/>
-          <w:sz w:val="20"/>
+          <w:sz w:val="24"/>
         </w:rPr>
-        <w:t xml:space="preserve">• Bảng băm parent (Explored Set): </w:t>
+        <w:t xml:space="preserve">3. Chuyển sang nút gốc S0: </w:t>
       </w:r>
       <w:r>
         <w:rPr>
-          <w:rFonts w:ascii="Arial" w:hAnsi="Arial"/>
-          <w:b w:val="0"/>
-          <w:i w:val="0"/>
-          <w:color w:val="282828"/>
-          <w:sz w:val="20"/>
+          <w:rFonts w:ascii="Times New Roman" w:hAnsi="Times New Roman"/>
+          <w:color w:val="1E293B"/>
+          <w:sz w:val="24"/>
         </w:rPr>
-        <w:t>Lưu trữ toàn bộ các trạng thái đã từng được sinh ra từ tầng 0 đến tầng d để phục vụ truy vết và chống lặp chu trình. Tổng số node được lưu trữ là 1 + b + b^2 + ... + b^d ≈ O(b^d). Khi độ sâu nghiệm d tăng lên, dung lượng RAM tiêu thụ tăng theo hàm số mũ, khiến BFS có thể chạm ngưỡng giới hạn bộ nhớ trước khi tìm ra đích ở các bản đồ có độ sâu lớn.</w:t>
+        <w:t>parent[S0] là null -&gt; Dừng vòng lặp.</w:t>
       </w:r>
     </w:p>
     <w:p>
       <w:pPr>
-        <w:spacing w:before="160" w:after="60"/>
-        <w:ind w:left="0"/>
+        <w:pStyle w:val="ListBullet"/>
+        <w:spacing w:before="0" w:after="60" w:line="288" w:lineRule="auto"/>
       </w:pPr>
       <w:r>
         <w:rPr>
-          <w:rFonts w:ascii="Arial" w:hAnsi="Arial"/>
+          <w:rFonts w:ascii="Times New Roman" w:hAnsi="Times New Roman"/>
           <w:b/>
-          <w:i w:val="0"/>
-          <w:color w:val="1E3C72"/>
-          <w:sz w:val="23"/>
+          <w:sz w:val="24"/>
         </w:rPr>
-        <w:t>6.2. Hệ số phân nhánh thực tế và cơ chế cắt tỉa tự nhiên (Natural Pruning)</w:t>
+        <w:t xml:space="preserve">4. Đảo ngược mảng moves: </w:t>
+      </w:r>
+      <w:r>
+        <w:rPr>
+          <w:rFonts w:ascii="Times New Roman" w:hAnsi="Times New Roman"/>
+          <w:color w:val="1E293B"/>
+          <w:sz w:val="24"/>
+        </w:rPr>
+        <w:t>Thu được chuỗi hành động tối ưu hoàn chỉnh ['RIGHT', 'RIGHT'] với độ dài chính xác 2 bước.</w:t>
       </w:r>
     </w:p>
     <w:p>
       <w:pPr>
-        <w:spacing w:before="0" w:after="60"/>
-        <w:ind w:left="0"/>
+        <w:keepNext/>
+        <w:spacing w:before="280" w:after="80"/>
       </w:pPr>
       <w:r>
         <w:rPr>
-          <w:rFonts w:ascii="Arial" w:hAnsi="Arial"/>
-          <w:b w:val="0"/>
-          <w:i w:val="0"/>
-          <w:color w:val="282828"/>
-          <w:sz w:val="20"/>
+          <w:rFonts w:ascii="Times New Roman" w:hAnsi="Times New Roman"/>
+          <w:b/>
+          <w:color w:val="0F172A"/>
+          <w:sz w:val="28"/>
         </w:rPr>
-        <w:t>Mặc dù hệ số phân nhánh lý thuyết tối đa là b ≤ 4 khi khối nguyên vẹn và b ≤ 8 khi ở trạng thái phân tách (SPLIT), trong thực tế hệ số phân nhánh hiệu dụng (b_eff) nhỏ hơn đáng kể (thường chỉ dao động từ 2 đến 3). Điều này đạt được nhờ 3 cơ chế cắt tỉa tự nhiên của bài toán:</w:t>
+        <w:t>4. Đánh giá Tính chất và Tính tối ưu của BFS</w:t>
       </w:r>
     </w:p>
     <w:p>
       <w:pPr>
-        <w:spacing w:before="0" w:after="40"/>
-        <w:ind w:left="280"/>
+        <w:spacing w:before="0" w:after="80" w:line="288" w:lineRule="auto"/>
       </w:pPr>
       <w:r>
         <w:rPr>
-          <w:rFonts w:ascii="Arial" w:hAnsi="Arial"/>
-          <w:b/>
+          <w:rFonts w:ascii="Times New Roman" w:hAnsi="Times New Roman"/>
           <w:i w:val="0"/>
-          <w:color w:val="102C57"/>
-          <w:sz w:val="20"/>
+          <w:color w:val="1E293B"/>
+          <w:sz w:val="24"/>
         </w:rPr>
-        <w:t xml:space="preserve">• Ranh giới bàn cờ: </w:t>
-      </w:r>
-      <w:r>
-        <w:rPr>
-          <w:rFonts w:ascii="Arial" w:hAnsi="Arial"/>
-          <w:b w:val="0"/>
-          <w:i w:val="0"/>
-          <w:color w:val="282828"/>
-          <w:sz w:val="20"/>
-        </w:rPr>
-        <w:t>Các bước lăn đưa khối ra ngoài biên hoặc rơi vào ô rỗng (EMPTY) bị hàm board.is_valid() loại bỏ ngay lập tức, không sinh ra nhánh con.</w:t>
+        <w:t>Trong mô hình không gian trạng thái Bloxorz, thuật toán BFS coi mọi hành động lăn khối hợp lệ đều có chi phí đơn vị đồng nhất (w = 1). Bằng việc mở rộng tuần tự theo từng tầng độ sâu đồng mức d = 0, 1, 2, ..., kết hợp kỹ thuật kiểm tra đích sớm (Early Goal Test), trạng thái đích đầu tiên được phát hiện chắc chắn nằm ở tầng sâu nhỏ nhất d_min. Điều này bảo đảm tính tối ưu tuyệt đối về số lượng hành động lăn khối (solution_length = len(moves) đạt cực tiểu). Nút thắt cổ chai lớn nhất của thuật toán là độ phức tạp không gian O(b^d), đòi hỏi bộ nhớ RAM tăng theo hàm mũ theo độ sâu tìm kiếm.</w:t>
       </w:r>
     </w:p>
     <w:p>
       <w:pPr>
-        <w:spacing w:before="0" w:after="40"/>
-        <w:ind w:left="280"/>
+        <w:spacing w:before="0" w:after="80" w:line="288" w:lineRule="auto"/>
       </w:pPr>
       <w:r>
         <w:rPr>
-          <w:rFonts w:ascii="Arial" w:hAnsi="Arial"/>
-          <w:b/>
+          <w:rFonts w:ascii="Times New Roman" w:hAnsi="Times New Roman"/>
           <w:i w:val="0"/>
-          <w:color w:val="102C57"/>
-          <w:sz w:val="20"/>
+          <w:color w:val="1E293B"/>
+          <w:sz w:val="24"/>
         </w:rPr>
-        <w:t xml:space="preserve">• Ràng buộc ô gạch mỏng (FRAGILE): </w:t>
-      </w:r>
-      <w:r>
-        <w:rPr>
-          <w:rFonts w:ascii="Arial" w:hAnsi="Arial"/>
-          <w:b w:val="0"/>
-          <w:i w:val="0"/>
-          <w:color w:val="282828"/>
-          <w:sz w:val="20"/>
-        </w:rPr>
-        <w:t>Luật cấm khối đứng thẳng trên ô cam giúp tự động hủy bỏ các nhánh trạng thái vi phạm ngay tại thời điểm kiểm tra tính hợp lệ.</w:t>
+        <w:t>Phân biệt giữa tối ưu số hành động và tối ưu chi phí trọng số: Khi bài toán có thêm các loại ô phạt như ô gạch cam (FRAGILE), hàm chi phí thực tế là c(s, a, s') = 1 + 0.5 * N_fragile(s'). Do BFS chỉ tối ưu hóa số lượng hành động lăn khối mà không phân biệt trọng số chi phí giữa các ô sàn, đường đi ít bước nhất của BFS có thể dẫm lên gạch cam và chịu chi phí cao hơn lời giải của UCS hoặc A*.</w:t>
       </w:r>
     </w:p>
     <w:p>
       <w:pPr>
-        <w:spacing w:before="0" w:after="40"/>
-        <w:ind w:left="280"/>
+        <w:keepNext/>
+        <w:spacing w:before="280" w:after="80"/>
       </w:pPr>
       <w:r>
         <w:rPr>
-          <w:rFonts w:ascii="Arial" w:hAnsi="Arial"/>
+          <w:rFonts w:ascii="Times New Roman" w:hAnsi="Times New Roman"/>
           <w:b/>
-          <w:i w:val="0"/>
-          <w:color w:val="102C57"/>
-          <w:sz w:val="20"/>
+          <w:color w:val="0F172A"/>
+          <w:sz w:val="28"/>
         </w:rPr>
-        <w:t xml:space="preserve">• Đánh dấu lúc phát hiện (nxt in parent): </w:t>
-      </w:r>
-      <w:r>
-        <w:rPr>
-          <w:rFonts w:ascii="Arial" w:hAnsi="Arial"/>
-          <w:b w:val="0"/>
-          <w:i w:val="0"/>
-          <w:color w:val="282828"/>
-          <w:sz w:val="20"/>
-        </w:rPr>
-        <w:t>Các đường đi hội tụ về cùng một trạng thái từ các nhánh khác nhau được triệt tiêu ngay lập tức trước khi được nạp vào hàng đợi, giữ cho kích thước tập biên không bị bùng nổ quá nhanh.</w:t>
+        <w:t>5. Tính tương thích với cơ chế nâng cao của Bloxorz</w:t>
       </w:r>
     </w:p>
     <w:p>
       <w:pPr>
-        <w:spacing w:before="160" w:after="60"/>
-        <w:ind w:left="0"/>
+        <w:spacing w:before="0" w:after="80" w:line="288" w:lineRule="auto"/>
       </w:pPr>
       <w:r>
         <w:rPr>
-          <w:rFonts w:ascii="Arial" w:hAnsi="Arial"/>
-          <w:b/>
+          <w:rFonts w:ascii="Times New Roman" w:hAnsi="Times New Roman"/>
           <w:i w:val="0"/>
-          <w:color w:val="1E3C72"/>
-          <w:sz w:val="23"/>
+          <w:color w:val="1E293B"/>
+          <w:sz w:val="24"/>
         </w:rPr>
-        <w:t>6.3. Tính đầy đủ (Completeness) trong không gian trạng thái hữu hạn</w:t>
+        <w:t>Thuật toán tương thích hoàn toàn với tất cả các cơ chế nâng cao của trò chơi Bloxorz thông qua giao diện chuẩn của BloxorzBoard:</w:t>
       </w:r>
     </w:p>
     <w:p>
       <w:pPr>
-        <w:spacing w:before="0" w:after="60"/>
-        <w:ind w:left="0"/>
+        <w:pStyle w:val="ListBullet"/>
+        <w:spacing w:before="0" w:after="60" w:line="288" w:lineRule="auto"/>
       </w:pPr>
       <w:r>
         <w:rPr>
-          <w:rFonts w:ascii="Arial" w:hAnsi="Arial"/>
-          <w:b w:val="0"/>
+          <w:rFonts w:ascii="Times New Roman" w:hAnsi="Times New Roman"/>
+          <w:b/>
+          <w:sz w:val="24"/>
+        </w:rPr>
+        <w:t xml:space="preserve">Khối phân tách (SPLIT): </w:t>
+      </w:r>
+      <w:r>
+        <w:rPr>
+          <w:rFonts w:ascii="Times New Roman" w:hAnsi="Times New Roman"/>
+          <w:color w:val="1E293B"/>
+          <w:sz w:val="24"/>
+        </w:rPr>
+        <w:t>Khi khối đứng lên ô công tắc phân tách, engine chuyển trạng thái thành SPLIT và sinh ra 8 hành động tìm kiếm (4 hướng lăn khối 0 và 4 hướng S để đổi sang khối 1). BFS duyệt đồng thời cả hai khối và tự động tìm ra đường đi kết nối hai khối lại với nhau.</w:t>
+      </w:r>
+    </w:p>
+    <w:p>
+      <w:pPr>
+        <w:pStyle w:val="ListBullet"/>
+        <w:spacing w:before="0" w:after="60" w:line="288" w:lineRule="auto"/>
+      </w:pPr>
+      <w:r>
+        <w:rPr>
+          <w:rFonts w:ascii="Times New Roman" w:hAnsi="Times New Roman"/>
+          <w:b/>
+          <w:sz w:val="24"/>
+        </w:rPr>
+        <w:t xml:space="preserve">Cơ chế Công tắc &amp; Cầu: </w:t>
+      </w:r>
+      <w:r>
+        <w:rPr>
+          <w:rFonts w:ascii="Times New Roman" w:hAnsi="Times New Roman"/>
+          <w:color w:val="1E293B"/>
+          <w:sz w:val="24"/>
+        </w:rPr>
+        <w:t>Trạng thái cầu được mã hóa trong tuple bridges của State. Mỗi khi công tắc được kích hoạt làm thay đổi trạng thái cầu, một State mới được tạo ra và nạp vào hàng đợi FIFO, giúp BFS tìm được chuỗi bật/tắt công tắc chính xác để mở đường về đích.</w:t>
+      </w:r>
+    </w:p>
+    <w:p>
+      <w:pPr>
+        <w:pStyle w:val="ListBullet"/>
+        <w:spacing w:before="0" w:after="60" w:line="288" w:lineRule="auto"/>
+      </w:pPr>
+      <w:r>
+        <w:rPr>
+          <w:rFonts w:ascii="Times New Roman" w:hAnsi="Times New Roman"/>
+          <w:b/>
+          <w:sz w:val="24"/>
+        </w:rPr>
+        <w:t xml:space="preserve">Ô gạch mỏng (FRAGILE): </w:t>
+      </w:r>
+      <w:r>
+        <w:rPr>
+          <w:rFonts w:ascii="Times New Roman" w:hAnsi="Times New Roman"/>
+          <w:color w:val="1E293B"/>
+          <w:sz w:val="24"/>
+        </w:rPr>
+        <w:t>Hàm get_successors() tự động loại bỏ mọi bước lăn khiến khối đứng thẳng trên gạch cam, bảo đảm tập biên chỉ chứa các trạng thái an toàn.</w:t>
+      </w:r>
+    </w:p>
+    <w:p>
+      <w:pPr>
+        <w:keepNext/>
+        <w:spacing w:before="280" w:after="80"/>
+      </w:pPr>
+      <w:r>
+        <w:rPr>
+          <w:rFonts w:ascii="Times New Roman" w:hAnsi="Times New Roman"/>
+          <w:b/>
+          <w:color w:val="0F172A"/>
+          <w:sz w:val="28"/>
+        </w:rPr>
+        <w:t>6. Đánh giá tính chất lý thuyết của thuật toán</w:t>
+      </w:r>
+    </w:p>
+    <w:p>
+      <w:pPr>
+        <w:keepNext/>
+        <w:spacing w:before="200" w:after="60"/>
+      </w:pPr>
+      <w:r>
+        <w:rPr>
+          <w:rFonts w:ascii="Times New Roman" w:hAnsi="Times New Roman"/>
+          <w:b/>
+          <w:color w:val="1D4ED8"/>
+          <w:sz w:val="26"/>
+        </w:rPr>
+        <w:t>6.1. Độ phức tạp không gian và thời gian</w:t>
+      </w:r>
+    </w:p>
+    <w:p>
+      <w:pPr>
+        <w:spacing w:before="0" w:after="80" w:line="288" w:lineRule="auto"/>
+      </w:pPr>
+      <w:r>
+        <w:rPr>
+          <w:rFonts w:ascii="Times New Roman" w:hAnsi="Times New Roman"/>
           <w:i w:val="0"/>
-          <w:color w:val="282828"/>
-          <w:sz w:val="20"/>
+          <w:color w:val="1E293B"/>
+          <w:sz w:val="24"/>
+        </w:rPr>
+        <w:t>Độ phức tạp thời gian của BFS là O(b^d), trong đó b là hệ số phân nhánh và d là độ sâu của lời giải nông nhất. Trong trường hợp xấu nhất, thuật toán phải duyệt qua toàn bộ các trạng thái ở các tầng độ sâu từ 0 đến d.</w:t>
+      </w:r>
+    </w:p>
+    <w:p>
+      <w:pPr>
+        <w:spacing w:before="0" w:after="80" w:line="288" w:lineRule="auto"/>
+      </w:pPr>
+      <w:r>
+        <w:rPr>
+          <w:rFonts w:ascii="Times New Roman" w:hAnsi="Times New Roman"/>
+          <w:i w:val="0"/>
+          <w:color w:val="1E293B"/>
+          <w:sz w:val="24"/>
+        </w:rPr>
+        <w:t>Độ phức tạp không gian cũng là O(b^d). Bộ nhớ chính là rào cản lớn nhất của BFS do hàng đợi FIFO phải lưu trữ toàn bộ các trạng thái ở tầng độ sâu hiện tại, đồng thời từ điển parent phải lưu vết toàn bộ các trạng thái đã từng sinh ra. Với các màn chơi có độ sâu lớn (như Màn 29), kích thước hàng đợi phình to rất nhanh, có thể dẫn đến tràn bộ nhớ hoặc vượt ngưỡng thời gian 120 giây.</w:t>
+      </w:r>
+    </w:p>
+    <w:p>
+      <w:pPr>
+        <w:keepNext/>
+        <w:spacing w:before="200" w:after="60"/>
+      </w:pPr>
+      <w:r>
+        <w:rPr>
+          <w:rFonts w:ascii="Times New Roman" w:hAnsi="Times New Roman"/>
+          <w:b/>
+          <w:color w:val="1D4ED8"/>
+          <w:sz w:val="26"/>
+        </w:rPr>
+        <w:t>6.2. Hệ số phân nhánh thực tế và cơ chế cắt tỉa tự nhiên</w:t>
+      </w:r>
+    </w:p>
+    <w:p>
+      <w:pPr>
+        <w:spacing w:before="0" w:after="80" w:line="288" w:lineRule="auto"/>
+      </w:pPr>
+      <w:r>
+        <w:rPr>
+          <w:rFonts w:ascii="Times New Roman" w:hAnsi="Times New Roman"/>
+          <w:i w:val="0"/>
+          <w:color w:val="1E293B"/>
+          <w:sz w:val="24"/>
+        </w:rPr>
+        <w:t>Mặc dù hệ số phân nhánh lý thuyết tối đa là b &lt;= 4 (khi khối nguyên) và b &lt;= 8 (khi SPLIT), trong thực tế hệ số phân nhánh hiệu dụng b_eff chỉ dao động từ 2 đến 3 nhờ ba cơ chế cắt tỉa tự nhiên của bài toán:</w:t>
+      </w:r>
+    </w:p>
+    <w:p>
+      <w:pPr>
+        <w:pStyle w:val="ListBullet"/>
+        <w:spacing w:before="0" w:after="60" w:line="288" w:lineRule="auto"/>
+      </w:pPr>
+      <w:r>
+        <w:rPr>
+          <w:rFonts w:ascii="Times New Roman" w:hAnsi="Times New Roman"/>
+          <w:b/>
+          <w:sz w:val="24"/>
+        </w:rPr>
+        <w:t xml:space="preserve">Ranh giới bàn cờ: </w:t>
+      </w:r>
+      <w:r>
+        <w:rPr>
+          <w:rFonts w:ascii="Times New Roman" w:hAnsi="Times New Roman"/>
+          <w:color w:val="1E293B"/>
+          <w:sz w:val="24"/>
+        </w:rPr>
+        <w:t>Các bước lăn đưa khối ra ngoài ranh giới bản đồ hoặc ô trống bị hàm is_valid() loại bỏ ngay lập tức.</w:t>
+      </w:r>
+    </w:p>
+    <w:p>
+      <w:pPr>
+        <w:pStyle w:val="ListBullet"/>
+        <w:spacing w:before="0" w:after="60" w:line="288" w:lineRule="auto"/>
+      </w:pPr>
+      <w:r>
+        <w:rPr>
+          <w:rFonts w:ascii="Times New Roman" w:hAnsi="Times New Roman"/>
+          <w:b/>
+          <w:sz w:val="24"/>
+        </w:rPr>
+        <w:t xml:space="preserve">Ràng buộc ô gạch mỏng: </w:t>
+      </w:r>
+      <w:r>
+        <w:rPr>
+          <w:rFonts w:ascii="Times New Roman" w:hAnsi="Times New Roman"/>
+          <w:color w:val="1E293B"/>
+          <w:sz w:val="24"/>
+        </w:rPr>
+        <w:t>Luật cấm khối nguyên đứng thẳng trên ô cam tự động triệt tiêu các nhánh vi phạm.</w:t>
+      </w:r>
+    </w:p>
+    <w:p>
+      <w:pPr>
+        <w:pStyle w:val="ListBullet"/>
+        <w:spacing w:before="0" w:after="60" w:line="288" w:lineRule="auto"/>
+      </w:pPr>
+      <w:r>
+        <w:rPr>
+          <w:rFonts w:ascii="Times New Roman" w:hAnsi="Times New Roman"/>
+          <w:b/>
+          <w:sz w:val="24"/>
+        </w:rPr>
+        <w:t xml:space="preserve">Đánh dấu lúc phát hiện: </w:t>
+      </w:r>
+      <w:r>
+        <w:rPr>
+          <w:rFonts w:ascii="Times New Roman" w:hAnsi="Times New Roman"/>
+          <w:color w:val="1E293B"/>
+          <w:sz w:val="24"/>
+        </w:rPr>
+        <w:t>Các nhánh tìm kiếm khác nhau hội tụ về cùng một cấu hình trạng thái bị triệt tiêu ngay lập tức trước khi được nạp vào hàng đợi nhờ kiểm tra nxt in parent.</w:t>
+      </w:r>
+    </w:p>
+    <w:p>
+      <w:pPr>
+        <w:keepNext/>
+        <w:spacing w:before="200" w:after="60"/>
+      </w:pPr>
+      <w:r>
+        <w:rPr>
+          <w:rFonts w:ascii="Times New Roman" w:hAnsi="Times New Roman"/>
+          <w:b/>
+          <w:color w:val="1D4ED8"/>
+          <w:sz w:val="26"/>
+        </w:rPr>
+        <w:t>6.3. Tính đầy đủ (Completeness)</w:t>
+      </w:r>
+    </w:p>
+    <w:p>
+      <w:pPr>
+        <w:spacing w:before="0" w:after="80" w:line="288" w:lineRule="auto"/>
+      </w:pPr>
+      <w:r>
+        <w:rPr>
+          <w:rFonts w:ascii="Times New Roman" w:hAnsi="Times New Roman"/>
+          <w:i w:val="0"/>
+          <w:color w:val="1E293B"/>
+          <w:sz w:val="24"/>
         </w:rPr>
         <w:t>Do bàn cờ Bloxorz có kích thước giới hạn R × C, số lượng tư thế khối và các trạng thái chuyển mạch công tắc là hữu hạn, nên tổng không gian trạng thái khả dĩ là hữu hạn (|S| &lt; ∞). Với bảng băm parent đóng vai trò tập đóng ngăn chặn triệt để vòng lặp chu trình, thuật toán chắc chắn sẽ duyệt cạn thành phần liên thông chứa trạng thái xuất phát. Nếu tồn tại lời giải, BFS chắc chắn tìm ra; nếu bản đồ vô nghiệm, hàng đợi sẽ rỗng sau khi duyệt hết các trạng thái liên thông và thuật toán kết luận vô nghiệm một cách xác định.</w:t>
       </w:r>
@@ -2502,189 +1491,73 @@
       </w:pPr>
       <w:r>
         <w:rPr>
-          <w:rFonts w:ascii="Arial" w:hAnsi="Arial"/>
+          <w:rFonts w:ascii="Times New Roman" w:hAnsi="Times New Roman"/>
           <w:b/>
-          <w:color w:val="102C57"/>
-          <w:sz w:val="26"/>
+          <w:color w:val="0F172A"/>
+          <w:sz w:val="28"/>
         </w:rPr>
         <w:t>7. Tài liệu tham khảo và Tuyên bố sử dụng AI (AI Disclosure)</w:t>
       </w:r>
     </w:p>
     <w:p>
       <w:pPr>
-        <w:keepNext/>
-        <w:spacing w:before="200" w:after="60"/>
+        <w:pStyle w:val="ListBullet"/>
+        <w:spacing w:before="0" w:after="60" w:line="288" w:lineRule="auto"/>
       </w:pPr>
       <w:r>
         <w:rPr>
-          <w:rFonts w:ascii="Arial" w:hAnsi="Arial"/>
-          <w:b/>
-          <w:color w:val="1E3C72"/>
-          <w:sz w:val="23"/>
-        </w:rPr>
-        <w:t>7.1. Tài liệu tham khảo</w:t>
-      </w:r>
-    </w:p>
-    <w:p>
-      <w:pPr>
-        <w:spacing w:before="20" w:after="40" w:line="276" w:lineRule="auto"/>
-        <w:ind w:left="360"/>
-      </w:pPr>
-      <w:r>
-        <w:rPr>
-          <w:rFonts w:ascii="Arial" w:hAnsi="Arial"/>
-          <w:b/>
-          <w:sz w:val="20"/>
-        </w:rPr>
-        <w:t xml:space="preserve">• </w:t>
-      </w:r>
-      <w:r>
-        <w:rPr>
-          <w:rFonts w:ascii="Arial" w:hAnsi="Arial"/>
-          <w:sz w:val="20"/>
+          <w:rFonts w:ascii="Times New Roman" w:hAnsi="Times New Roman"/>
+          <w:color w:val="1E293B"/>
+          <w:sz w:val="24"/>
         </w:rPr>
         <w:t>Stuart Russell, Peter Norvig, Artificial Intelligence: A Modern Approach (4th Edition), Pearson, 2020 (Chương 3: Solving Problems by Searching — Breadth-First Search).</w:t>
       </w:r>
     </w:p>
     <w:p>
       <w:pPr>
-        <w:spacing w:before="20" w:after="40" w:line="276" w:lineRule="auto"/>
-        <w:ind w:left="360"/>
+        <w:pStyle w:val="ListBullet"/>
+        <w:spacing w:before="0" w:after="60" w:line="288" w:lineRule="auto"/>
       </w:pPr>
       <w:r>
         <w:rPr>
-          <w:rFonts w:ascii="Arial" w:hAnsi="Arial"/>
-          <w:b/>
-          <w:sz w:val="20"/>
-        </w:rPr>
-        <w:t xml:space="preserve">• </w:t>
-      </w:r>
-      <w:r>
-        <w:rPr>
-          <w:rFonts w:ascii="Arial" w:hAnsi="Arial"/>
-          <w:sz w:val="20"/>
+          <w:rFonts w:ascii="Times New Roman" w:hAnsi="Times New Roman"/>
+          <w:color w:val="1E293B"/>
+          <w:sz w:val="24"/>
         </w:rPr>
         <w:t>Tài liệu hướng dẫn Đồ án 1: Bloxorz Solver, Bộ môn Khoa học Máy tính, Trường Đại học Khoa học Tự nhiên, ĐHQG-HCM (2026).</w:t>
       </w:r>
     </w:p>
     <w:p>
       <w:pPr>
-        <w:spacing w:before="20" w:after="40" w:line="276" w:lineRule="auto"/>
-        <w:ind w:left="360"/>
+        <w:pStyle w:val="ListBullet"/>
+        <w:spacing w:before="0" w:after="60" w:line="288" w:lineRule="auto"/>
       </w:pPr>
       <w:r>
         <w:rPr>
-          <w:rFonts w:ascii="Arial" w:hAnsi="Arial"/>
-          <w:sz w:val="20"/>
+          <w:rFonts w:ascii="Times New Roman" w:hAnsi="Times New Roman"/>
+          <w:color w:val="1E293B"/>
+          <w:sz w:val="24"/>
         </w:rPr>
-        <w:t>• Mã nguồn và tài liệu kiến trúc Bloxorz: Src/core/board.py, Src/solvers/member3_bfs.py, Src/solvers/base.py, Src/tests/.</w:t>
+        <w:t>Mã nguồn và tài liệu kiến trúc Bloxorz: Src/core/board.py, Src/solvers/member3_bfs.py, Src/solvers/base.py, Src/tests/.</w:t>
       </w:r>
     </w:p>
     <w:p>
       <w:pPr>
-        <w:keepNext/>
-        <w:spacing w:before="200" w:after="60"/>
+        <w:spacing w:before="0" w:after="80" w:line="288" w:lineRule="auto"/>
       </w:pPr>
       <w:r>
         <w:rPr>
-          <w:rFonts w:ascii="Arial" w:hAnsi="Arial"/>
-          <w:b/>
-          <w:color w:val="1E3C72"/>
-          <w:sz w:val="23"/>
+          <w:rFonts w:ascii="Times New Roman" w:hAnsi="Times New Roman"/>
+          <w:i w:val="0"/>
+          <w:color w:val="1E293B"/>
+          <w:sz w:val="24"/>
         </w:rPr>
-        <w:t>7.2. Kê khai minh bạch sử dụng công cụ AI (AI Disclosure)</w:t>
-      </w:r>
-    </w:p>
-    <w:p>
-      <w:pPr>
-        <w:spacing w:before="20" w:after="40" w:line="276" w:lineRule="auto"/>
-        <w:ind w:left="360"/>
-      </w:pPr>
-      <w:r>
-        <w:rPr>
-          <w:rFonts w:ascii="Arial" w:hAnsi="Arial"/>
-          <w:b/>
-          <w:sz w:val="20"/>
-        </w:rPr>
-        <w:t xml:space="preserve">• </w:t>
-      </w:r>
-      <w:r>
-        <w:rPr>
-          <w:rFonts w:ascii="Arial" w:hAnsi="Arial"/>
-          <w:b/>
-          <w:sz w:val="20"/>
-        </w:rPr>
-        <w:t xml:space="preserve">Công cụ: </w:t>
-      </w:r>
-      <w:r>
-        <w:rPr>
-          <w:rFonts w:ascii="Arial" w:hAnsi="Arial"/>
-          <w:sz w:val="20"/>
-        </w:rPr>
-        <w:t>Công cụ sử dụng: Trợ lý AI Antigravity / Google DeepMind Agentic Coding Assistant.</w:t>
-      </w:r>
-    </w:p>
-    <w:p>
-      <w:pPr>
-        <w:spacing w:before="20" w:after="40" w:line="276" w:lineRule="auto"/>
-        <w:ind w:left="360"/>
-      </w:pPr>
-      <w:r>
-        <w:rPr>
-          <w:rFonts w:ascii="Arial" w:hAnsi="Arial"/>
-          <w:b/>
-          <w:sz w:val="20"/>
-        </w:rPr>
-        <w:t xml:space="preserve">• </w:t>
-      </w:r>
-      <w:r>
-        <w:rPr>
-          <w:rFonts w:ascii="Arial" w:hAnsi="Arial"/>
-          <w:b/>
-          <w:sz w:val="20"/>
-        </w:rPr>
-        <w:t xml:space="preserve">Mục đích: </w:t>
-      </w:r>
-      <w:r>
-        <w:rPr>
-          <w:rFonts w:ascii="Arial" w:hAnsi="Arial"/>
-          <w:sz w:val="20"/>
-        </w:rPr>
-        <w:t>Hỗ trợ rà soát cấu trúc báo cáo, kiểm tra đối chiếu mã giả với mã nguồn thực tế, định dạng bảng biểu và rà soát các phân tích độ phức tạp thuật toán.</w:t>
-      </w:r>
-    </w:p>
-    <w:p>
-      <w:pPr>
-        <w:spacing w:before="20" w:after="40" w:line="276" w:lineRule="auto"/>
-        <w:ind w:left="360"/>
-      </w:pPr>
-      <w:r>
-        <w:rPr>
-          <w:rFonts w:ascii="Arial" w:hAnsi="Arial"/>
-          <w:b/>
-          <w:sz w:val="20"/>
-        </w:rPr>
-        <w:t xml:space="preserve">• </w:t>
-      </w:r>
-      <w:r>
-        <w:rPr>
-          <w:rFonts w:ascii="Arial" w:hAnsi="Arial"/>
-          <w:b/>
-          <w:sz w:val="20"/>
-        </w:rPr>
-        <w:t xml:space="preserve">Cam kết: </w:t>
-      </w:r>
-      <w:r>
-        <w:rPr>
-          <w:rFonts w:ascii="Arial" w:hAnsi="Arial"/>
-          <w:sz w:val="20"/>
-        </w:rPr>
-        <w:t>Sinh viên trực tiếp cài đặt thuật toán member3_bfs.py, tự tay kiểm thử, đo đạc dữ liệu thực nghiệm và chịu trách nhiệm 100% về tính chính xác của toàn bộ nội dung học thuật.</w:t>
+        <w:t>Kê khai sử dụng công cụ AI: Nhóm sử dụng trợ lý AI hỗ trợ rà soát cấu trúc báo cáo, kiểm tra đối chiếu mã giả với mã nguồn thực tế và định dạng bảng biểu. Sinh viên Bùi Phương Nam trực tiếp cài đặt thuật toán member3_bfs.py, kiểm thử và chịu trách nhiệm toàn diện về tính chính xác của nội dung báo cáo.</w:t>
       </w:r>
     </w:p>
     <w:sectPr>
-      <w:pgSz w:w="12240" w:h="15840"/>
-      <w:pgMar w:top="1440" w:right="1440" w:bottom="1440" w:left="1440" w:header="720" w:footer="720" w:gutter="0"/>
+      <w:pgSz w:w="11909" w:h="16834"/>
+      <w:pgMar w:top="1138" w:right="1138" w:bottom="1138" w:left="1700" w:header="720" w:footer="720" w:gutter="0"/>
       <w:cols w:space="720"/>
       <w:docGrid w:linePitch="360"/>
     </w:sectPr>

</xml_diff>